<commit_message>
Completed Question 1 & 2
Question 1 – GUI Design & Implementation
Question 2 – Keyword Recognition
</commit_message>
<xml_diff>
--- a/Part 2/ST10493664_PROG6221_POE_Part2.docx
+++ b/Part 2/ST10493664_PROG6221_POE_Part2.docx
@@ -5595,10 +5595,71 @@
     </w:p>
     <w:p>
       <w:pPr>
-        <w:pStyle w:val="Heading1"/>
+        <w:rPr>
+          <w:rFonts w:eastAsiaTheme="majorEastAsia" w:cstheme="majorBidi"/>
+          <w:color w:val="000000" w:themeColor="text1"/>
+          <w:sz w:val="28"/>
+          <w:szCs w:val="40"/>
+          <w:u w:val="single"/>
+        </w:rPr>
       </w:pPr>
       <w:bookmarkStart w:id="4" w:name="_Toc229570679"/>
       <w:r>
+        <w:rPr>
+          <w:noProof/>
+        </w:rPr>
+        <w:drawing>
+          <wp:inline distT="0" distB="0" distL="0" distR="0" wp14:anchorId="4AF98692" wp14:editId="1441629D">
+            <wp:extent cx="5731510" cy="4302760"/>
+            <wp:effectExtent l="0" t="0" r="2540" b="2540"/>
+            <wp:docPr id="644819047" name="Picture 28"/>
+            <wp:cNvGraphicFramePr>
+              <a:graphicFrameLocks xmlns:a="http://schemas.openxmlformats.org/drawingml/2006/main" noChangeAspect="1"/>
+            </wp:cNvGraphicFramePr>
+            <a:graphic xmlns:a="http://schemas.openxmlformats.org/drawingml/2006/main">
+              <a:graphicData uri="http://schemas.openxmlformats.org/drawingml/2006/picture">
+                <pic:pic xmlns:pic="http://schemas.openxmlformats.org/drawingml/2006/picture">
+                  <pic:nvPicPr>
+                    <pic:cNvPr id="644819047" name="Picture 644819047"/>
+                    <pic:cNvPicPr/>
+                  </pic:nvPicPr>
+                  <pic:blipFill>
+                    <a:blip r:embed="rId8">
+                      <a:extLst>
+                        <a:ext uri="{28A0092B-C50C-407E-A947-70E740481C1C}">
+                          <a14:useLocalDpi xmlns:a14="http://schemas.microsoft.com/office/drawing/2010/main" val="0"/>
+                        </a:ext>
+                      </a:extLst>
+                    </a:blip>
+                    <a:stretch>
+                      <a:fillRect/>
+                    </a:stretch>
+                  </pic:blipFill>
+                  <pic:spPr>
+                    <a:xfrm>
+                      <a:off x="0" y="0"/>
+                      <a:ext cx="5731510" cy="4302760"/>
+                    </a:xfrm>
+                    <a:prstGeom prst="rect">
+                      <a:avLst/>
+                    </a:prstGeom>
+                  </pic:spPr>
+                </pic:pic>
+              </a:graphicData>
+            </a:graphic>
+          </wp:inline>
+        </w:drawing>
+      </w:r>
+      <w:r>
+        <w:br w:type="page"/>
+      </w:r>
+    </w:p>
+    <w:p>
+      <w:pPr>
+        <w:pStyle w:val="Heading1"/>
+      </w:pPr>
+      <w:r>
+        <w:lastRenderedPageBreak/>
         <w:t xml:space="preserve">Question </w:t>
       </w:r>
       <w:r>
@@ -5610,10 +5671,33 @@
       <w:bookmarkEnd w:id="4"/>
     </w:p>
     <w:p>
+      <w:bookmarkStart w:id="5" w:name="_Toc229570680"/>
+      <w:r>
+        <w:rPr>
+          <w:bCs/>
+        </w:rPr>
+        <w:t>User:</w:t>
+      </w:r>
+      <w:r>
+        <w:t> "Tell me about password safety"</w:t>
+      </w:r>
+      <w:r>
+        <w:br/>
+      </w:r>
+      <w:r>
+        <w:rPr>
+          <w:bCs/>
+        </w:rPr>
+        <w:t>Bot:</w:t>
+      </w:r>
+      <w:r>
+        <w:t> Returns detailed password tips with bullet points</w:t>
+      </w:r>
+    </w:p>
+    <w:p>
       <w:pPr>
         <w:pStyle w:val="Heading2"/>
       </w:pPr>
-      <w:bookmarkStart w:id="5" w:name="_Toc229570680"/>
       <w:r>
         <w:t>Screenshots</w:t>
       </w:r>
@@ -5621,10 +5705,87 @@
     </w:p>
     <w:p>
       <w:pPr>
-        <w:pStyle w:val="Heading1"/>
+        <w:rPr>
+          <w:rFonts w:eastAsiaTheme="majorEastAsia" w:cstheme="majorBidi"/>
+          <w:color w:val="000000" w:themeColor="text1"/>
+          <w:sz w:val="28"/>
+          <w:szCs w:val="40"/>
+          <w:u w:val="single"/>
+        </w:rPr>
       </w:pPr>
       <w:bookmarkStart w:id="6" w:name="_Toc229570681"/>
       <w:r>
+        <w:rPr>
+          <w:rFonts w:eastAsiaTheme="majorEastAsia" w:cstheme="majorBidi"/>
+          <w:noProof/>
+          <w:color w:val="000000" w:themeColor="text1"/>
+          <w:sz w:val="28"/>
+          <w:szCs w:val="40"/>
+          <w:u w:val="single"/>
+        </w:rPr>
+        <w:drawing>
+          <wp:inline distT="0" distB="0" distL="0" distR="0" wp14:anchorId="49B8829F" wp14:editId="1A3A927A">
+            <wp:extent cx="5731510" cy="4752340"/>
+            <wp:effectExtent l="0" t="0" r="2540" b="0"/>
+            <wp:docPr id="1571021551" name="Picture 29"/>
+            <wp:cNvGraphicFramePr>
+              <a:graphicFrameLocks xmlns:a="http://schemas.openxmlformats.org/drawingml/2006/main" noChangeAspect="1"/>
+            </wp:cNvGraphicFramePr>
+            <a:graphic xmlns:a="http://schemas.openxmlformats.org/drawingml/2006/main">
+              <a:graphicData uri="http://schemas.openxmlformats.org/drawingml/2006/picture">
+                <pic:pic xmlns:pic="http://schemas.openxmlformats.org/drawingml/2006/picture">
+                  <pic:nvPicPr>
+                    <pic:cNvPr id="1571021551" name="Picture 1571021551"/>
+                    <pic:cNvPicPr/>
+                  </pic:nvPicPr>
+                  <pic:blipFill>
+                    <a:blip r:embed="rId9">
+                      <a:extLst>
+                        <a:ext uri="{28A0092B-C50C-407E-A947-70E740481C1C}">
+                          <a14:useLocalDpi xmlns:a14="http://schemas.microsoft.com/office/drawing/2010/main" val="0"/>
+                        </a:ext>
+                      </a:extLst>
+                    </a:blip>
+                    <a:stretch>
+                      <a:fillRect/>
+                    </a:stretch>
+                  </pic:blipFill>
+                  <pic:spPr>
+                    <a:xfrm>
+                      <a:off x="0" y="0"/>
+                      <a:ext cx="5731510" cy="4752340"/>
+                    </a:xfrm>
+                    <a:prstGeom prst="rect">
+                      <a:avLst/>
+                    </a:prstGeom>
+                  </pic:spPr>
+                </pic:pic>
+              </a:graphicData>
+            </a:graphic>
+          </wp:inline>
+        </w:drawing>
+      </w:r>
+    </w:p>
+    <w:p>
+      <w:pPr>
+        <w:rPr>
+          <w:rFonts w:eastAsiaTheme="majorEastAsia" w:cstheme="majorBidi"/>
+          <w:color w:val="000000" w:themeColor="text1"/>
+          <w:sz w:val="28"/>
+          <w:szCs w:val="40"/>
+          <w:u w:val="single"/>
+        </w:rPr>
+      </w:pPr>
+      <w:r>
+        <w:br w:type="page"/>
+      </w:r>
+    </w:p>
+    <w:p>
+      <w:pPr>
+        <w:pStyle w:val="Heading1"/>
+      </w:pPr>
+      <w:r>
+        <w:lastRenderedPageBreak/>
         <w:t xml:space="preserve">Question </w:t>
       </w:r>
       <w:r>
@@ -5806,7 +5967,7 @@
     </w:p>
     <w:p/>
     <w:sectPr>
-      <w:footerReference w:type="default" r:id="rId8"/>
+      <w:footerReference w:type="default" r:id="rId10"/>
       <w:pgSz w:w="11906" w:h="16838"/>
       <w:pgMar w:top="1440" w:right="1440" w:bottom="1440" w:left="1440" w:header="708" w:footer="708" w:gutter="0"/>
       <w:pgNumType w:start="0"/>
@@ -7102,7 +7263,6 @@
   <w:style w:type="character" w:default="1" w:styleId="DefaultParagraphFont">
     <w:name w:val="Default Paragraph Font"/>
     <w:uiPriority w:val="1"/>
-    <w:semiHidden/>
     <w:unhideWhenUsed/>
   </w:style>
   <w:style w:type="table" w:default="1" w:styleId="TableNormal">

</xml_diff>

<commit_message>
Completed Question 3 & 4
Question 3 – Random Responses
Question 4 – Conversation Flow
</commit_message>
<xml_diff>
--- a/Part 2/ST10493664_PROG6221_POE_Part2.docx
+++ b/Part 2/ST10493664_PROG6221_POE_Part2.docx
@@ -4135,7 +4135,7 @@
           <w:r>
             <w:fldChar w:fldCharType="separate"/>
           </w:r>
-          <w:hyperlink w:anchor="_Toc229570676" w:history="1">
+          <w:hyperlink w:anchor="_Toc229575872" w:history="1">
             <w:r>
               <w:rPr>
                 <w:rStyle w:val="Hyperlink"/>
@@ -4162,7 +4162,7 @@
                 <w:noProof/>
                 <w:webHidden/>
               </w:rPr>
-              <w:instrText xml:space="preserve"> PAGEREF _Toc229570676 \h </w:instrText>
+              <w:instrText xml:space="preserve"> PAGEREF _Toc229575872 \h </w:instrText>
             </w:r>
             <w:r>
               <w:rPr>
@@ -4206,7 +4206,7 @@
               <w:lang w:eastAsia="en-ZA"/>
             </w:rPr>
           </w:pPr>
-          <w:hyperlink w:anchor="_Toc229570677" w:history="1">
+          <w:hyperlink w:anchor="_Toc229575873" w:history="1">
             <w:r>
               <w:rPr>
                 <w:rStyle w:val="Hyperlink"/>
@@ -4233,7 +4233,7 @@
                 <w:noProof/>
                 <w:webHidden/>
               </w:rPr>
-              <w:instrText xml:space="preserve"> PAGEREF _Toc229570677 \h </w:instrText>
+              <w:instrText xml:space="preserve"> PAGEREF _Toc229575873 \h </w:instrText>
             </w:r>
             <w:r>
               <w:rPr>
@@ -4277,7 +4277,7 @@
               <w:lang w:eastAsia="en-ZA"/>
             </w:rPr>
           </w:pPr>
-          <w:hyperlink w:anchor="_Toc229570678" w:history="1">
+          <w:hyperlink w:anchor="_Toc229575874" w:history="1">
             <w:r>
               <w:rPr>
                 <w:rStyle w:val="Hyperlink"/>
@@ -4304,7 +4304,7 @@
                 <w:noProof/>
                 <w:webHidden/>
               </w:rPr>
-              <w:instrText xml:space="preserve"> PAGEREF _Toc229570678 \h </w:instrText>
+              <w:instrText xml:space="preserve"> PAGEREF _Toc229575874 \h </w:instrText>
             </w:r>
             <w:r>
               <w:rPr>
@@ -4348,7 +4348,7 @@
               <w:lang w:eastAsia="en-ZA"/>
             </w:rPr>
           </w:pPr>
-          <w:hyperlink w:anchor="_Toc229570679" w:history="1">
+          <w:hyperlink w:anchor="_Toc229575875" w:history="1">
             <w:r>
               <w:rPr>
                 <w:rStyle w:val="Hyperlink"/>
@@ -4375,7 +4375,7 @@
                 <w:noProof/>
                 <w:webHidden/>
               </w:rPr>
-              <w:instrText xml:space="preserve"> PAGEREF _Toc229570679 \h </w:instrText>
+              <w:instrText xml:space="preserve"> PAGEREF _Toc229575875 \h </w:instrText>
             </w:r>
             <w:r>
               <w:rPr>
@@ -4395,7 +4395,7 @@
                 <w:noProof/>
                 <w:webHidden/>
               </w:rPr>
-              <w:t>3</w:t>
+              <w:t>4</w:t>
             </w:r>
             <w:r>
               <w:rPr>
@@ -4419,7 +4419,7 @@
               <w:lang w:eastAsia="en-ZA"/>
             </w:rPr>
           </w:pPr>
-          <w:hyperlink w:anchor="_Toc229570680" w:history="1">
+          <w:hyperlink w:anchor="_Toc229575876" w:history="1">
             <w:r>
               <w:rPr>
                 <w:rStyle w:val="Hyperlink"/>
@@ -4446,7 +4446,7 @@
                 <w:noProof/>
                 <w:webHidden/>
               </w:rPr>
-              <w:instrText xml:space="preserve"> PAGEREF _Toc229570680 \h </w:instrText>
+              <w:instrText xml:space="preserve"> PAGEREF _Toc229575876 \h </w:instrText>
             </w:r>
             <w:r>
               <w:rPr>
@@ -4466,7 +4466,7 @@
                 <w:noProof/>
                 <w:webHidden/>
               </w:rPr>
-              <w:t>3</w:t>
+              <w:t>4</w:t>
             </w:r>
             <w:r>
               <w:rPr>
@@ -4490,13 +4490,27 @@
               <w:lang w:eastAsia="en-ZA"/>
             </w:rPr>
           </w:pPr>
-          <w:hyperlink w:anchor="_Toc229570681" w:history="1">
+          <w:hyperlink w:anchor="_Toc229575877" w:history="1">
             <w:r>
               <w:rPr>
                 <w:rStyle w:val="Hyperlink"/>
                 <w:noProof/>
               </w:rPr>
-              <w:t>Question 3 – Random Responses</w:t>
+              <w:t xml:space="preserve">Question 3 – </w:t>
+            </w:r>
+            <w:r>
+              <w:rPr>
+                <w:rStyle w:val="Hyperlink"/>
+                <w:noProof/>
+              </w:rPr>
+              <w:t>R</w:t>
+            </w:r>
+            <w:r>
+              <w:rPr>
+                <w:rStyle w:val="Hyperlink"/>
+                <w:noProof/>
+              </w:rPr>
+              <w:t>andom Responses</w:t>
             </w:r>
             <w:r>
               <w:rPr>
@@ -4517,7 +4531,7 @@
                 <w:noProof/>
                 <w:webHidden/>
               </w:rPr>
-              <w:instrText xml:space="preserve"> PAGEREF _Toc229570681 \h </w:instrText>
+              <w:instrText xml:space="preserve"> PAGEREF _Toc229575877 \h </w:instrText>
             </w:r>
             <w:r>
               <w:rPr>
@@ -4537,7 +4551,7 @@
                 <w:noProof/>
                 <w:webHidden/>
               </w:rPr>
-              <w:t>3</w:t>
+              <w:t>5</w:t>
             </w:r>
             <w:r>
               <w:rPr>
@@ -4561,7 +4575,7 @@
               <w:lang w:eastAsia="en-ZA"/>
             </w:rPr>
           </w:pPr>
-          <w:hyperlink w:anchor="_Toc229570682" w:history="1">
+          <w:hyperlink w:anchor="_Toc229575878" w:history="1">
             <w:r>
               <w:rPr>
                 <w:rStyle w:val="Hyperlink"/>
@@ -4588,7 +4602,7 @@
                 <w:noProof/>
                 <w:webHidden/>
               </w:rPr>
-              <w:instrText xml:space="preserve"> PAGEREF _Toc229570682 \h </w:instrText>
+              <w:instrText xml:space="preserve"> PAGEREF _Toc229575878 \h </w:instrText>
             </w:r>
             <w:r>
               <w:rPr>
@@ -4608,7 +4622,7 @@
                 <w:noProof/>
                 <w:webHidden/>
               </w:rPr>
-              <w:t>3</w:t>
+              <w:t>5</w:t>
             </w:r>
             <w:r>
               <w:rPr>
@@ -4632,7 +4646,7 @@
               <w:lang w:eastAsia="en-ZA"/>
             </w:rPr>
           </w:pPr>
-          <w:hyperlink w:anchor="_Toc229570683" w:history="1">
+          <w:hyperlink w:anchor="_Toc229575879" w:history="1">
             <w:r>
               <w:rPr>
                 <w:rStyle w:val="Hyperlink"/>
@@ -4659,7 +4673,7 @@
                 <w:noProof/>
                 <w:webHidden/>
               </w:rPr>
-              <w:instrText xml:space="preserve"> PAGEREF _Toc229570683 \h </w:instrText>
+              <w:instrText xml:space="preserve"> PAGEREF _Toc229575879 \h </w:instrText>
             </w:r>
             <w:r>
               <w:rPr>
@@ -4679,7 +4693,7 @@
                 <w:noProof/>
                 <w:webHidden/>
               </w:rPr>
-              <w:t>3</w:t>
+              <w:t>6</w:t>
             </w:r>
             <w:r>
               <w:rPr>
@@ -4703,7 +4717,7 @@
               <w:lang w:eastAsia="en-ZA"/>
             </w:rPr>
           </w:pPr>
-          <w:hyperlink w:anchor="_Toc229570684" w:history="1">
+          <w:hyperlink w:anchor="_Toc229575880" w:history="1">
             <w:r>
               <w:rPr>
                 <w:rStyle w:val="Hyperlink"/>
@@ -4730,7 +4744,7 @@
                 <w:noProof/>
                 <w:webHidden/>
               </w:rPr>
-              <w:instrText xml:space="preserve"> PAGEREF _Toc229570684 \h </w:instrText>
+              <w:instrText xml:space="preserve"> PAGEREF _Toc229575880 \h </w:instrText>
             </w:r>
             <w:r>
               <w:rPr>
@@ -4750,7 +4764,7 @@
                 <w:noProof/>
                 <w:webHidden/>
               </w:rPr>
-              <w:t>3</w:t>
+              <w:t>6</w:t>
             </w:r>
             <w:r>
               <w:rPr>
@@ -4774,7 +4788,7 @@
               <w:lang w:eastAsia="en-ZA"/>
             </w:rPr>
           </w:pPr>
-          <w:hyperlink w:anchor="_Toc229570685" w:history="1">
+          <w:hyperlink w:anchor="_Toc229575881" w:history="1">
             <w:r>
               <w:rPr>
                 <w:rStyle w:val="Hyperlink"/>
@@ -4801,7 +4815,7 @@
                 <w:noProof/>
                 <w:webHidden/>
               </w:rPr>
-              <w:instrText xml:space="preserve"> PAGEREF _Toc229570685 \h </w:instrText>
+              <w:instrText xml:space="preserve"> PAGEREF _Toc229575881 \h </w:instrText>
             </w:r>
             <w:r>
               <w:rPr>
@@ -4821,7 +4835,7 @@
                 <w:noProof/>
                 <w:webHidden/>
               </w:rPr>
-              <w:t>3</w:t>
+              <w:t>6</w:t>
             </w:r>
             <w:r>
               <w:rPr>
@@ -4845,7 +4859,7 @@
               <w:lang w:eastAsia="en-ZA"/>
             </w:rPr>
           </w:pPr>
-          <w:hyperlink w:anchor="_Toc229570686" w:history="1">
+          <w:hyperlink w:anchor="_Toc229575882" w:history="1">
             <w:r>
               <w:rPr>
                 <w:rStyle w:val="Hyperlink"/>
@@ -4872,7 +4886,7 @@
                 <w:noProof/>
                 <w:webHidden/>
               </w:rPr>
-              <w:instrText xml:space="preserve"> PAGEREF _Toc229570686 \h </w:instrText>
+              <w:instrText xml:space="preserve"> PAGEREF _Toc229575882 \h </w:instrText>
             </w:r>
             <w:r>
               <w:rPr>
@@ -4892,7 +4906,7 @@
                 <w:noProof/>
                 <w:webHidden/>
               </w:rPr>
-              <w:t>3</w:t>
+              <w:t>6</w:t>
             </w:r>
             <w:r>
               <w:rPr>
@@ -4916,7 +4930,7 @@
               <w:lang w:eastAsia="en-ZA"/>
             </w:rPr>
           </w:pPr>
-          <w:hyperlink w:anchor="_Toc229570687" w:history="1">
+          <w:hyperlink w:anchor="_Toc229575883" w:history="1">
             <w:r>
               <w:rPr>
                 <w:rStyle w:val="Hyperlink"/>
@@ -4943,7 +4957,7 @@
                 <w:noProof/>
                 <w:webHidden/>
               </w:rPr>
-              <w:instrText xml:space="preserve"> PAGEREF _Toc229570687 \h </w:instrText>
+              <w:instrText xml:space="preserve"> PAGEREF _Toc229575883 \h </w:instrText>
             </w:r>
             <w:r>
               <w:rPr>
@@ -4963,7 +4977,7 @@
                 <w:noProof/>
                 <w:webHidden/>
               </w:rPr>
-              <w:t>3</w:t>
+              <w:t>6</w:t>
             </w:r>
             <w:r>
               <w:rPr>
@@ -4987,7 +5001,7 @@
               <w:lang w:eastAsia="en-ZA"/>
             </w:rPr>
           </w:pPr>
-          <w:hyperlink w:anchor="_Toc229570688" w:history="1">
+          <w:hyperlink w:anchor="_Toc229575884" w:history="1">
             <w:r>
               <w:rPr>
                 <w:rStyle w:val="Hyperlink"/>
@@ -5014,7 +5028,7 @@
                 <w:noProof/>
                 <w:webHidden/>
               </w:rPr>
-              <w:instrText xml:space="preserve"> PAGEREF _Toc229570688 \h </w:instrText>
+              <w:instrText xml:space="preserve"> PAGEREF _Toc229575884 \h </w:instrText>
             </w:r>
             <w:r>
               <w:rPr>
@@ -5034,7 +5048,7 @@
                 <w:noProof/>
                 <w:webHidden/>
               </w:rPr>
-              <w:t>3</w:t>
+              <w:t>6</w:t>
             </w:r>
             <w:r>
               <w:rPr>
@@ -5058,7 +5072,7 @@
               <w:lang w:eastAsia="en-ZA"/>
             </w:rPr>
           </w:pPr>
-          <w:hyperlink w:anchor="_Toc229570689" w:history="1">
+          <w:hyperlink w:anchor="_Toc229575885" w:history="1">
             <w:r>
               <w:rPr>
                 <w:rStyle w:val="Hyperlink"/>
@@ -5085,7 +5099,7 @@
                 <w:noProof/>
                 <w:webHidden/>
               </w:rPr>
-              <w:instrText xml:space="preserve"> PAGEREF _Toc229570689 \h </w:instrText>
+              <w:instrText xml:space="preserve"> PAGEREF _Toc229575885 \h </w:instrText>
             </w:r>
             <w:r>
               <w:rPr>
@@ -5105,7 +5119,7 @@
                 <w:noProof/>
                 <w:webHidden/>
               </w:rPr>
-              <w:t>3</w:t>
+              <w:t>6</w:t>
             </w:r>
             <w:r>
               <w:rPr>
@@ -5129,7 +5143,7 @@
               <w:lang w:eastAsia="en-ZA"/>
             </w:rPr>
           </w:pPr>
-          <w:hyperlink w:anchor="_Toc229570690" w:history="1">
+          <w:hyperlink w:anchor="_Toc229575886" w:history="1">
             <w:r>
               <w:rPr>
                 <w:rStyle w:val="Hyperlink"/>
@@ -5156,7 +5170,7 @@
                 <w:noProof/>
                 <w:webHidden/>
               </w:rPr>
-              <w:instrText xml:space="preserve"> PAGEREF _Toc229570690 \h </w:instrText>
+              <w:instrText xml:space="preserve"> PAGEREF _Toc229575886 \h </w:instrText>
             </w:r>
             <w:r>
               <w:rPr>
@@ -5176,7 +5190,7 @@
                 <w:noProof/>
                 <w:webHidden/>
               </w:rPr>
-              <w:t>3</w:t>
+              <w:t>6</w:t>
             </w:r>
             <w:r>
               <w:rPr>
@@ -5200,7 +5214,7 @@
               <w:lang w:eastAsia="en-ZA"/>
             </w:rPr>
           </w:pPr>
-          <w:hyperlink w:anchor="_Toc229570691" w:history="1">
+          <w:hyperlink w:anchor="_Toc229575887" w:history="1">
             <w:r>
               <w:rPr>
                 <w:rStyle w:val="Hyperlink"/>
@@ -5227,7 +5241,7 @@
                 <w:noProof/>
                 <w:webHidden/>
               </w:rPr>
-              <w:instrText xml:space="preserve"> PAGEREF _Toc229570691 \h </w:instrText>
+              <w:instrText xml:space="preserve"> PAGEREF _Toc229575887 \h </w:instrText>
             </w:r>
             <w:r>
               <w:rPr>
@@ -5247,7 +5261,7 @@
                 <w:noProof/>
                 <w:webHidden/>
               </w:rPr>
-              <w:t>3</w:t>
+              <w:t>6</w:t>
             </w:r>
             <w:r>
               <w:rPr>
@@ -5271,7 +5285,7 @@
               <w:lang w:eastAsia="en-ZA"/>
             </w:rPr>
           </w:pPr>
-          <w:hyperlink w:anchor="_Toc229570692" w:history="1">
+          <w:hyperlink w:anchor="_Toc229575888" w:history="1">
             <w:r>
               <w:rPr>
                 <w:rStyle w:val="Hyperlink"/>
@@ -5298,7 +5312,7 @@
                 <w:noProof/>
                 <w:webHidden/>
               </w:rPr>
-              <w:instrText xml:space="preserve"> PAGEREF _Toc229570692 \h </w:instrText>
+              <w:instrText xml:space="preserve"> PAGEREF _Toc229575888 \h </w:instrText>
             </w:r>
             <w:r>
               <w:rPr>
@@ -5318,7 +5332,7 @@
                 <w:noProof/>
                 <w:webHidden/>
               </w:rPr>
-              <w:t>3</w:t>
+              <w:t>6</w:t>
             </w:r>
             <w:r>
               <w:rPr>
@@ -5342,7 +5356,7 @@
               <w:lang w:eastAsia="en-ZA"/>
             </w:rPr>
           </w:pPr>
-          <w:hyperlink w:anchor="_Toc229570693" w:history="1">
+          <w:hyperlink w:anchor="_Toc229575889" w:history="1">
             <w:r>
               <w:rPr>
                 <w:rStyle w:val="Hyperlink"/>
@@ -5369,7 +5383,7 @@
                 <w:noProof/>
                 <w:webHidden/>
               </w:rPr>
-              <w:instrText xml:space="preserve"> PAGEREF _Toc229570693 \h </w:instrText>
+              <w:instrText xml:space="preserve"> PAGEREF _Toc229575889 \h </w:instrText>
             </w:r>
             <w:r>
               <w:rPr>
@@ -5389,7 +5403,7 @@
                 <w:noProof/>
                 <w:webHidden/>
               </w:rPr>
-              <w:t>3</w:t>
+              <w:t>6</w:t>
             </w:r>
             <w:r>
               <w:rPr>
@@ -5429,7 +5443,7 @@
       <w:pPr>
         <w:pStyle w:val="Heading1"/>
       </w:pPr>
-      <w:bookmarkStart w:id="1" w:name="_Toc229570676"/>
+      <w:bookmarkStart w:id="1" w:name="_Toc229575872"/>
       <w:r>
         <w:lastRenderedPageBreak/>
         <w:t>Project Description</w:t>
@@ -5573,7 +5587,7 @@
       <w:pPr>
         <w:pStyle w:val="Heading1"/>
       </w:pPr>
-      <w:bookmarkStart w:id="2" w:name="_Toc229570677"/>
+      <w:bookmarkStart w:id="2" w:name="_Toc229575873"/>
       <w:r>
         <w:lastRenderedPageBreak/>
         <w:t>Question 1</w:t>
@@ -5587,7 +5601,7 @@
       <w:pPr>
         <w:pStyle w:val="Heading2"/>
       </w:pPr>
-      <w:bookmarkStart w:id="3" w:name="_Toc229570678"/>
+      <w:bookmarkStart w:id="3" w:name="_Toc229575874"/>
       <w:r>
         <w:t>Screenshots</w:t>
       </w:r>
@@ -5603,16 +5617,15 @@
           <w:u w:val="single"/>
         </w:rPr>
       </w:pPr>
-      <w:bookmarkStart w:id="4" w:name="_Toc229570679"/>
       <w:r>
         <w:rPr>
           <w:noProof/>
         </w:rPr>
         <w:drawing>
-          <wp:inline distT="0" distB="0" distL="0" distR="0" wp14:anchorId="4AF98692" wp14:editId="1441629D">
-            <wp:extent cx="5731510" cy="4302760"/>
-            <wp:effectExtent l="0" t="0" r="2540" b="2540"/>
-            <wp:docPr id="644819047" name="Picture 28"/>
+          <wp:inline distT="0" distB="0" distL="0" distR="0" wp14:anchorId="3AD6952E" wp14:editId="26D7558A">
+            <wp:extent cx="5731510" cy="4472940"/>
+            <wp:effectExtent l="0" t="0" r="2540" b="3810"/>
+            <wp:docPr id="1960092876" name="Picture 34"/>
             <wp:cNvGraphicFramePr>
               <a:graphicFrameLocks xmlns:a="http://schemas.openxmlformats.org/drawingml/2006/main" noChangeAspect="1"/>
             </wp:cNvGraphicFramePr>
@@ -5620,7 +5633,7 @@
               <a:graphicData uri="http://schemas.openxmlformats.org/drawingml/2006/picture">
                 <pic:pic xmlns:pic="http://schemas.openxmlformats.org/drawingml/2006/picture">
                   <pic:nvPicPr>
-                    <pic:cNvPr id="644819047" name="Picture 644819047"/>
+                    <pic:cNvPr id="1960092876" name="Picture 1960092876"/>
                     <pic:cNvPicPr/>
                   </pic:nvPicPr>
                   <pic:blipFill>
@@ -5638,7 +5651,7 @@
                   <pic:spPr>
                     <a:xfrm>
                       <a:off x="0" y="0"/>
-                      <a:ext cx="5731510" cy="4302760"/>
+                      <a:ext cx="5731510" cy="4472940"/>
                     </a:xfrm>
                     <a:prstGeom prst="rect">
                       <a:avLst/>
@@ -5658,6 +5671,7 @@
       <w:pPr>
         <w:pStyle w:val="Heading1"/>
       </w:pPr>
+      <w:bookmarkStart w:id="4" w:name="_Toc229575875"/>
       <w:r>
         <w:lastRenderedPageBreak/>
         <w:t xml:space="preserve">Question </w:t>
@@ -5671,7 +5685,6 @@
       <w:bookmarkEnd w:id="4"/>
     </w:p>
     <w:p>
-      <w:bookmarkStart w:id="5" w:name="_Toc229570680"/>
       <w:r>
         <w:rPr>
           <w:bCs/>
@@ -5698,6 +5711,7 @@
       <w:pPr>
         <w:pStyle w:val="Heading2"/>
       </w:pPr>
+      <w:bookmarkStart w:id="5" w:name="_Toc229575876"/>
       <w:r>
         <w:t>Screenshots</w:t>
       </w:r>
@@ -5713,7 +5727,6 @@
           <w:u w:val="single"/>
         </w:rPr>
       </w:pPr>
-      <w:bookmarkStart w:id="6" w:name="_Toc229570681"/>
       <w:r>
         <w:rPr>
           <w:rFonts w:eastAsiaTheme="majorEastAsia" w:cstheme="majorBidi"/>
@@ -5784,6 +5797,7 @@
       <w:pPr>
         <w:pStyle w:val="Heading1"/>
       </w:pPr>
+      <w:bookmarkStart w:id="6" w:name="_Toc229575877"/>
       <w:r>
         <w:lastRenderedPageBreak/>
         <w:t xml:space="preserve">Question </w:t>
@@ -5795,23 +5809,156 @@
         <w:t xml:space="preserve"> – Random Responses</w:t>
       </w:r>
       <w:bookmarkEnd w:id="6"/>
+    </w:p>
+    <w:p>
+      <w:r>
+        <w:rPr>
+          <w:bCs/>
+        </w:rPr>
+        <w:t>User:</w:t>
+      </w:r>
+      <w:r>
+        <w:t> "Give me a phishing tip"</w:t>
+      </w:r>
     </w:p>
     <w:p>
       <w:pPr>
         <w:pStyle w:val="Heading2"/>
       </w:pPr>
-      <w:bookmarkStart w:id="7" w:name="_Toc229570682"/>
+      <w:bookmarkStart w:id="7" w:name="_Toc229575878"/>
       <w:r>
         <w:t>Screenshots</w:t>
       </w:r>
       <w:bookmarkEnd w:id="7"/>
+    </w:p>
+    <w:p>
+      <w:r>
+        <w:t xml:space="preserve">Random Response </w:t>
+      </w:r>
+      <w:r>
+        <w:t>1</w:t>
+      </w:r>
+    </w:p>
+    <w:p>
+      <w:r>
+        <w:rPr>
+          <w:noProof/>
+        </w:rPr>
+        <w:drawing>
+          <wp:inline distT="0" distB="0" distL="0" distR="0" wp14:anchorId="06E5F1D6" wp14:editId="732D9108">
+            <wp:extent cx="5731510" cy="1736090"/>
+            <wp:effectExtent l="0" t="0" r="2540" b="0"/>
+            <wp:docPr id="1939625115" name="Picture 33"/>
+            <wp:cNvGraphicFramePr>
+              <a:graphicFrameLocks xmlns:a="http://schemas.openxmlformats.org/drawingml/2006/main" noChangeAspect="1"/>
+            </wp:cNvGraphicFramePr>
+            <a:graphic xmlns:a="http://schemas.openxmlformats.org/drawingml/2006/main">
+              <a:graphicData uri="http://schemas.openxmlformats.org/drawingml/2006/picture">
+                <pic:pic xmlns:pic="http://schemas.openxmlformats.org/drawingml/2006/picture">
+                  <pic:nvPicPr>
+                    <pic:cNvPr id="1939625115" name="Picture 1939625115"/>
+                    <pic:cNvPicPr/>
+                  </pic:nvPicPr>
+                  <pic:blipFill>
+                    <a:blip r:embed="rId10">
+                      <a:extLst>
+                        <a:ext uri="{28A0092B-C50C-407E-A947-70E740481C1C}">
+                          <a14:useLocalDpi xmlns:a14="http://schemas.microsoft.com/office/drawing/2010/main" val="0"/>
+                        </a:ext>
+                      </a:extLst>
+                    </a:blip>
+                    <a:stretch>
+                      <a:fillRect/>
+                    </a:stretch>
+                  </pic:blipFill>
+                  <pic:spPr>
+                    <a:xfrm>
+                      <a:off x="0" y="0"/>
+                      <a:ext cx="5731510" cy="1736090"/>
+                    </a:xfrm>
+                    <a:prstGeom prst="rect">
+                      <a:avLst/>
+                    </a:prstGeom>
+                  </pic:spPr>
+                </pic:pic>
+              </a:graphicData>
+            </a:graphic>
+          </wp:inline>
+        </w:drawing>
+      </w:r>
+    </w:p>
+    <w:p>
+      <w:r>
+        <w:t>Random Response 2</w:t>
+      </w:r>
+    </w:p>
+    <w:p>
+      <w:pPr>
+        <w:rPr>
+          <w:rFonts w:eastAsiaTheme="majorEastAsia" w:cstheme="majorBidi"/>
+          <w:color w:val="000000" w:themeColor="text1"/>
+          <w:sz w:val="28"/>
+          <w:szCs w:val="40"/>
+          <w:u w:val="single"/>
+        </w:rPr>
+      </w:pPr>
+      <w:r>
+        <w:rPr>
+          <w:noProof/>
+        </w:rPr>
+        <w:drawing>
+          <wp:inline distT="0" distB="0" distL="0" distR="0" wp14:anchorId="7B23060E" wp14:editId="4A6D620C">
+            <wp:extent cx="5731510" cy="1991360"/>
+            <wp:effectExtent l="0" t="0" r="2540" b="8890"/>
+            <wp:docPr id="820241666" name="Picture 32"/>
+            <wp:cNvGraphicFramePr>
+              <a:graphicFrameLocks xmlns:a="http://schemas.openxmlformats.org/drawingml/2006/main" noChangeAspect="1"/>
+            </wp:cNvGraphicFramePr>
+            <a:graphic xmlns:a="http://schemas.openxmlformats.org/drawingml/2006/main">
+              <a:graphicData uri="http://schemas.openxmlformats.org/drawingml/2006/picture">
+                <pic:pic xmlns:pic="http://schemas.openxmlformats.org/drawingml/2006/picture">
+                  <pic:nvPicPr>
+                    <pic:cNvPr id="820241666" name="Picture 820241666"/>
+                    <pic:cNvPicPr/>
+                  </pic:nvPicPr>
+                  <pic:blipFill>
+                    <a:blip r:embed="rId11">
+                      <a:extLst>
+                        <a:ext uri="{28A0092B-C50C-407E-A947-70E740481C1C}">
+                          <a14:useLocalDpi xmlns:a14="http://schemas.microsoft.com/office/drawing/2010/main" val="0"/>
+                        </a:ext>
+                      </a:extLst>
+                    </a:blip>
+                    <a:stretch>
+                      <a:fillRect/>
+                    </a:stretch>
+                  </pic:blipFill>
+                  <pic:spPr>
+                    <a:xfrm>
+                      <a:off x="0" y="0"/>
+                      <a:ext cx="5731510" cy="1991360"/>
+                    </a:xfrm>
+                    <a:prstGeom prst="rect">
+                      <a:avLst/>
+                    </a:prstGeom>
+                  </pic:spPr>
+                </pic:pic>
+              </a:graphicData>
+            </a:graphic>
+          </wp:inline>
+        </w:drawing>
+      </w:r>
+      <w:r>
+        <w:br w:type="page"/>
+      </w:r>
     </w:p>
     <w:p>
       <w:pPr>
         <w:pStyle w:val="Heading1"/>
       </w:pPr>
-      <w:bookmarkStart w:id="8" w:name="_Toc229570683"/>
-      <w:r>
+      <w:bookmarkStart w:id="8" w:name="_Toc229575879"/>
+      <w:r>
+        <w:lastRenderedPageBreak/>
         <w:t xml:space="preserve">Question </w:t>
       </w:r>
       <w:r>
@@ -5831,22 +5978,165 @@
       </w:r>
       <w:bookmarkEnd w:id="8"/>
     </w:p>
+    <w:p>
+      <w:bookmarkStart w:id="9" w:name="_Toc229575880"/>
+      <w:r>
+        <w:rPr>
+          <w:b/>
+          <w:bCs/>
+        </w:rPr>
+        <w:t>User:</w:t>
+      </w:r>
+      <w:r>
+        <w:t> "Give me a password tip"</w:t>
+      </w:r>
+    </w:p>
+    <w:p>
+      <w:r>
+        <w:rPr>
+          <w:b/>
+          <w:bCs/>
+        </w:rPr>
+        <w:t>Bot:</w:t>
+      </w:r>
+      <w:r>
+        <w:t> "</w:t>
+      </w:r>
+      <w:r>
+        <w:rPr>
+          <w:rFonts w:ascii="Segoe UI Emoji" w:hAnsi="Segoe UI Emoji" w:cs="Segoe UI Emoji"/>
+        </w:rPr>
+        <w:t>🔐</w:t>
+      </w:r>
+      <w:r>
+        <w:t xml:space="preserve"> Never reuse passwords across different accounts. If one gets compromised, all your accounts become vulnerable! </w:t>
+      </w:r>
+      <w:r>
+        <w:rPr>
+          <w:rFonts w:ascii="Segoe UI Emoji" w:hAnsi="Segoe UI Emoji" w:cs="Segoe UI Emoji"/>
+        </w:rPr>
+        <w:t>💡</w:t>
+      </w:r>
+      <w:r>
+        <w:t xml:space="preserve"> Type 'tell me more' for a detailed explanation or 'another tip' for more password advice!"</w:t>
+      </w:r>
+    </w:p>
+    <w:p>
+      <w:r>
+        <w:rPr>
+          <w:b/>
+          <w:bCs/>
+        </w:rPr>
+        <w:t>User:</w:t>
+      </w:r>
+      <w:r>
+        <w:t> </w:t>
+      </w:r>
+      <w:r>
+        <w:rPr>
+          <w:color w:val="EE0000"/>
+        </w:rPr>
+        <w:t>"tell me more"</w:t>
+      </w:r>
+    </w:p>
+    <w:p>
+      <w:r>
+        <w:rPr>
+          <w:b/>
+          <w:bCs/>
+        </w:rPr>
+        <w:t>Bot:</w:t>
+      </w:r>
+      <w:r>
+        <w:t> "</w:t>
+      </w:r>
+      <w:r>
+        <w:rPr>
+          <w:rFonts w:ascii="Segoe UI Emoji" w:hAnsi="Segoe UI Emoji" w:cs="Segoe UI Emoji"/>
+        </w:rPr>
+        <w:t>🔐</w:t>
+      </w:r>
+      <w:r>
+        <w:t xml:space="preserve"> Let me explain password security in more detail: [detailed explanation about password strength, passphrases, and password managers]"</w:t>
+      </w:r>
+    </w:p>
+    <w:p/>
     <w:p>
       <w:pPr>
         <w:pStyle w:val="Heading2"/>
       </w:pPr>
-      <w:bookmarkStart w:id="9" w:name="_Toc229570684"/>
       <w:r>
         <w:t>Screenshots</w:t>
       </w:r>
       <w:bookmarkEnd w:id="9"/>
+    </w:p>
+    <w:p>
+      <w:pPr>
+        <w:rPr>
+          <w:rFonts w:eastAsiaTheme="majorEastAsia" w:cstheme="majorBidi"/>
+          <w:color w:val="000000" w:themeColor="text1"/>
+          <w:sz w:val="28"/>
+          <w:szCs w:val="40"/>
+          <w:u w:val="single"/>
+        </w:rPr>
+      </w:pPr>
+      <w:bookmarkStart w:id="10" w:name="_Toc229575881"/>
+      <w:r>
+        <w:rPr>
+          <w:noProof/>
+        </w:rPr>
+        <w:drawing>
+          <wp:inline distT="0" distB="0" distL="0" distR="0" wp14:anchorId="67AC4446" wp14:editId="55E7642B">
+            <wp:extent cx="5731510" cy="3419475"/>
+            <wp:effectExtent l="0" t="0" r="2540" b="9525"/>
+            <wp:docPr id="1459807776" name="Picture 35"/>
+            <wp:cNvGraphicFramePr>
+              <a:graphicFrameLocks xmlns:a="http://schemas.openxmlformats.org/drawingml/2006/main" noChangeAspect="1"/>
+            </wp:cNvGraphicFramePr>
+            <a:graphic xmlns:a="http://schemas.openxmlformats.org/drawingml/2006/main">
+              <a:graphicData uri="http://schemas.openxmlformats.org/drawingml/2006/picture">
+                <pic:pic xmlns:pic="http://schemas.openxmlformats.org/drawingml/2006/picture">
+                  <pic:nvPicPr>
+                    <pic:cNvPr id="1459807776" name="Picture 1459807776"/>
+                    <pic:cNvPicPr/>
+                  </pic:nvPicPr>
+                  <pic:blipFill>
+                    <a:blip r:embed="rId12">
+                      <a:extLst>
+                        <a:ext uri="{28A0092B-C50C-407E-A947-70E740481C1C}">
+                          <a14:useLocalDpi xmlns:a14="http://schemas.microsoft.com/office/drawing/2010/main" val="0"/>
+                        </a:ext>
+                      </a:extLst>
+                    </a:blip>
+                    <a:stretch>
+                      <a:fillRect/>
+                    </a:stretch>
+                  </pic:blipFill>
+                  <pic:spPr>
+                    <a:xfrm>
+                      <a:off x="0" y="0"/>
+                      <a:ext cx="5731510" cy="3419475"/>
+                    </a:xfrm>
+                    <a:prstGeom prst="rect">
+                      <a:avLst/>
+                    </a:prstGeom>
+                  </pic:spPr>
+                </pic:pic>
+              </a:graphicData>
+            </a:graphic>
+          </wp:inline>
+        </w:drawing>
+      </w:r>
+      <w:r>
+        <w:br w:type="page"/>
+      </w:r>
     </w:p>
     <w:p>
       <w:pPr>
         <w:pStyle w:val="Heading1"/>
       </w:pPr>
-      <w:bookmarkStart w:id="10" w:name="_Toc229570685"/>
-      <w:r>
+      <w:r>
+        <w:lastRenderedPageBreak/>
         <w:t xml:space="preserve">Question </w:t>
       </w:r>
       <w:r>
@@ -5861,7 +6151,7 @@
       <w:pPr>
         <w:pStyle w:val="Heading2"/>
       </w:pPr>
-      <w:bookmarkStart w:id="11" w:name="_Toc229570686"/>
+      <w:bookmarkStart w:id="11" w:name="_Toc229575882"/>
       <w:r>
         <w:t>Screenshots</w:t>
       </w:r>
@@ -5871,7 +6161,7 @@
       <w:pPr>
         <w:pStyle w:val="Heading1"/>
       </w:pPr>
-      <w:bookmarkStart w:id="12" w:name="_Toc229570687"/>
+      <w:bookmarkStart w:id="12" w:name="_Toc229575883"/>
       <w:r>
         <w:t xml:space="preserve">Question </w:t>
       </w:r>
@@ -5887,7 +6177,7 @@
       <w:pPr>
         <w:pStyle w:val="Heading2"/>
       </w:pPr>
-      <w:bookmarkStart w:id="13" w:name="_Toc229570688"/>
+      <w:bookmarkStart w:id="13" w:name="_Toc229575884"/>
       <w:r>
         <w:t>Screenshots</w:t>
       </w:r>
@@ -5897,7 +6187,7 @@
       <w:pPr>
         <w:pStyle w:val="Heading1"/>
       </w:pPr>
-      <w:bookmarkStart w:id="14" w:name="_Toc229570689"/>
+      <w:bookmarkStart w:id="14" w:name="_Toc229575885"/>
       <w:r>
         <w:t xml:space="preserve">Question </w:t>
       </w:r>
@@ -5922,7 +6212,7 @@
       <w:pPr>
         <w:pStyle w:val="Heading2"/>
       </w:pPr>
-      <w:bookmarkStart w:id="15" w:name="_Toc229570690"/>
+      <w:bookmarkStart w:id="15" w:name="_Toc229575886"/>
       <w:r>
         <w:t>Screenshots</w:t>
       </w:r>
@@ -5932,7 +6222,7 @@
       <w:pPr>
         <w:pStyle w:val="Heading1"/>
       </w:pPr>
-      <w:bookmarkStart w:id="16" w:name="_Toc229570691"/>
+      <w:bookmarkStart w:id="16" w:name="_Toc229575887"/>
       <w:r>
         <w:t xml:space="preserve">Question </w:t>
       </w:r>
@@ -5948,7 +6238,7 @@
       <w:pPr>
         <w:pStyle w:val="Heading2"/>
       </w:pPr>
-      <w:bookmarkStart w:id="17" w:name="_Toc229570692"/>
+      <w:bookmarkStart w:id="17" w:name="_Toc229575888"/>
       <w:r>
         <w:t>Screenshots</w:t>
       </w:r>
@@ -5959,7 +6249,7 @@
       <w:pPr>
         <w:pStyle w:val="Heading1"/>
       </w:pPr>
-      <w:bookmarkStart w:id="18" w:name="_Toc229570693"/>
+      <w:bookmarkStart w:id="18" w:name="_Toc229575889"/>
       <w:r>
         <w:t>References</w:t>
       </w:r>
@@ -5967,7 +6257,7 @@
     </w:p>
     <w:p/>
     <w:sectPr>
-      <w:footerReference w:type="default" r:id="rId10"/>
+      <w:footerReference w:type="default" r:id="rId13"/>
       <w:pgSz w:w="11906" w:h="16838"/>
       <w:pgMar w:top="1440" w:right="1440" w:bottom="1440" w:left="1440" w:header="708" w:footer="708" w:gutter="0"/>
       <w:pgNumType w:start="0"/>
@@ -7056,7 +7346,7 @@
   <w:style w:type="paragraph" w:default="1" w:styleId="Normal">
     <w:name w:val="Normal"/>
     <w:qFormat/>
-    <w:rsid w:val="00CC3E45"/>
+    <w:rsid w:val="002B2080"/>
   </w:style>
   <w:style w:type="paragraph" w:styleId="Heading1">
     <w:name w:val="heading 1"/>

</xml_diff>

<commit_message>
Completed Question 5 & 6
Question 5 – Memory & Recall
Question 6 – Sentiment Detection
</commit_message>
<xml_diff>
--- a/Part 2/ST10493664_PROG6221_POE_Part2.docx
+++ b/Part 2/ST10493664_PROG6221_POE_Part2.docx
@@ -10,6 +10,7 @@
           <w:docPartUnique/>
         </w:docPartObj>
       </w:sdtPr>
+      <w:sdtEndPr/>
       <w:sdtContent>
         <w:p>
           <w:pPr>
@@ -149,6 +150,7 @@
                                       <w:calendar w:val="gregorian"/>
                                     </w:date>
                                   </w:sdtPr>
+                                  <w:sdtEndPr/>
                                   <w:sdtContent>
                                     <w:p>
                                       <w:pPr>
@@ -3462,6 +3464,7 @@
                                 <w:calendar w:val="gregorian"/>
                               </w:date>
                             </w:sdtPr>
+                            <w:sdtEndPr/>
                             <w:sdtContent>
                               <w:p>
                                 <w:pPr>
@@ -3687,6 +3690,7 @@
                                     <w:dataBinding w:prefixMappings="xmlns:ns0='http://purl.org/dc/elements/1.1/' xmlns:ns1='http://schemas.openxmlformats.org/package/2006/metadata/core-properties' " w:xpath="/ns1:coreProperties[1]/ns0:title[1]" w:storeItemID="{6C3C8BC8-F283-45AE-878A-BAB7291924A1}"/>
                                     <w:text/>
                                   </w:sdtPr>
+                                  <w:sdtEndPr/>
                                   <w:sdtContent>
                                     <w:r>
                                       <w:rPr>
@@ -3722,6 +3726,7 @@
                                     <w:dataBinding w:prefixMappings="xmlns:ns0='http://purl.org/dc/elements/1.1/' xmlns:ns1='http://schemas.openxmlformats.org/package/2006/metadata/core-properties' " w:xpath="/ns1:coreProperties[1]/ns0:subject[1]" w:storeItemID="{6C3C8BC8-F283-45AE-878A-BAB7291924A1}"/>
                                     <w:text/>
                                   </w:sdtPr>
+                                  <w:sdtEndPr/>
                                   <w:sdtContent>
                                     <w:r>
                                       <w:rPr>
@@ -3810,6 +3815,7 @@
                               <w:dataBinding w:prefixMappings="xmlns:ns0='http://purl.org/dc/elements/1.1/' xmlns:ns1='http://schemas.openxmlformats.org/package/2006/metadata/core-properties' " w:xpath="/ns1:coreProperties[1]/ns0:title[1]" w:storeItemID="{6C3C8BC8-F283-45AE-878A-BAB7291924A1}"/>
                               <w:text/>
                             </w:sdtPr>
+                            <w:sdtEndPr/>
                             <w:sdtContent>
                               <w:r>
                                 <w:rPr>
@@ -3845,6 +3851,7 @@
                               <w:dataBinding w:prefixMappings="xmlns:ns0='http://purl.org/dc/elements/1.1/' xmlns:ns1='http://schemas.openxmlformats.org/package/2006/metadata/core-properties' " w:xpath="/ns1:coreProperties[1]/ns0:subject[1]" w:storeItemID="{6C3C8BC8-F283-45AE-878A-BAB7291924A1}"/>
                               <w:text/>
                             </w:sdtPr>
+                            <w:sdtEndPr/>
                             <w:sdtContent>
                               <w:r>
                                 <w:rPr>
@@ -6158,11 +6165,125 @@
       <w:bookmarkEnd w:id="11"/>
     </w:p>
     <w:p>
+      <w:bookmarkStart w:id="12" w:name="_Toc229575883"/>
+      <w:r>
+        <w:rPr>
+          <w:noProof/>
+        </w:rPr>
+        <w:drawing>
+          <wp:inline distT="0" distB="0" distL="0" distR="0" wp14:anchorId="726F1FC2" wp14:editId="4A3BFD72">
+            <wp:extent cx="5731510" cy="1853565"/>
+            <wp:effectExtent l="0" t="0" r="2540" b="0"/>
+            <wp:docPr id="2017116187" name="Picture 37"/>
+            <wp:cNvGraphicFramePr>
+              <a:graphicFrameLocks xmlns:a="http://schemas.openxmlformats.org/drawingml/2006/main" noChangeAspect="1"/>
+            </wp:cNvGraphicFramePr>
+            <a:graphic xmlns:a="http://schemas.openxmlformats.org/drawingml/2006/main">
+              <a:graphicData uri="http://schemas.openxmlformats.org/drawingml/2006/picture">
+                <pic:pic xmlns:pic="http://schemas.openxmlformats.org/drawingml/2006/picture">
+                  <pic:nvPicPr>
+                    <pic:cNvPr id="2017116187" name="Picture 2017116187"/>
+                    <pic:cNvPicPr/>
+                  </pic:nvPicPr>
+                  <pic:blipFill>
+                    <a:blip r:embed="rId13">
+                      <a:extLst>
+                        <a:ext uri="{28A0092B-C50C-407E-A947-70E740481C1C}">
+                          <a14:useLocalDpi xmlns:a14="http://schemas.microsoft.com/office/drawing/2010/main" val="0"/>
+                        </a:ext>
+                      </a:extLst>
+                    </a:blip>
+                    <a:stretch>
+                      <a:fillRect/>
+                    </a:stretch>
+                  </pic:blipFill>
+                  <pic:spPr>
+                    <a:xfrm>
+                      <a:off x="0" y="0"/>
+                      <a:ext cx="5731510" cy="1853565"/>
+                    </a:xfrm>
+                    <a:prstGeom prst="rect">
+                      <a:avLst/>
+                    </a:prstGeom>
+                  </pic:spPr>
+                </pic:pic>
+              </a:graphicData>
+            </a:graphic>
+          </wp:inline>
+        </w:drawing>
+      </w:r>
+    </w:p>
+    <w:p>
+      <w:r>
+        <w:t>Recall:</w:t>
+      </w:r>
+    </w:p>
+    <w:p>
+      <w:pPr>
+        <w:rPr>
+          <w:rFonts w:eastAsiaTheme="majorEastAsia" w:cstheme="majorBidi"/>
+          <w:color w:val="000000" w:themeColor="text1"/>
+          <w:sz w:val="28"/>
+          <w:szCs w:val="40"/>
+          <w:u w:val="single"/>
+        </w:rPr>
+      </w:pPr>
+      <w:r>
+        <w:rPr>
+          <w:noProof/>
+        </w:rPr>
+        <w:drawing>
+          <wp:inline distT="0" distB="0" distL="0" distR="0" wp14:anchorId="72131239" wp14:editId="09110261">
+            <wp:extent cx="5731510" cy="1907260"/>
+            <wp:effectExtent l="0" t="0" r="2540" b="0"/>
+            <wp:docPr id="1183147117" name="Picture 38"/>
+            <wp:cNvGraphicFramePr>
+              <a:graphicFrameLocks xmlns:a="http://schemas.openxmlformats.org/drawingml/2006/main" noChangeAspect="1"/>
+            </wp:cNvGraphicFramePr>
+            <a:graphic xmlns:a="http://schemas.openxmlformats.org/drawingml/2006/main">
+              <a:graphicData uri="http://schemas.openxmlformats.org/drawingml/2006/picture">
+                <pic:pic xmlns:pic="http://schemas.openxmlformats.org/drawingml/2006/picture">
+                  <pic:nvPicPr>
+                    <pic:cNvPr id="1183147117" name="Picture 1183147117"/>
+                    <pic:cNvPicPr/>
+                  </pic:nvPicPr>
+                  <pic:blipFill>
+                    <a:blip r:embed="rId14">
+                      <a:extLst>
+                        <a:ext uri="{28A0092B-C50C-407E-A947-70E740481C1C}">
+                          <a14:useLocalDpi xmlns:a14="http://schemas.microsoft.com/office/drawing/2010/main" val="0"/>
+                        </a:ext>
+                      </a:extLst>
+                    </a:blip>
+                    <a:stretch>
+                      <a:fillRect/>
+                    </a:stretch>
+                  </pic:blipFill>
+                  <pic:spPr>
+                    <a:xfrm>
+                      <a:off x="0" y="0"/>
+                      <a:ext cx="5752949" cy="1914394"/>
+                    </a:xfrm>
+                    <a:prstGeom prst="rect">
+                      <a:avLst/>
+                    </a:prstGeom>
+                  </pic:spPr>
+                </pic:pic>
+              </a:graphicData>
+            </a:graphic>
+          </wp:inline>
+        </w:drawing>
+      </w:r>
+      <w:r>
+        <w:br w:type="page"/>
+      </w:r>
+    </w:p>
+    <w:p>
       <w:pPr>
         <w:pStyle w:val="Heading1"/>
       </w:pPr>
-      <w:bookmarkStart w:id="12" w:name="_Toc229575883"/>
-      <w:r>
+      <w:r>
+        <w:lastRenderedPageBreak/>
         <w:t xml:space="preserve">Question </w:t>
       </w:r>
       <w:r>
@@ -6185,10 +6306,117 @@
     </w:p>
     <w:p>
       <w:pPr>
+        <w:rPr>
+          <w:rFonts w:eastAsiaTheme="majorEastAsia" w:cstheme="majorBidi"/>
+          <w:color w:val="000000" w:themeColor="text1"/>
+          <w:sz w:val="28"/>
+          <w:szCs w:val="40"/>
+          <w:u w:val="single"/>
+        </w:rPr>
+      </w:pPr>
+      <w:bookmarkStart w:id="14" w:name="_Toc229575885"/>
+      <w:r>
+        <w:rPr>
+          <w:noProof/>
+        </w:rPr>
+        <w:drawing>
+          <wp:inline distT="0" distB="0" distL="0" distR="0" wp14:anchorId="517522B1" wp14:editId="2A44183A">
+            <wp:extent cx="5731510" cy="3131185"/>
+            <wp:effectExtent l="0" t="0" r="2540" b="0"/>
+            <wp:docPr id="1661489416" name="Picture 39"/>
+            <wp:cNvGraphicFramePr>
+              <a:graphicFrameLocks xmlns:a="http://schemas.openxmlformats.org/drawingml/2006/main" noChangeAspect="1"/>
+            </wp:cNvGraphicFramePr>
+            <a:graphic xmlns:a="http://schemas.openxmlformats.org/drawingml/2006/main">
+              <a:graphicData uri="http://schemas.openxmlformats.org/drawingml/2006/picture">
+                <pic:pic xmlns:pic="http://schemas.openxmlformats.org/drawingml/2006/picture">
+                  <pic:nvPicPr>
+                    <pic:cNvPr id="1661489416" name="Picture 1661489416"/>
+                    <pic:cNvPicPr/>
+                  </pic:nvPicPr>
+                  <pic:blipFill>
+                    <a:blip r:embed="rId15">
+                      <a:extLst>
+                        <a:ext uri="{28A0092B-C50C-407E-A947-70E740481C1C}">
+                          <a14:useLocalDpi xmlns:a14="http://schemas.microsoft.com/office/drawing/2010/main" val="0"/>
+                        </a:ext>
+                      </a:extLst>
+                    </a:blip>
+                    <a:stretch>
+                      <a:fillRect/>
+                    </a:stretch>
+                  </pic:blipFill>
+                  <pic:spPr>
+                    <a:xfrm>
+                      <a:off x="0" y="0"/>
+                      <a:ext cx="5731510" cy="3131185"/>
+                    </a:xfrm>
+                    <a:prstGeom prst="rect">
+                      <a:avLst/>
+                    </a:prstGeom>
+                  </pic:spPr>
+                </pic:pic>
+              </a:graphicData>
+            </a:graphic>
+          </wp:inline>
+        </w:drawing>
+      </w:r>
+      <w:r>
+        <w:rPr>
+          <w:noProof/>
+        </w:rPr>
+        <w:drawing>
+          <wp:inline distT="0" distB="0" distL="0" distR="0" wp14:anchorId="013C7984" wp14:editId="6FCE8742">
+            <wp:extent cx="5731510" cy="2792730"/>
+            <wp:effectExtent l="0" t="0" r="2540" b="7620"/>
+            <wp:docPr id="481201181" name="Picture 41"/>
+            <wp:cNvGraphicFramePr>
+              <a:graphicFrameLocks xmlns:a="http://schemas.openxmlformats.org/drawingml/2006/main" noChangeAspect="1"/>
+            </wp:cNvGraphicFramePr>
+            <a:graphic xmlns:a="http://schemas.openxmlformats.org/drawingml/2006/main">
+              <a:graphicData uri="http://schemas.openxmlformats.org/drawingml/2006/picture">
+                <pic:pic xmlns:pic="http://schemas.openxmlformats.org/drawingml/2006/picture">
+                  <pic:nvPicPr>
+                    <pic:cNvPr id="481201181" name="Picture 481201181"/>
+                    <pic:cNvPicPr/>
+                  </pic:nvPicPr>
+                  <pic:blipFill>
+                    <a:blip r:embed="rId16">
+                      <a:extLst>
+                        <a:ext uri="{28A0092B-C50C-407E-A947-70E740481C1C}">
+                          <a14:useLocalDpi xmlns:a14="http://schemas.microsoft.com/office/drawing/2010/main" val="0"/>
+                        </a:ext>
+                      </a:extLst>
+                    </a:blip>
+                    <a:stretch>
+                      <a:fillRect/>
+                    </a:stretch>
+                  </pic:blipFill>
+                  <pic:spPr>
+                    <a:xfrm>
+                      <a:off x="0" y="0"/>
+                      <a:ext cx="5731510" cy="2792730"/>
+                    </a:xfrm>
+                    <a:prstGeom prst="rect">
+                      <a:avLst/>
+                    </a:prstGeom>
+                  </pic:spPr>
+                </pic:pic>
+              </a:graphicData>
+            </a:graphic>
+          </wp:inline>
+        </w:drawing>
+      </w:r>
+      <w:r>
+        <w:br w:type="page"/>
+      </w:r>
+    </w:p>
+    <w:p>
+      <w:pPr>
         <w:pStyle w:val="Heading1"/>
       </w:pPr>
-      <w:bookmarkStart w:id="14" w:name="_Toc229575885"/>
-      <w:r>
+      <w:r>
+        <w:lastRenderedPageBreak/>
         <w:t xml:space="preserve">Question </w:t>
       </w:r>
       <w:r>
@@ -6257,7 +6485,7 @@
     </w:p>
     <w:p/>
     <w:sectPr>
-      <w:footerReference w:type="default" r:id="rId13"/>
+      <w:footerReference w:type="default" r:id="rId17"/>
       <w:pgSz w:w="11906" w:h="16838"/>
       <w:pgMar w:top="1440" w:right="1440" w:bottom="1440" w:left="1440" w:header="708" w:footer="708" w:gutter="0"/>
       <w:pgNumType w:start="0"/>
@@ -6304,6 +6532,7 @@
         <w:docPartUnique/>
       </w:docPartObj>
     </w:sdtPr>
+    <w:sdtEndPr/>
     <w:sdtContent>
       <w:sdt>
         <w:sdtPr>
@@ -6313,6 +6542,7 @@
             <w:docPartUnique/>
           </w:docPartObj>
         </w:sdtPr>
+        <w:sdtEndPr/>
         <w:sdtContent>
           <w:p>
             <w:pPr>

</xml_diff>

<commit_message>
Completed Question 7 & 8
Question 7 – Error Handling & Edge Cases
Question 8 – Code Optimisation
</commit_message>
<xml_diff>
--- a/Part 2/ST10493664_PROG6221_POE_Part2.docx
+++ b/Part 2/ST10493664_PROG6221_POE_Part2.docx
@@ -4,6 +4,9 @@
   <w:body>
     <w:sdt>
       <w:sdtPr>
+        <w:rPr>
+          <w:rFonts w:ascii="Calibri" w:hAnsi="Calibri" w:cs="Calibri"/>
+        </w:rPr>
         <w:id w:val="918908650"/>
         <w:docPartObj>
           <w:docPartGallery w:val="Cover Pages"/>
@@ -15,9 +18,13 @@
         <w:p>
           <w:pPr>
             <w:pStyle w:val="NoSpacing"/>
+            <w:rPr>
+              <w:rFonts w:ascii="Calibri" w:hAnsi="Calibri" w:cs="Calibri"/>
+            </w:rPr>
           </w:pPr>
           <w:r>
             <w:rPr>
+              <w:rFonts w:ascii="Calibri" w:hAnsi="Calibri" w:cs="Calibri"/>
               <w:noProof/>
             </w:rPr>
             <mc:AlternateContent>
@@ -3597,6 +3604,7 @@
           </w:r>
           <w:r>
             <w:rPr>
+              <w:rFonts w:ascii="Calibri" w:hAnsi="Calibri" w:cs="Calibri"/>
               <w:noProof/>
             </w:rPr>
             <mc:AlternateContent>
@@ -3898,6 +3906,7 @@
           </w:r>
           <w:r>
             <w:rPr>
+              <w:rFonts w:ascii="Calibri" w:hAnsi="Calibri" w:cs="Calibri"/>
               <w:noProof/>
             </w:rPr>
             <mc:AlternateContent>
@@ -4061,6 +4070,9 @@
             </mc:AlternateContent>
           </w:r>
           <w:r>
+            <w:rPr>
+              <w:rFonts w:ascii="Calibri" w:hAnsi="Calibri" w:cs="Calibri"/>
+            </w:rPr>
             <w:br w:type="page"/>
           </w:r>
         </w:p>
@@ -4070,7 +4082,7 @@
     <w:sdt>
       <w:sdtPr>
         <w:rPr>
-          <w:rFonts w:ascii="Calibri" w:eastAsiaTheme="minorHAnsi" w:hAnsi="Calibri" w:cstheme="minorBidi"/>
+          <w:rFonts w:ascii="Calibri" w:eastAsiaTheme="minorHAnsi" w:hAnsi="Calibri" w:cs="Calibri"/>
           <w:color w:val="auto"/>
           <w:kern w:val="2"/>
           <w:sz w:val="22"/>
@@ -4097,17 +4109,20 @@
           <w:pPr>
             <w:pStyle w:val="TOCHeading"/>
             <w:rPr>
+              <w:rFonts w:ascii="Calibri" w:hAnsi="Calibri" w:cs="Calibri"/>
               <w:color w:val="000000" w:themeColor="text1"/>
             </w:rPr>
           </w:pPr>
           <w:r>
             <w:rPr>
+              <w:rFonts w:ascii="Calibri" w:hAnsi="Calibri" w:cs="Calibri"/>
               <w:color w:val="000000" w:themeColor="text1"/>
             </w:rPr>
             <w:t xml:space="preserve">Table of </w:t>
           </w:r>
           <w:r>
             <w:rPr>
+              <w:rFonts w:ascii="Calibri" w:hAnsi="Calibri" w:cs="Calibri"/>
               <w:color w:val="000000" w:themeColor="text1"/>
             </w:rPr>
             <w:t>Contents</w:t>
@@ -4116,6 +4131,7 @@
         <w:p>
           <w:pPr>
             <w:rPr>
+              <w:rFonts w:cs="Calibri"/>
               <w:lang w:val="en-US"/>
             </w:rPr>
           </w:pPr>
@@ -4127,31 +4143,42 @@
               <w:tab w:val="right" w:leader="dot" w:pos="9016"/>
             </w:tabs>
             <w:rPr>
-              <w:rFonts w:asciiTheme="minorHAnsi" w:eastAsiaTheme="minorEastAsia" w:hAnsiTheme="minorHAnsi"/>
+              <w:rFonts w:eastAsiaTheme="minorEastAsia" w:cs="Calibri"/>
               <w:noProof/>
               <w:sz w:val="24"/>
               <w:lang w:eastAsia="en-ZA"/>
             </w:rPr>
           </w:pPr>
           <w:r>
+            <w:rPr>
+              <w:rFonts w:cs="Calibri"/>
+            </w:rPr>
             <w:fldChar w:fldCharType="begin"/>
           </w:r>
           <w:r>
+            <w:rPr>
+              <w:rFonts w:cs="Calibri"/>
+            </w:rPr>
             <w:instrText xml:space="preserve"> TOC \o "1-3" \h \z \u </w:instrText>
           </w:r>
           <w:r>
+            <w:rPr>
+              <w:rFonts w:cs="Calibri"/>
+            </w:rPr>
             <w:fldChar w:fldCharType="separate"/>
           </w:r>
-          <w:hyperlink w:anchor="_Toc229575872" w:history="1">
+          <w:hyperlink w:anchor="_Toc229578406" w:history="1">
             <w:r>
               <w:rPr>
                 <w:rStyle w:val="Hyperlink"/>
+                <w:rFonts w:cs="Calibri"/>
                 <w:noProof/>
               </w:rPr>
               <w:t>Project Description</w:t>
             </w:r>
             <w:r>
               <w:rPr>
+                <w:rFonts w:cs="Calibri"/>
                 <w:noProof/>
                 <w:webHidden/>
               </w:rPr>
@@ -4159,6 +4186,7 @@
             </w:r>
             <w:r>
               <w:rPr>
+                <w:rFonts w:cs="Calibri"/>
                 <w:noProof/>
                 <w:webHidden/>
               </w:rPr>
@@ -4166,19 +4194,22 @@
             </w:r>
             <w:r>
               <w:rPr>
-                <w:noProof/>
-                <w:webHidden/>
-              </w:rPr>
-              <w:instrText xml:space="preserve"> PAGEREF _Toc229575872 \h </w:instrText>
-            </w:r>
-            <w:r>
-              <w:rPr>
-                <w:noProof/>
-                <w:webHidden/>
-              </w:rPr>
-            </w:r>
-            <w:r>
-              <w:rPr>
+                <w:rFonts w:cs="Calibri"/>
+                <w:noProof/>
+                <w:webHidden/>
+              </w:rPr>
+              <w:instrText xml:space="preserve"> PAGEREF _Toc229578406 \h </w:instrText>
+            </w:r>
+            <w:r>
+              <w:rPr>
+                <w:rFonts w:cs="Calibri"/>
+                <w:noProof/>
+                <w:webHidden/>
+              </w:rPr>
+            </w:r>
+            <w:r>
+              <w:rPr>
+                <w:rFonts w:cs="Calibri"/>
                 <w:noProof/>
                 <w:webHidden/>
               </w:rPr>
@@ -4186,6 +4217,7 @@
             </w:r>
             <w:r>
               <w:rPr>
+                <w:rFonts w:cs="Calibri"/>
                 <w:noProof/>
                 <w:webHidden/>
               </w:rPr>
@@ -4193,6 +4225,7 @@
             </w:r>
             <w:r>
               <w:rPr>
+                <w:rFonts w:cs="Calibri"/>
                 <w:noProof/>
                 <w:webHidden/>
               </w:rPr>
@@ -4207,22 +4240,24 @@
               <w:tab w:val="right" w:leader="dot" w:pos="9016"/>
             </w:tabs>
             <w:rPr>
-              <w:rFonts w:asciiTheme="minorHAnsi" w:eastAsiaTheme="minorEastAsia" w:hAnsiTheme="minorHAnsi"/>
+              <w:rFonts w:eastAsiaTheme="minorEastAsia" w:cs="Calibri"/>
               <w:noProof/>
               <w:sz w:val="24"/>
               <w:lang w:eastAsia="en-ZA"/>
             </w:rPr>
           </w:pPr>
-          <w:hyperlink w:anchor="_Toc229575873" w:history="1">
+          <w:hyperlink w:anchor="_Toc229578407" w:history="1">
             <w:r>
               <w:rPr>
                 <w:rStyle w:val="Hyperlink"/>
+                <w:rFonts w:cs="Calibri"/>
                 <w:noProof/>
               </w:rPr>
               <w:t>Question 1 – GUI Design &amp; Implementation</w:t>
             </w:r>
             <w:r>
               <w:rPr>
+                <w:rFonts w:cs="Calibri"/>
                 <w:noProof/>
                 <w:webHidden/>
               </w:rPr>
@@ -4230,6 +4265,7 @@
             </w:r>
             <w:r>
               <w:rPr>
+                <w:rFonts w:cs="Calibri"/>
                 <w:noProof/>
                 <w:webHidden/>
               </w:rPr>
@@ -4237,19 +4273,22 @@
             </w:r>
             <w:r>
               <w:rPr>
-                <w:noProof/>
-                <w:webHidden/>
-              </w:rPr>
-              <w:instrText xml:space="preserve"> PAGEREF _Toc229575873 \h </w:instrText>
-            </w:r>
-            <w:r>
-              <w:rPr>
-                <w:noProof/>
-                <w:webHidden/>
-              </w:rPr>
-            </w:r>
-            <w:r>
-              <w:rPr>
+                <w:rFonts w:cs="Calibri"/>
+                <w:noProof/>
+                <w:webHidden/>
+              </w:rPr>
+              <w:instrText xml:space="preserve"> PAGEREF _Toc229578407 \h </w:instrText>
+            </w:r>
+            <w:r>
+              <w:rPr>
+                <w:rFonts w:cs="Calibri"/>
+                <w:noProof/>
+                <w:webHidden/>
+              </w:rPr>
+            </w:r>
+            <w:r>
+              <w:rPr>
+                <w:rFonts w:cs="Calibri"/>
                 <w:noProof/>
                 <w:webHidden/>
               </w:rPr>
@@ -4257,6 +4296,7 @@
             </w:r>
             <w:r>
               <w:rPr>
+                <w:rFonts w:cs="Calibri"/>
                 <w:noProof/>
                 <w:webHidden/>
               </w:rPr>
@@ -4264,6 +4304,7 @@
             </w:r>
             <w:r>
               <w:rPr>
+                <w:rFonts w:cs="Calibri"/>
                 <w:noProof/>
                 <w:webHidden/>
               </w:rPr>
@@ -4278,22 +4319,24 @@
               <w:tab w:val="right" w:leader="dot" w:pos="9016"/>
             </w:tabs>
             <w:rPr>
-              <w:rFonts w:asciiTheme="minorHAnsi" w:eastAsiaTheme="minorEastAsia" w:hAnsiTheme="minorHAnsi"/>
+              <w:rFonts w:eastAsiaTheme="minorEastAsia" w:cs="Calibri"/>
               <w:noProof/>
               <w:sz w:val="24"/>
               <w:lang w:eastAsia="en-ZA"/>
             </w:rPr>
           </w:pPr>
-          <w:hyperlink w:anchor="_Toc229575874" w:history="1">
+          <w:hyperlink w:anchor="_Toc229578408" w:history="1">
             <w:r>
               <w:rPr>
                 <w:rStyle w:val="Hyperlink"/>
+                <w:rFonts w:cs="Calibri"/>
                 <w:noProof/>
               </w:rPr>
               <w:t>Screenshots</w:t>
             </w:r>
             <w:r>
               <w:rPr>
+                <w:rFonts w:cs="Calibri"/>
                 <w:noProof/>
                 <w:webHidden/>
               </w:rPr>
@@ -4301,6 +4344,7 @@
             </w:r>
             <w:r>
               <w:rPr>
+                <w:rFonts w:cs="Calibri"/>
                 <w:noProof/>
                 <w:webHidden/>
               </w:rPr>
@@ -4308,19 +4352,22 @@
             </w:r>
             <w:r>
               <w:rPr>
-                <w:noProof/>
-                <w:webHidden/>
-              </w:rPr>
-              <w:instrText xml:space="preserve"> PAGEREF _Toc229575874 \h </w:instrText>
-            </w:r>
-            <w:r>
-              <w:rPr>
-                <w:noProof/>
-                <w:webHidden/>
-              </w:rPr>
-            </w:r>
-            <w:r>
-              <w:rPr>
+                <w:rFonts w:cs="Calibri"/>
+                <w:noProof/>
+                <w:webHidden/>
+              </w:rPr>
+              <w:instrText xml:space="preserve"> PAGEREF _Toc229578408 \h </w:instrText>
+            </w:r>
+            <w:r>
+              <w:rPr>
+                <w:rFonts w:cs="Calibri"/>
+                <w:noProof/>
+                <w:webHidden/>
+              </w:rPr>
+            </w:r>
+            <w:r>
+              <w:rPr>
+                <w:rFonts w:cs="Calibri"/>
                 <w:noProof/>
                 <w:webHidden/>
               </w:rPr>
@@ -4328,6 +4375,7 @@
             </w:r>
             <w:r>
               <w:rPr>
+                <w:rFonts w:cs="Calibri"/>
                 <w:noProof/>
                 <w:webHidden/>
               </w:rPr>
@@ -4335,6 +4383,7 @@
             </w:r>
             <w:r>
               <w:rPr>
+                <w:rFonts w:cs="Calibri"/>
                 <w:noProof/>
                 <w:webHidden/>
               </w:rPr>
@@ -4349,22 +4398,24 @@
               <w:tab w:val="right" w:leader="dot" w:pos="9016"/>
             </w:tabs>
             <w:rPr>
-              <w:rFonts w:asciiTheme="minorHAnsi" w:eastAsiaTheme="minorEastAsia" w:hAnsiTheme="minorHAnsi"/>
+              <w:rFonts w:eastAsiaTheme="minorEastAsia" w:cs="Calibri"/>
               <w:noProof/>
               <w:sz w:val="24"/>
               <w:lang w:eastAsia="en-ZA"/>
             </w:rPr>
           </w:pPr>
-          <w:hyperlink w:anchor="_Toc229575875" w:history="1">
+          <w:hyperlink w:anchor="_Toc229578409" w:history="1">
             <w:r>
               <w:rPr>
                 <w:rStyle w:val="Hyperlink"/>
+                <w:rFonts w:cs="Calibri"/>
                 <w:noProof/>
               </w:rPr>
               <w:t>Question 2 – Keyword Recognition</w:t>
             </w:r>
             <w:r>
               <w:rPr>
+                <w:rFonts w:cs="Calibri"/>
                 <w:noProof/>
                 <w:webHidden/>
               </w:rPr>
@@ -4372,6 +4423,7 @@
             </w:r>
             <w:r>
               <w:rPr>
+                <w:rFonts w:cs="Calibri"/>
                 <w:noProof/>
                 <w:webHidden/>
               </w:rPr>
@@ -4379,19 +4431,22 @@
             </w:r>
             <w:r>
               <w:rPr>
-                <w:noProof/>
-                <w:webHidden/>
-              </w:rPr>
-              <w:instrText xml:space="preserve"> PAGEREF _Toc229575875 \h </w:instrText>
-            </w:r>
-            <w:r>
-              <w:rPr>
-                <w:noProof/>
-                <w:webHidden/>
-              </w:rPr>
-            </w:r>
-            <w:r>
-              <w:rPr>
+                <w:rFonts w:cs="Calibri"/>
+                <w:noProof/>
+                <w:webHidden/>
+              </w:rPr>
+              <w:instrText xml:space="preserve"> PAGEREF _Toc229578409 \h </w:instrText>
+            </w:r>
+            <w:r>
+              <w:rPr>
+                <w:rFonts w:cs="Calibri"/>
+                <w:noProof/>
+                <w:webHidden/>
+              </w:rPr>
+            </w:r>
+            <w:r>
+              <w:rPr>
+                <w:rFonts w:cs="Calibri"/>
                 <w:noProof/>
                 <w:webHidden/>
               </w:rPr>
@@ -4399,6 +4454,7 @@
             </w:r>
             <w:r>
               <w:rPr>
+                <w:rFonts w:cs="Calibri"/>
                 <w:noProof/>
                 <w:webHidden/>
               </w:rPr>
@@ -4406,6 +4462,7 @@
             </w:r>
             <w:r>
               <w:rPr>
+                <w:rFonts w:cs="Calibri"/>
                 <w:noProof/>
                 <w:webHidden/>
               </w:rPr>
@@ -4420,22 +4477,24 @@
               <w:tab w:val="right" w:leader="dot" w:pos="9016"/>
             </w:tabs>
             <w:rPr>
-              <w:rFonts w:asciiTheme="minorHAnsi" w:eastAsiaTheme="minorEastAsia" w:hAnsiTheme="minorHAnsi"/>
+              <w:rFonts w:eastAsiaTheme="minorEastAsia" w:cs="Calibri"/>
               <w:noProof/>
               <w:sz w:val="24"/>
               <w:lang w:eastAsia="en-ZA"/>
             </w:rPr>
           </w:pPr>
-          <w:hyperlink w:anchor="_Toc229575876" w:history="1">
+          <w:hyperlink w:anchor="_Toc229578410" w:history="1">
             <w:r>
               <w:rPr>
                 <w:rStyle w:val="Hyperlink"/>
+                <w:rFonts w:cs="Calibri"/>
                 <w:noProof/>
               </w:rPr>
               <w:t>Screenshots</w:t>
             </w:r>
             <w:r>
               <w:rPr>
+                <w:rFonts w:cs="Calibri"/>
                 <w:noProof/>
                 <w:webHidden/>
               </w:rPr>
@@ -4443,6 +4502,7 @@
             </w:r>
             <w:r>
               <w:rPr>
+                <w:rFonts w:cs="Calibri"/>
                 <w:noProof/>
                 <w:webHidden/>
               </w:rPr>
@@ -4450,19 +4510,22 @@
             </w:r>
             <w:r>
               <w:rPr>
-                <w:noProof/>
-                <w:webHidden/>
-              </w:rPr>
-              <w:instrText xml:space="preserve"> PAGEREF _Toc229575876 \h </w:instrText>
-            </w:r>
-            <w:r>
-              <w:rPr>
-                <w:noProof/>
-                <w:webHidden/>
-              </w:rPr>
-            </w:r>
-            <w:r>
-              <w:rPr>
+                <w:rFonts w:cs="Calibri"/>
+                <w:noProof/>
+                <w:webHidden/>
+              </w:rPr>
+              <w:instrText xml:space="preserve"> PAGEREF _Toc229578410 \h </w:instrText>
+            </w:r>
+            <w:r>
+              <w:rPr>
+                <w:rFonts w:cs="Calibri"/>
+                <w:noProof/>
+                <w:webHidden/>
+              </w:rPr>
+            </w:r>
+            <w:r>
+              <w:rPr>
+                <w:rFonts w:cs="Calibri"/>
                 <w:noProof/>
                 <w:webHidden/>
               </w:rPr>
@@ -4470,6 +4533,7 @@
             </w:r>
             <w:r>
               <w:rPr>
+                <w:rFonts w:cs="Calibri"/>
                 <w:noProof/>
                 <w:webHidden/>
               </w:rPr>
@@ -4477,6 +4541,7 @@
             </w:r>
             <w:r>
               <w:rPr>
+                <w:rFonts w:cs="Calibri"/>
                 <w:noProof/>
                 <w:webHidden/>
               </w:rPr>
@@ -4491,36 +4556,24 @@
               <w:tab w:val="right" w:leader="dot" w:pos="9016"/>
             </w:tabs>
             <w:rPr>
-              <w:rFonts w:asciiTheme="minorHAnsi" w:eastAsiaTheme="minorEastAsia" w:hAnsiTheme="minorHAnsi"/>
+              <w:rFonts w:eastAsiaTheme="minorEastAsia" w:cs="Calibri"/>
               <w:noProof/>
               <w:sz w:val="24"/>
               <w:lang w:eastAsia="en-ZA"/>
             </w:rPr>
           </w:pPr>
-          <w:hyperlink w:anchor="_Toc229575877" w:history="1">
+          <w:hyperlink w:anchor="_Toc229578411" w:history="1">
             <w:r>
               <w:rPr>
                 <w:rStyle w:val="Hyperlink"/>
-                <w:noProof/>
-              </w:rPr>
-              <w:t xml:space="preserve">Question 3 – </w:t>
-            </w:r>
-            <w:r>
-              <w:rPr>
-                <w:rStyle w:val="Hyperlink"/>
-                <w:noProof/>
-              </w:rPr>
-              <w:t>R</w:t>
-            </w:r>
-            <w:r>
-              <w:rPr>
-                <w:rStyle w:val="Hyperlink"/>
-                <w:noProof/>
-              </w:rPr>
-              <w:t>andom Responses</w:t>
-            </w:r>
-            <w:r>
-              <w:rPr>
+                <w:rFonts w:cs="Calibri"/>
+                <w:noProof/>
+              </w:rPr>
+              <w:t>Question 3 – Random Responses</w:t>
+            </w:r>
+            <w:r>
+              <w:rPr>
+                <w:rFonts w:cs="Calibri"/>
                 <w:noProof/>
                 <w:webHidden/>
               </w:rPr>
@@ -4528,6 +4581,7 @@
             </w:r>
             <w:r>
               <w:rPr>
+                <w:rFonts w:cs="Calibri"/>
                 <w:noProof/>
                 <w:webHidden/>
               </w:rPr>
@@ -4535,19 +4589,22 @@
             </w:r>
             <w:r>
               <w:rPr>
-                <w:noProof/>
-                <w:webHidden/>
-              </w:rPr>
-              <w:instrText xml:space="preserve"> PAGEREF _Toc229575877 \h </w:instrText>
-            </w:r>
-            <w:r>
-              <w:rPr>
-                <w:noProof/>
-                <w:webHidden/>
-              </w:rPr>
-            </w:r>
-            <w:r>
-              <w:rPr>
+                <w:rFonts w:cs="Calibri"/>
+                <w:noProof/>
+                <w:webHidden/>
+              </w:rPr>
+              <w:instrText xml:space="preserve"> PAGEREF _Toc229578411 \h </w:instrText>
+            </w:r>
+            <w:r>
+              <w:rPr>
+                <w:rFonts w:cs="Calibri"/>
+                <w:noProof/>
+                <w:webHidden/>
+              </w:rPr>
+            </w:r>
+            <w:r>
+              <w:rPr>
+                <w:rFonts w:cs="Calibri"/>
                 <w:noProof/>
                 <w:webHidden/>
               </w:rPr>
@@ -4555,6 +4612,7 @@
             </w:r>
             <w:r>
               <w:rPr>
+                <w:rFonts w:cs="Calibri"/>
                 <w:noProof/>
                 <w:webHidden/>
               </w:rPr>
@@ -4562,6 +4620,7 @@
             </w:r>
             <w:r>
               <w:rPr>
+                <w:rFonts w:cs="Calibri"/>
                 <w:noProof/>
                 <w:webHidden/>
               </w:rPr>
@@ -4576,22 +4635,24 @@
               <w:tab w:val="right" w:leader="dot" w:pos="9016"/>
             </w:tabs>
             <w:rPr>
-              <w:rFonts w:asciiTheme="minorHAnsi" w:eastAsiaTheme="minorEastAsia" w:hAnsiTheme="minorHAnsi"/>
+              <w:rFonts w:eastAsiaTheme="minorEastAsia" w:cs="Calibri"/>
               <w:noProof/>
               <w:sz w:val="24"/>
               <w:lang w:eastAsia="en-ZA"/>
             </w:rPr>
           </w:pPr>
-          <w:hyperlink w:anchor="_Toc229575878" w:history="1">
+          <w:hyperlink w:anchor="_Toc229578412" w:history="1">
             <w:r>
               <w:rPr>
                 <w:rStyle w:val="Hyperlink"/>
+                <w:rFonts w:cs="Calibri"/>
                 <w:noProof/>
               </w:rPr>
               <w:t>Screenshots</w:t>
             </w:r>
             <w:r>
               <w:rPr>
+                <w:rFonts w:cs="Calibri"/>
                 <w:noProof/>
                 <w:webHidden/>
               </w:rPr>
@@ -4599,6 +4660,7 @@
             </w:r>
             <w:r>
               <w:rPr>
+                <w:rFonts w:cs="Calibri"/>
                 <w:noProof/>
                 <w:webHidden/>
               </w:rPr>
@@ -4606,19 +4668,22 @@
             </w:r>
             <w:r>
               <w:rPr>
-                <w:noProof/>
-                <w:webHidden/>
-              </w:rPr>
-              <w:instrText xml:space="preserve"> PAGEREF _Toc229575878 \h </w:instrText>
-            </w:r>
-            <w:r>
-              <w:rPr>
-                <w:noProof/>
-                <w:webHidden/>
-              </w:rPr>
-            </w:r>
-            <w:r>
-              <w:rPr>
+                <w:rFonts w:cs="Calibri"/>
+                <w:noProof/>
+                <w:webHidden/>
+              </w:rPr>
+              <w:instrText xml:space="preserve"> PAGEREF _Toc229578412 \h </w:instrText>
+            </w:r>
+            <w:r>
+              <w:rPr>
+                <w:rFonts w:cs="Calibri"/>
+                <w:noProof/>
+                <w:webHidden/>
+              </w:rPr>
+            </w:r>
+            <w:r>
+              <w:rPr>
+                <w:rFonts w:cs="Calibri"/>
                 <w:noProof/>
                 <w:webHidden/>
               </w:rPr>
@@ -4626,6 +4691,7 @@
             </w:r>
             <w:r>
               <w:rPr>
+                <w:rFonts w:cs="Calibri"/>
                 <w:noProof/>
                 <w:webHidden/>
               </w:rPr>
@@ -4633,6 +4699,7 @@
             </w:r>
             <w:r>
               <w:rPr>
+                <w:rFonts w:cs="Calibri"/>
                 <w:noProof/>
                 <w:webHidden/>
               </w:rPr>
@@ -4647,22 +4714,24 @@
               <w:tab w:val="right" w:leader="dot" w:pos="9016"/>
             </w:tabs>
             <w:rPr>
-              <w:rFonts w:asciiTheme="minorHAnsi" w:eastAsiaTheme="minorEastAsia" w:hAnsiTheme="minorHAnsi"/>
+              <w:rFonts w:eastAsiaTheme="minorEastAsia" w:cs="Calibri"/>
               <w:noProof/>
               <w:sz w:val="24"/>
               <w:lang w:eastAsia="en-ZA"/>
             </w:rPr>
           </w:pPr>
-          <w:hyperlink w:anchor="_Toc229575879" w:history="1">
+          <w:hyperlink w:anchor="_Toc229578413" w:history="1">
             <w:r>
               <w:rPr>
                 <w:rStyle w:val="Hyperlink"/>
+                <w:rFonts w:cs="Calibri"/>
                 <w:noProof/>
               </w:rPr>
               <w:t>Question 4 – Conversation Flow</w:t>
             </w:r>
             <w:r>
               <w:rPr>
+                <w:rFonts w:cs="Calibri"/>
                 <w:noProof/>
                 <w:webHidden/>
               </w:rPr>
@@ -4670,6 +4739,7 @@
             </w:r>
             <w:r>
               <w:rPr>
+                <w:rFonts w:cs="Calibri"/>
                 <w:noProof/>
                 <w:webHidden/>
               </w:rPr>
@@ -4677,19 +4747,22 @@
             </w:r>
             <w:r>
               <w:rPr>
-                <w:noProof/>
-                <w:webHidden/>
-              </w:rPr>
-              <w:instrText xml:space="preserve"> PAGEREF _Toc229575879 \h </w:instrText>
-            </w:r>
-            <w:r>
-              <w:rPr>
-                <w:noProof/>
-                <w:webHidden/>
-              </w:rPr>
-            </w:r>
-            <w:r>
-              <w:rPr>
+                <w:rFonts w:cs="Calibri"/>
+                <w:noProof/>
+                <w:webHidden/>
+              </w:rPr>
+              <w:instrText xml:space="preserve"> PAGEREF _Toc229578413 \h </w:instrText>
+            </w:r>
+            <w:r>
+              <w:rPr>
+                <w:rFonts w:cs="Calibri"/>
+                <w:noProof/>
+                <w:webHidden/>
+              </w:rPr>
+            </w:r>
+            <w:r>
+              <w:rPr>
+                <w:rFonts w:cs="Calibri"/>
                 <w:noProof/>
                 <w:webHidden/>
               </w:rPr>
@@ -4697,6 +4770,7 @@
             </w:r>
             <w:r>
               <w:rPr>
+                <w:rFonts w:cs="Calibri"/>
                 <w:noProof/>
                 <w:webHidden/>
               </w:rPr>
@@ -4704,6 +4778,7 @@
             </w:r>
             <w:r>
               <w:rPr>
+                <w:rFonts w:cs="Calibri"/>
                 <w:noProof/>
                 <w:webHidden/>
               </w:rPr>
@@ -4718,22 +4793,24 @@
               <w:tab w:val="right" w:leader="dot" w:pos="9016"/>
             </w:tabs>
             <w:rPr>
-              <w:rFonts w:asciiTheme="minorHAnsi" w:eastAsiaTheme="minorEastAsia" w:hAnsiTheme="minorHAnsi"/>
+              <w:rFonts w:eastAsiaTheme="minorEastAsia" w:cs="Calibri"/>
               <w:noProof/>
               <w:sz w:val="24"/>
               <w:lang w:eastAsia="en-ZA"/>
             </w:rPr>
           </w:pPr>
-          <w:hyperlink w:anchor="_Toc229575880" w:history="1">
+          <w:hyperlink w:anchor="_Toc229578414" w:history="1">
             <w:r>
               <w:rPr>
                 <w:rStyle w:val="Hyperlink"/>
+                <w:rFonts w:cs="Calibri"/>
                 <w:noProof/>
               </w:rPr>
               <w:t>Screenshots</w:t>
             </w:r>
             <w:r>
               <w:rPr>
+                <w:rFonts w:cs="Calibri"/>
                 <w:noProof/>
                 <w:webHidden/>
               </w:rPr>
@@ -4741,6 +4818,7 @@
             </w:r>
             <w:r>
               <w:rPr>
+                <w:rFonts w:cs="Calibri"/>
                 <w:noProof/>
                 <w:webHidden/>
               </w:rPr>
@@ -4748,19 +4826,22 @@
             </w:r>
             <w:r>
               <w:rPr>
-                <w:noProof/>
-                <w:webHidden/>
-              </w:rPr>
-              <w:instrText xml:space="preserve"> PAGEREF _Toc229575880 \h </w:instrText>
-            </w:r>
-            <w:r>
-              <w:rPr>
-                <w:noProof/>
-                <w:webHidden/>
-              </w:rPr>
-            </w:r>
-            <w:r>
-              <w:rPr>
+                <w:rFonts w:cs="Calibri"/>
+                <w:noProof/>
+                <w:webHidden/>
+              </w:rPr>
+              <w:instrText xml:space="preserve"> PAGEREF _Toc229578414 \h </w:instrText>
+            </w:r>
+            <w:r>
+              <w:rPr>
+                <w:rFonts w:cs="Calibri"/>
+                <w:noProof/>
+                <w:webHidden/>
+              </w:rPr>
+            </w:r>
+            <w:r>
+              <w:rPr>
+                <w:rFonts w:cs="Calibri"/>
                 <w:noProof/>
                 <w:webHidden/>
               </w:rPr>
@@ -4768,6 +4849,7 @@
             </w:r>
             <w:r>
               <w:rPr>
+                <w:rFonts w:cs="Calibri"/>
                 <w:noProof/>
                 <w:webHidden/>
               </w:rPr>
@@ -4775,6 +4857,7 @@
             </w:r>
             <w:r>
               <w:rPr>
+                <w:rFonts w:cs="Calibri"/>
                 <w:noProof/>
                 <w:webHidden/>
               </w:rPr>
@@ -4789,22 +4872,24 @@
               <w:tab w:val="right" w:leader="dot" w:pos="9016"/>
             </w:tabs>
             <w:rPr>
-              <w:rFonts w:asciiTheme="minorHAnsi" w:eastAsiaTheme="minorEastAsia" w:hAnsiTheme="minorHAnsi"/>
+              <w:rFonts w:eastAsiaTheme="minorEastAsia" w:cs="Calibri"/>
               <w:noProof/>
               <w:sz w:val="24"/>
               <w:lang w:eastAsia="en-ZA"/>
             </w:rPr>
           </w:pPr>
-          <w:hyperlink w:anchor="_Toc229575881" w:history="1">
+          <w:hyperlink w:anchor="_Toc229578415" w:history="1">
             <w:r>
               <w:rPr>
                 <w:rStyle w:val="Hyperlink"/>
+                <w:rFonts w:cs="Calibri"/>
                 <w:noProof/>
               </w:rPr>
               <w:t>Question 5 – Memory &amp; Recall</w:t>
             </w:r>
             <w:r>
               <w:rPr>
+                <w:rFonts w:cs="Calibri"/>
                 <w:noProof/>
                 <w:webHidden/>
               </w:rPr>
@@ -4812,6 +4897,7 @@
             </w:r>
             <w:r>
               <w:rPr>
+                <w:rFonts w:cs="Calibri"/>
                 <w:noProof/>
                 <w:webHidden/>
               </w:rPr>
@@ -4819,19 +4905,22 @@
             </w:r>
             <w:r>
               <w:rPr>
-                <w:noProof/>
-                <w:webHidden/>
-              </w:rPr>
-              <w:instrText xml:space="preserve"> PAGEREF _Toc229575881 \h </w:instrText>
-            </w:r>
-            <w:r>
-              <w:rPr>
-                <w:noProof/>
-                <w:webHidden/>
-              </w:rPr>
-            </w:r>
-            <w:r>
-              <w:rPr>
+                <w:rFonts w:cs="Calibri"/>
+                <w:noProof/>
+                <w:webHidden/>
+              </w:rPr>
+              <w:instrText xml:space="preserve"> PAGEREF _Toc229578415 \h </w:instrText>
+            </w:r>
+            <w:r>
+              <w:rPr>
+                <w:rFonts w:cs="Calibri"/>
+                <w:noProof/>
+                <w:webHidden/>
+              </w:rPr>
+            </w:r>
+            <w:r>
+              <w:rPr>
+                <w:rFonts w:cs="Calibri"/>
                 <w:noProof/>
                 <w:webHidden/>
               </w:rPr>
@@ -4839,13 +4928,15 @@
             </w:r>
             <w:r>
               <w:rPr>
-                <w:noProof/>
-                <w:webHidden/>
-              </w:rPr>
-              <w:t>6</w:t>
-            </w:r>
-            <w:r>
-              <w:rPr>
+                <w:rFonts w:cs="Calibri"/>
+                <w:noProof/>
+                <w:webHidden/>
+              </w:rPr>
+              <w:t>7</w:t>
+            </w:r>
+            <w:r>
+              <w:rPr>
+                <w:rFonts w:cs="Calibri"/>
                 <w:noProof/>
                 <w:webHidden/>
               </w:rPr>
@@ -4860,22 +4951,24 @@
               <w:tab w:val="right" w:leader="dot" w:pos="9016"/>
             </w:tabs>
             <w:rPr>
-              <w:rFonts w:asciiTheme="minorHAnsi" w:eastAsiaTheme="minorEastAsia" w:hAnsiTheme="minorHAnsi"/>
+              <w:rFonts w:eastAsiaTheme="minorEastAsia" w:cs="Calibri"/>
               <w:noProof/>
               <w:sz w:val="24"/>
               <w:lang w:eastAsia="en-ZA"/>
             </w:rPr>
           </w:pPr>
-          <w:hyperlink w:anchor="_Toc229575882" w:history="1">
+          <w:hyperlink w:anchor="_Toc229578416" w:history="1">
             <w:r>
               <w:rPr>
                 <w:rStyle w:val="Hyperlink"/>
+                <w:rFonts w:cs="Calibri"/>
                 <w:noProof/>
               </w:rPr>
               <w:t>Screenshots</w:t>
             </w:r>
             <w:r>
               <w:rPr>
+                <w:rFonts w:cs="Calibri"/>
                 <w:noProof/>
                 <w:webHidden/>
               </w:rPr>
@@ -4883,6 +4976,7 @@
             </w:r>
             <w:r>
               <w:rPr>
+                <w:rFonts w:cs="Calibri"/>
                 <w:noProof/>
                 <w:webHidden/>
               </w:rPr>
@@ -4890,19 +4984,22 @@
             </w:r>
             <w:r>
               <w:rPr>
-                <w:noProof/>
-                <w:webHidden/>
-              </w:rPr>
-              <w:instrText xml:space="preserve"> PAGEREF _Toc229575882 \h </w:instrText>
-            </w:r>
-            <w:r>
-              <w:rPr>
-                <w:noProof/>
-                <w:webHidden/>
-              </w:rPr>
-            </w:r>
-            <w:r>
-              <w:rPr>
+                <w:rFonts w:cs="Calibri"/>
+                <w:noProof/>
+                <w:webHidden/>
+              </w:rPr>
+              <w:instrText xml:space="preserve"> PAGEREF _Toc229578416 \h </w:instrText>
+            </w:r>
+            <w:r>
+              <w:rPr>
+                <w:rFonts w:cs="Calibri"/>
+                <w:noProof/>
+                <w:webHidden/>
+              </w:rPr>
+            </w:r>
+            <w:r>
+              <w:rPr>
+                <w:rFonts w:cs="Calibri"/>
                 <w:noProof/>
                 <w:webHidden/>
               </w:rPr>
@@ -4910,13 +5007,15 @@
             </w:r>
             <w:r>
               <w:rPr>
-                <w:noProof/>
-                <w:webHidden/>
-              </w:rPr>
-              <w:t>6</w:t>
-            </w:r>
-            <w:r>
-              <w:rPr>
+                <w:rFonts w:cs="Calibri"/>
+                <w:noProof/>
+                <w:webHidden/>
+              </w:rPr>
+              <w:t>7</w:t>
+            </w:r>
+            <w:r>
+              <w:rPr>
+                <w:rFonts w:cs="Calibri"/>
                 <w:noProof/>
                 <w:webHidden/>
               </w:rPr>
@@ -4931,22 +5030,24 @@
               <w:tab w:val="right" w:leader="dot" w:pos="9016"/>
             </w:tabs>
             <w:rPr>
-              <w:rFonts w:asciiTheme="minorHAnsi" w:eastAsiaTheme="minorEastAsia" w:hAnsiTheme="minorHAnsi"/>
+              <w:rFonts w:eastAsiaTheme="minorEastAsia" w:cs="Calibri"/>
               <w:noProof/>
               <w:sz w:val="24"/>
               <w:lang w:eastAsia="en-ZA"/>
             </w:rPr>
           </w:pPr>
-          <w:hyperlink w:anchor="_Toc229575883" w:history="1">
+          <w:hyperlink w:anchor="_Toc229578417" w:history="1">
             <w:r>
               <w:rPr>
                 <w:rStyle w:val="Hyperlink"/>
+                <w:rFonts w:cs="Calibri"/>
                 <w:noProof/>
               </w:rPr>
               <w:t>Question 6 – Sentiment Detection</w:t>
             </w:r>
             <w:r>
               <w:rPr>
+                <w:rFonts w:cs="Calibri"/>
                 <w:noProof/>
                 <w:webHidden/>
               </w:rPr>
@@ -4954,6 +5055,7 @@
             </w:r>
             <w:r>
               <w:rPr>
+                <w:rFonts w:cs="Calibri"/>
                 <w:noProof/>
                 <w:webHidden/>
               </w:rPr>
@@ -4961,19 +5063,22 @@
             </w:r>
             <w:r>
               <w:rPr>
-                <w:noProof/>
-                <w:webHidden/>
-              </w:rPr>
-              <w:instrText xml:space="preserve"> PAGEREF _Toc229575883 \h </w:instrText>
-            </w:r>
-            <w:r>
-              <w:rPr>
-                <w:noProof/>
-                <w:webHidden/>
-              </w:rPr>
-            </w:r>
-            <w:r>
-              <w:rPr>
+                <w:rFonts w:cs="Calibri"/>
+                <w:noProof/>
+                <w:webHidden/>
+              </w:rPr>
+              <w:instrText xml:space="preserve"> PAGEREF _Toc229578417 \h </w:instrText>
+            </w:r>
+            <w:r>
+              <w:rPr>
+                <w:rFonts w:cs="Calibri"/>
+                <w:noProof/>
+                <w:webHidden/>
+              </w:rPr>
+            </w:r>
+            <w:r>
+              <w:rPr>
+                <w:rFonts w:cs="Calibri"/>
                 <w:noProof/>
                 <w:webHidden/>
               </w:rPr>
@@ -4981,13 +5086,15 @@
             </w:r>
             <w:r>
               <w:rPr>
-                <w:noProof/>
-                <w:webHidden/>
-              </w:rPr>
-              <w:t>6</w:t>
-            </w:r>
-            <w:r>
-              <w:rPr>
+                <w:rFonts w:cs="Calibri"/>
+                <w:noProof/>
+                <w:webHidden/>
+              </w:rPr>
+              <w:t>8</w:t>
+            </w:r>
+            <w:r>
+              <w:rPr>
+                <w:rFonts w:cs="Calibri"/>
                 <w:noProof/>
                 <w:webHidden/>
               </w:rPr>
@@ -5002,22 +5109,24 @@
               <w:tab w:val="right" w:leader="dot" w:pos="9016"/>
             </w:tabs>
             <w:rPr>
-              <w:rFonts w:asciiTheme="minorHAnsi" w:eastAsiaTheme="minorEastAsia" w:hAnsiTheme="minorHAnsi"/>
+              <w:rFonts w:eastAsiaTheme="minorEastAsia" w:cs="Calibri"/>
               <w:noProof/>
               <w:sz w:val="24"/>
               <w:lang w:eastAsia="en-ZA"/>
             </w:rPr>
           </w:pPr>
-          <w:hyperlink w:anchor="_Toc229575884" w:history="1">
+          <w:hyperlink w:anchor="_Toc229578418" w:history="1">
             <w:r>
               <w:rPr>
                 <w:rStyle w:val="Hyperlink"/>
+                <w:rFonts w:cs="Calibri"/>
                 <w:noProof/>
               </w:rPr>
               <w:t>Screenshots</w:t>
             </w:r>
             <w:r>
               <w:rPr>
+                <w:rFonts w:cs="Calibri"/>
                 <w:noProof/>
                 <w:webHidden/>
               </w:rPr>
@@ -5025,6 +5134,7 @@
             </w:r>
             <w:r>
               <w:rPr>
+                <w:rFonts w:cs="Calibri"/>
                 <w:noProof/>
                 <w:webHidden/>
               </w:rPr>
@@ -5032,19 +5142,22 @@
             </w:r>
             <w:r>
               <w:rPr>
-                <w:noProof/>
-                <w:webHidden/>
-              </w:rPr>
-              <w:instrText xml:space="preserve"> PAGEREF _Toc229575884 \h </w:instrText>
-            </w:r>
-            <w:r>
-              <w:rPr>
-                <w:noProof/>
-                <w:webHidden/>
-              </w:rPr>
-            </w:r>
-            <w:r>
-              <w:rPr>
+                <w:rFonts w:cs="Calibri"/>
+                <w:noProof/>
+                <w:webHidden/>
+              </w:rPr>
+              <w:instrText xml:space="preserve"> PAGEREF _Toc229578418 \h </w:instrText>
+            </w:r>
+            <w:r>
+              <w:rPr>
+                <w:rFonts w:cs="Calibri"/>
+                <w:noProof/>
+                <w:webHidden/>
+              </w:rPr>
+            </w:r>
+            <w:r>
+              <w:rPr>
+                <w:rFonts w:cs="Calibri"/>
                 <w:noProof/>
                 <w:webHidden/>
               </w:rPr>
@@ -5052,13 +5165,15 @@
             </w:r>
             <w:r>
               <w:rPr>
-                <w:noProof/>
-                <w:webHidden/>
-              </w:rPr>
-              <w:t>6</w:t>
-            </w:r>
-            <w:r>
-              <w:rPr>
+                <w:rFonts w:cs="Calibri"/>
+                <w:noProof/>
+                <w:webHidden/>
+              </w:rPr>
+              <w:t>8</w:t>
+            </w:r>
+            <w:r>
+              <w:rPr>
+                <w:rFonts w:cs="Calibri"/>
                 <w:noProof/>
                 <w:webHidden/>
               </w:rPr>
@@ -5073,22 +5188,24 @@
               <w:tab w:val="right" w:leader="dot" w:pos="9016"/>
             </w:tabs>
             <w:rPr>
-              <w:rFonts w:asciiTheme="minorHAnsi" w:eastAsiaTheme="minorEastAsia" w:hAnsiTheme="minorHAnsi"/>
+              <w:rFonts w:eastAsiaTheme="minorEastAsia" w:cs="Calibri"/>
               <w:noProof/>
               <w:sz w:val="24"/>
               <w:lang w:eastAsia="en-ZA"/>
             </w:rPr>
           </w:pPr>
-          <w:hyperlink w:anchor="_Toc229575885" w:history="1">
+          <w:hyperlink w:anchor="_Toc229578419" w:history="1">
             <w:r>
               <w:rPr>
                 <w:rStyle w:val="Hyperlink"/>
+                <w:rFonts w:cs="Calibri"/>
                 <w:noProof/>
               </w:rPr>
               <w:t>Question 7 – Error Handling &amp; Edge Cases</w:t>
             </w:r>
             <w:r>
               <w:rPr>
+                <w:rFonts w:cs="Calibri"/>
                 <w:noProof/>
                 <w:webHidden/>
               </w:rPr>
@@ -5096,6 +5213,7 @@
             </w:r>
             <w:r>
               <w:rPr>
+                <w:rFonts w:cs="Calibri"/>
                 <w:noProof/>
                 <w:webHidden/>
               </w:rPr>
@@ -5103,19 +5221,22 @@
             </w:r>
             <w:r>
               <w:rPr>
-                <w:noProof/>
-                <w:webHidden/>
-              </w:rPr>
-              <w:instrText xml:space="preserve"> PAGEREF _Toc229575885 \h </w:instrText>
-            </w:r>
-            <w:r>
-              <w:rPr>
-                <w:noProof/>
-                <w:webHidden/>
-              </w:rPr>
-            </w:r>
-            <w:r>
-              <w:rPr>
+                <w:rFonts w:cs="Calibri"/>
+                <w:noProof/>
+                <w:webHidden/>
+              </w:rPr>
+              <w:instrText xml:space="preserve"> PAGEREF _Toc229578419 \h </w:instrText>
+            </w:r>
+            <w:r>
+              <w:rPr>
+                <w:rFonts w:cs="Calibri"/>
+                <w:noProof/>
+                <w:webHidden/>
+              </w:rPr>
+            </w:r>
+            <w:r>
+              <w:rPr>
+                <w:rFonts w:cs="Calibri"/>
                 <w:noProof/>
                 <w:webHidden/>
               </w:rPr>
@@ -5123,13 +5244,15 @@
             </w:r>
             <w:r>
               <w:rPr>
-                <w:noProof/>
-                <w:webHidden/>
-              </w:rPr>
-              <w:t>6</w:t>
-            </w:r>
-            <w:r>
-              <w:rPr>
+                <w:rFonts w:cs="Calibri"/>
+                <w:noProof/>
+                <w:webHidden/>
+              </w:rPr>
+              <w:t>9</w:t>
+            </w:r>
+            <w:r>
+              <w:rPr>
+                <w:rFonts w:cs="Calibri"/>
                 <w:noProof/>
                 <w:webHidden/>
               </w:rPr>
@@ -5144,22 +5267,24 @@
               <w:tab w:val="right" w:leader="dot" w:pos="9016"/>
             </w:tabs>
             <w:rPr>
-              <w:rFonts w:asciiTheme="minorHAnsi" w:eastAsiaTheme="minorEastAsia" w:hAnsiTheme="minorHAnsi"/>
+              <w:rFonts w:eastAsiaTheme="minorEastAsia" w:cs="Calibri"/>
               <w:noProof/>
               <w:sz w:val="24"/>
               <w:lang w:eastAsia="en-ZA"/>
             </w:rPr>
           </w:pPr>
-          <w:hyperlink w:anchor="_Toc229575886" w:history="1">
+          <w:hyperlink w:anchor="_Toc229578420" w:history="1">
             <w:r>
               <w:rPr>
                 <w:rStyle w:val="Hyperlink"/>
+                <w:rFonts w:cs="Calibri"/>
                 <w:noProof/>
               </w:rPr>
               <w:t>Screenshots</w:t>
             </w:r>
             <w:r>
               <w:rPr>
+                <w:rFonts w:cs="Calibri"/>
                 <w:noProof/>
                 <w:webHidden/>
               </w:rPr>
@@ -5167,6 +5292,7 @@
             </w:r>
             <w:r>
               <w:rPr>
+                <w:rFonts w:cs="Calibri"/>
                 <w:noProof/>
                 <w:webHidden/>
               </w:rPr>
@@ -5174,19 +5300,22 @@
             </w:r>
             <w:r>
               <w:rPr>
-                <w:noProof/>
-                <w:webHidden/>
-              </w:rPr>
-              <w:instrText xml:space="preserve"> PAGEREF _Toc229575886 \h </w:instrText>
-            </w:r>
-            <w:r>
-              <w:rPr>
-                <w:noProof/>
-                <w:webHidden/>
-              </w:rPr>
-            </w:r>
-            <w:r>
-              <w:rPr>
+                <w:rFonts w:cs="Calibri"/>
+                <w:noProof/>
+                <w:webHidden/>
+              </w:rPr>
+              <w:instrText xml:space="preserve"> PAGEREF _Toc229578420 \h </w:instrText>
+            </w:r>
+            <w:r>
+              <w:rPr>
+                <w:rFonts w:cs="Calibri"/>
+                <w:noProof/>
+                <w:webHidden/>
+              </w:rPr>
+            </w:r>
+            <w:r>
+              <w:rPr>
+                <w:rFonts w:cs="Calibri"/>
                 <w:noProof/>
                 <w:webHidden/>
               </w:rPr>
@@ -5194,13 +5323,15 @@
             </w:r>
             <w:r>
               <w:rPr>
-                <w:noProof/>
-                <w:webHidden/>
-              </w:rPr>
-              <w:t>6</w:t>
-            </w:r>
-            <w:r>
-              <w:rPr>
+                <w:rFonts w:cs="Calibri"/>
+                <w:noProof/>
+                <w:webHidden/>
+              </w:rPr>
+              <w:t>9</w:t>
+            </w:r>
+            <w:r>
+              <w:rPr>
+                <w:rFonts w:cs="Calibri"/>
                 <w:noProof/>
                 <w:webHidden/>
               </w:rPr>
@@ -5215,22 +5346,24 @@
               <w:tab w:val="right" w:leader="dot" w:pos="9016"/>
             </w:tabs>
             <w:rPr>
-              <w:rFonts w:asciiTheme="minorHAnsi" w:eastAsiaTheme="minorEastAsia" w:hAnsiTheme="minorHAnsi"/>
+              <w:rFonts w:eastAsiaTheme="minorEastAsia" w:cs="Calibri"/>
               <w:noProof/>
               <w:sz w:val="24"/>
               <w:lang w:eastAsia="en-ZA"/>
             </w:rPr>
           </w:pPr>
-          <w:hyperlink w:anchor="_Toc229575887" w:history="1">
+          <w:hyperlink w:anchor="_Toc229578421" w:history="1">
             <w:r>
               <w:rPr>
                 <w:rStyle w:val="Hyperlink"/>
+                <w:rFonts w:cs="Calibri"/>
                 <w:noProof/>
               </w:rPr>
               <w:t>Question 8 – Code Optimisation</w:t>
             </w:r>
             <w:r>
               <w:rPr>
+                <w:rFonts w:cs="Calibri"/>
                 <w:noProof/>
                 <w:webHidden/>
               </w:rPr>
@@ -5238,6 +5371,7 @@
             </w:r>
             <w:r>
               <w:rPr>
+                <w:rFonts w:cs="Calibri"/>
                 <w:noProof/>
                 <w:webHidden/>
               </w:rPr>
@@ -5245,19 +5379,22 @@
             </w:r>
             <w:r>
               <w:rPr>
-                <w:noProof/>
-                <w:webHidden/>
-              </w:rPr>
-              <w:instrText xml:space="preserve"> PAGEREF _Toc229575887 \h </w:instrText>
-            </w:r>
-            <w:r>
-              <w:rPr>
-                <w:noProof/>
-                <w:webHidden/>
-              </w:rPr>
-            </w:r>
-            <w:r>
-              <w:rPr>
+                <w:rFonts w:cs="Calibri"/>
+                <w:noProof/>
+                <w:webHidden/>
+              </w:rPr>
+              <w:instrText xml:space="preserve"> PAGEREF _Toc229578421 \h </w:instrText>
+            </w:r>
+            <w:r>
+              <w:rPr>
+                <w:rFonts w:cs="Calibri"/>
+                <w:noProof/>
+                <w:webHidden/>
+              </w:rPr>
+            </w:r>
+            <w:r>
+              <w:rPr>
+                <w:rFonts w:cs="Calibri"/>
                 <w:noProof/>
                 <w:webHidden/>
               </w:rPr>
@@ -5265,13 +5402,15 @@
             </w:r>
             <w:r>
               <w:rPr>
-                <w:noProof/>
-                <w:webHidden/>
-              </w:rPr>
-              <w:t>6</w:t>
-            </w:r>
-            <w:r>
-              <w:rPr>
+                <w:rFonts w:cs="Calibri"/>
+                <w:noProof/>
+                <w:webHidden/>
+              </w:rPr>
+              <w:t>10</w:t>
+            </w:r>
+            <w:r>
+              <w:rPr>
+                <w:rFonts w:cs="Calibri"/>
                 <w:noProof/>
                 <w:webHidden/>
               </w:rPr>
@@ -5286,22 +5425,103 @@
               <w:tab w:val="right" w:leader="dot" w:pos="9016"/>
             </w:tabs>
             <w:rPr>
-              <w:rFonts w:asciiTheme="minorHAnsi" w:eastAsiaTheme="minorEastAsia" w:hAnsiTheme="minorHAnsi"/>
+              <w:rFonts w:eastAsiaTheme="minorEastAsia" w:cs="Calibri"/>
               <w:noProof/>
               <w:sz w:val="24"/>
               <w:lang w:eastAsia="en-ZA"/>
             </w:rPr>
           </w:pPr>
-          <w:hyperlink w:anchor="_Toc229575888" w:history="1">
+          <w:hyperlink w:anchor="_Toc229578422" w:history="1">
             <w:r>
               <w:rPr>
                 <w:rStyle w:val="Hyperlink"/>
+                <w:rFonts w:cs="Calibri"/>
+                <w:noProof/>
+              </w:rPr>
+              <w:t>1. Dictionary for Keyword Categories</w:t>
+            </w:r>
+            <w:r>
+              <w:rPr>
+                <w:rFonts w:cs="Calibri"/>
+                <w:noProof/>
+                <w:webHidden/>
+              </w:rPr>
+              <w:tab/>
+            </w:r>
+            <w:r>
+              <w:rPr>
+                <w:rFonts w:cs="Calibri"/>
+                <w:noProof/>
+                <w:webHidden/>
+              </w:rPr>
+              <w:fldChar w:fldCharType="begin"/>
+            </w:r>
+            <w:r>
+              <w:rPr>
+                <w:rFonts w:cs="Calibri"/>
+                <w:noProof/>
+                <w:webHidden/>
+              </w:rPr>
+              <w:instrText xml:space="preserve"> PAGEREF _Toc229578422 \h </w:instrText>
+            </w:r>
+            <w:r>
+              <w:rPr>
+                <w:rFonts w:cs="Calibri"/>
+                <w:noProof/>
+                <w:webHidden/>
+              </w:rPr>
+            </w:r>
+            <w:r>
+              <w:rPr>
+                <w:rFonts w:cs="Calibri"/>
+                <w:noProof/>
+                <w:webHidden/>
+              </w:rPr>
+              <w:fldChar w:fldCharType="separate"/>
+            </w:r>
+            <w:r>
+              <w:rPr>
+                <w:rFonts w:cs="Calibri"/>
+                <w:noProof/>
+                <w:webHidden/>
+              </w:rPr>
+              <w:t>10</w:t>
+            </w:r>
+            <w:r>
+              <w:rPr>
+                <w:rFonts w:cs="Calibri"/>
+                <w:noProof/>
+                <w:webHidden/>
+              </w:rPr>
+              <w:fldChar w:fldCharType="end"/>
+            </w:r>
+          </w:hyperlink>
+        </w:p>
+        <w:p>
+          <w:pPr>
+            <w:pStyle w:val="TOC3"/>
+            <w:tabs>
+              <w:tab w:val="right" w:leader="dot" w:pos="9016"/>
+            </w:tabs>
+            <w:rPr>
+              <w:rFonts w:eastAsiaTheme="minorEastAsia" w:cs="Calibri"/>
+              <w:noProof/>
+              <w:sz w:val="24"/>
+              <w:lang w:eastAsia="en-ZA"/>
+            </w:rPr>
+          </w:pPr>
+          <w:hyperlink w:anchor="_Toc229578423" w:history="1">
+            <w:r>
+              <w:rPr>
+                <w:rStyle w:val="Hyperlink"/>
+                <w:rFonts w:cs="Calibri"/>
                 <w:noProof/>
               </w:rPr>
               <w:t>Screenshots</w:t>
             </w:r>
             <w:r>
               <w:rPr>
+                <w:rFonts w:cs="Calibri"/>
                 <w:noProof/>
                 <w:webHidden/>
               </w:rPr>
@@ -5309,6 +5529,7 @@
             </w:r>
             <w:r>
               <w:rPr>
+                <w:rFonts w:cs="Calibri"/>
                 <w:noProof/>
                 <w:webHidden/>
               </w:rPr>
@@ -5316,19 +5537,22 @@
             </w:r>
             <w:r>
               <w:rPr>
-                <w:noProof/>
-                <w:webHidden/>
-              </w:rPr>
-              <w:instrText xml:space="preserve"> PAGEREF _Toc229575888 \h </w:instrText>
-            </w:r>
-            <w:r>
-              <w:rPr>
-                <w:noProof/>
-                <w:webHidden/>
-              </w:rPr>
-            </w:r>
-            <w:r>
-              <w:rPr>
+                <w:rFonts w:cs="Calibri"/>
+                <w:noProof/>
+                <w:webHidden/>
+              </w:rPr>
+              <w:instrText xml:space="preserve"> PAGEREF _Toc229578423 \h </w:instrText>
+            </w:r>
+            <w:r>
+              <w:rPr>
+                <w:rFonts w:cs="Calibri"/>
+                <w:noProof/>
+                <w:webHidden/>
+              </w:rPr>
+            </w:r>
+            <w:r>
+              <w:rPr>
+                <w:rFonts w:cs="Calibri"/>
                 <w:noProof/>
                 <w:webHidden/>
               </w:rPr>
@@ -5336,13 +5560,331 @@
             </w:r>
             <w:r>
               <w:rPr>
-                <w:noProof/>
-                <w:webHidden/>
-              </w:rPr>
-              <w:t>6</w:t>
-            </w:r>
-            <w:r>
-              <w:rPr>
+                <w:rFonts w:cs="Calibri"/>
+                <w:noProof/>
+                <w:webHidden/>
+              </w:rPr>
+              <w:t>10</w:t>
+            </w:r>
+            <w:r>
+              <w:rPr>
+                <w:rFonts w:cs="Calibri"/>
+                <w:noProof/>
+                <w:webHidden/>
+              </w:rPr>
+              <w:fldChar w:fldCharType="end"/>
+            </w:r>
+          </w:hyperlink>
+        </w:p>
+        <w:p>
+          <w:pPr>
+            <w:pStyle w:val="TOC2"/>
+            <w:tabs>
+              <w:tab w:val="right" w:leader="dot" w:pos="9016"/>
+            </w:tabs>
+            <w:rPr>
+              <w:rFonts w:eastAsiaTheme="minorEastAsia" w:cs="Calibri"/>
+              <w:noProof/>
+              <w:sz w:val="24"/>
+              <w:lang w:eastAsia="en-ZA"/>
+            </w:rPr>
+          </w:pPr>
+          <w:hyperlink w:anchor="_Toc229578424" w:history="1">
+            <w:r>
+              <w:rPr>
+                <w:rStyle w:val="Hyperlink"/>
+                <w:rFonts w:cs="Calibri"/>
+                <w:noProof/>
+              </w:rPr>
+              <w:t>2. Lists/Arrays for Random Responses</w:t>
+            </w:r>
+            <w:r>
+              <w:rPr>
+                <w:rFonts w:cs="Calibri"/>
+                <w:noProof/>
+                <w:webHidden/>
+              </w:rPr>
+              <w:tab/>
+            </w:r>
+            <w:r>
+              <w:rPr>
+                <w:rFonts w:cs="Calibri"/>
+                <w:noProof/>
+                <w:webHidden/>
+              </w:rPr>
+              <w:fldChar w:fldCharType="begin"/>
+            </w:r>
+            <w:r>
+              <w:rPr>
+                <w:rFonts w:cs="Calibri"/>
+                <w:noProof/>
+                <w:webHidden/>
+              </w:rPr>
+              <w:instrText xml:space="preserve"> PAGEREF _Toc229578424 \h </w:instrText>
+            </w:r>
+            <w:r>
+              <w:rPr>
+                <w:rFonts w:cs="Calibri"/>
+                <w:noProof/>
+                <w:webHidden/>
+              </w:rPr>
+            </w:r>
+            <w:r>
+              <w:rPr>
+                <w:rFonts w:cs="Calibri"/>
+                <w:noProof/>
+                <w:webHidden/>
+              </w:rPr>
+              <w:fldChar w:fldCharType="separate"/>
+            </w:r>
+            <w:r>
+              <w:rPr>
+                <w:rFonts w:cs="Calibri"/>
+                <w:noProof/>
+                <w:webHidden/>
+              </w:rPr>
+              <w:t>10</w:t>
+            </w:r>
+            <w:r>
+              <w:rPr>
+                <w:rFonts w:cs="Calibri"/>
+                <w:noProof/>
+                <w:webHidden/>
+              </w:rPr>
+              <w:fldChar w:fldCharType="end"/>
+            </w:r>
+          </w:hyperlink>
+        </w:p>
+        <w:p>
+          <w:pPr>
+            <w:pStyle w:val="TOC3"/>
+            <w:tabs>
+              <w:tab w:val="right" w:leader="dot" w:pos="9016"/>
+            </w:tabs>
+            <w:rPr>
+              <w:rFonts w:eastAsiaTheme="minorEastAsia" w:cs="Calibri"/>
+              <w:noProof/>
+              <w:sz w:val="24"/>
+              <w:lang w:eastAsia="en-ZA"/>
+            </w:rPr>
+          </w:pPr>
+          <w:hyperlink w:anchor="_Toc229578425" w:history="1">
+            <w:r>
+              <w:rPr>
+                <w:rStyle w:val="Hyperlink"/>
+                <w:rFonts w:cs="Calibri"/>
+                <w:noProof/>
+              </w:rPr>
+              <w:t>Screenshots</w:t>
+            </w:r>
+            <w:r>
+              <w:rPr>
+                <w:rFonts w:cs="Calibri"/>
+                <w:noProof/>
+                <w:webHidden/>
+              </w:rPr>
+              <w:tab/>
+            </w:r>
+            <w:r>
+              <w:rPr>
+                <w:rFonts w:cs="Calibri"/>
+                <w:noProof/>
+                <w:webHidden/>
+              </w:rPr>
+              <w:fldChar w:fldCharType="begin"/>
+            </w:r>
+            <w:r>
+              <w:rPr>
+                <w:rFonts w:cs="Calibri"/>
+                <w:noProof/>
+                <w:webHidden/>
+              </w:rPr>
+              <w:instrText xml:space="preserve"> PAGEREF _Toc229578425 \h </w:instrText>
+            </w:r>
+            <w:r>
+              <w:rPr>
+                <w:rFonts w:cs="Calibri"/>
+                <w:noProof/>
+                <w:webHidden/>
+              </w:rPr>
+            </w:r>
+            <w:r>
+              <w:rPr>
+                <w:rFonts w:cs="Calibri"/>
+                <w:noProof/>
+                <w:webHidden/>
+              </w:rPr>
+              <w:fldChar w:fldCharType="separate"/>
+            </w:r>
+            <w:r>
+              <w:rPr>
+                <w:rFonts w:cs="Calibri"/>
+                <w:noProof/>
+                <w:webHidden/>
+              </w:rPr>
+              <w:t>10</w:t>
+            </w:r>
+            <w:r>
+              <w:rPr>
+                <w:rFonts w:cs="Calibri"/>
+                <w:noProof/>
+                <w:webHidden/>
+              </w:rPr>
+              <w:fldChar w:fldCharType="end"/>
+            </w:r>
+          </w:hyperlink>
+        </w:p>
+        <w:p>
+          <w:pPr>
+            <w:pStyle w:val="TOC3"/>
+            <w:tabs>
+              <w:tab w:val="right" w:leader="dot" w:pos="9016"/>
+            </w:tabs>
+            <w:rPr>
+              <w:rFonts w:eastAsiaTheme="minorEastAsia" w:cs="Calibri"/>
+              <w:noProof/>
+              <w:sz w:val="24"/>
+              <w:lang w:eastAsia="en-ZA"/>
+            </w:rPr>
+          </w:pPr>
+          <w:hyperlink w:anchor="_Toc229578426" w:history="1">
+            <w:r>
+              <w:rPr>
+                <w:rStyle w:val="Hyperlink"/>
+                <w:rFonts w:cs="Calibri"/>
+                <w:noProof/>
+              </w:rPr>
+              <w:t>Screenshots</w:t>
+            </w:r>
+            <w:r>
+              <w:rPr>
+                <w:rFonts w:cs="Calibri"/>
+                <w:noProof/>
+                <w:webHidden/>
+              </w:rPr>
+              <w:tab/>
+            </w:r>
+            <w:r>
+              <w:rPr>
+                <w:rFonts w:cs="Calibri"/>
+                <w:noProof/>
+                <w:webHidden/>
+              </w:rPr>
+              <w:fldChar w:fldCharType="begin"/>
+            </w:r>
+            <w:r>
+              <w:rPr>
+                <w:rFonts w:cs="Calibri"/>
+                <w:noProof/>
+                <w:webHidden/>
+              </w:rPr>
+              <w:instrText xml:space="preserve"> PAGEREF _Toc229578426 \h </w:instrText>
+            </w:r>
+            <w:r>
+              <w:rPr>
+                <w:rFonts w:cs="Calibri"/>
+                <w:noProof/>
+                <w:webHidden/>
+              </w:rPr>
+            </w:r>
+            <w:r>
+              <w:rPr>
+                <w:rFonts w:cs="Calibri"/>
+                <w:noProof/>
+                <w:webHidden/>
+              </w:rPr>
+              <w:fldChar w:fldCharType="separate"/>
+            </w:r>
+            <w:r>
+              <w:rPr>
+                <w:rFonts w:cs="Calibri"/>
+                <w:noProof/>
+                <w:webHidden/>
+              </w:rPr>
+              <w:t>11</w:t>
+            </w:r>
+            <w:r>
+              <w:rPr>
+                <w:rFonts w:cs="Calibri"/>
+                <w:noProof/>
+                <w:webHidden/>
+              </w:rPr>
+              <w:fldChar w:fldCharType="end"/>
+            </w:r>
+          </w:hyperlink>
+        </w:p>
+        <w:p>
+          <w:pPr>
+            <w:pStyle w:val="TOC3"/>
+            <w:tabs>
+              <w:tab w:val="right" w:leader="dot" w:pos="9016"/>
+            </w:tabs>
+            <w:rPr>
+              <w:rFonts w:eastAsiaTheme="minorEastAsia" w:cs="Calibri"/>
+              <w:noProof/>
+              <w:sz w:val="24"/>
+              <w:lang w:eastAsia="en-ZA"/>
+            </w:rPr>
+          </w:pPr>
+          <w:hyperlink w:anchor="_Toc229578427" w:history="1">
+            <w:r>
+              <w:rPr>
+                <w:rStyle w:val="Hyperlink"/>
+                <w:rFonts w:cs="Calibri"/>
+                <w:noProof/>
+              </w:rPr>
+              <w:t>Screenshots</w:t>
+            </w:r>
+            <w:r>
+              <w:rPr>
+                <w:rFonts w:cs="Calibri"/>
+                <w:noProof/>
+                <w:webHidden/>
+              </w:rPr>
+              <w:tab/>
+            </w:r>
+            <w:r>
+              <w:rPr>
+                <w:rFonts w:cs="Calibri"/>
+                <w:noProof/>
+                <w:webHidden/>
+              </w:rPr>
+              <w:fldChar w:fldCharType="begin"/>
+            </w:r>
+            <w:r>
+              <w:rPr>
+                <w:rFonts w:cs="Calibri"/>
+                <w:noProof/>
+                <w:webHidden/>
+              </w:rPr>
+              <w:instrText xml:space="preserve"> PAGEREF _Toc229578427 \h </w:instrText>
+            </w:r>
+            <w:r>
+              <w:rPr>
+                <w:rFonts w:cs="Calibri"/>
+                <w:noProof/>
+                <w:webHidden/>
+              </w:rPr>
+            </w:r>
+            <w:r>
+              <w:rPr>
+                <w:rFonts w:cs="Calibri"/>
+                <w:noProof/>
+                <w:webHidden/>
+              </w:rPr>
+              <w:fldChar w:fldCharType="separate"/>
+            </w:r>
+            <w:r>
+              <w:rPr>
+                <w:rFonts w:cs="Calibri"/>
+                <w:noProof/>
+                <w:webHidden/>
+              </w:rPr>
+              <w:t>11</w:t>
+            </w:r>
+            <w:r>
+              <w:rPr>
+                <w:rFonts w:cs="Calibri"/>
                 <w:noProof/>
                 <w:webHidden/>
               </w:rPr>
@@ -5357,22 +5899,24 @@
               <w:tab w:val="right" w:leader="dot" w:pos="9016"/>
             </w:tabs>
             <w:rPr>
-              <w:rFonts w:asciiTheme="minorHAnsi" w:eastAsiaTheme="minorEastAsia" w:hAnsiTheme="minorHAnsi"/>
+              <w:rFonts w:eastAsiaTheme="minorEastAsia" w:cs="Calibri"/>
               <w:noProof/>
               <w:sz w:val="24"/>
               <w:lang w:eastAsia="en-ZA"/>
             </w:rPr>
           </w:pPr>
-          <w:hyperlink w:anchor="_Toc229575889" w:history="1">
+          <w:hyperlink w:anchor="_Toc229578428" w:history="1">
             <w:r>
               <w:rPr>
                 <w:rStyle w:val="Hyperlink"/>
+                <w:rFonts w:cs="Calibri"/>
                 <w:noProof/>
               </w:rPr>
               <w:t>References</w:t>
             </w:r>
             <w:r>
               <w:rPr>
+                <w:rFonts w:cs="Calibri"/>
                 <w:noProof/>
                 <w:webHidden/>
               </w:rPr>
@@ -5380,6 +5924,7 @@
             </w:r>
             <w:r>
               <w:rPr>
+                <w:rFonts w:cs="Calibri"/>
                 <w:noProof/>
                 <w:webHidden/>
               </w:rPr>
@@ -5387,19 +5932,22 @@
             </w:r>
             <w:r>
               <w:rPr>
-                <w:noProof/>
-                <w:webHidden/>
-              </w:rPr>
-              <w:instrText xml:space="preserve"> PAGEREF _Toc229575889 \h </w:instrText>
-            </w:r>
-            <w:r>
-              <w:rPr>
-                <w:noProof/>
-                <w:webHidden/>
-              </w:rPr>
-            </w:r>
-            <w:r>
-              <w:rPr>
+                <w:rFonts w:cs="Calibri"/>
+                <w:noProof/>
+                <w:webHidden/>
+              </w:rPr>
+              <w:instrText xml:space="preserve"> PAGEREF _Toc229578428 \h </w:instrText>
+            </w:r>
+            <w:r>
+              <w:rPr>
+                <w:rFonts w:cs="Calibri"/>
+                <w:noProof/>
+                <w:webHidden/>
+              </w:rPr>
+            </w:r>
+            <w:r>
+              <w:rPr>
+                <w:rFonts w:cs="Calibri"/>
                 <w:noProof/>
                 <w:webHidden/>
               </w:rPr>
@@ -5407,13 +5955,15 @@
             </w:r>
             <w:r>
               <w:rPr>
-                <w:noProof/>
-                <w:webHidden/>
-              </w:rPr>
-              <w:t>6</w:t>
-            </w:r>
-            <w:r>
-              <w:rPr>
+                <w:rFonts w:cs="Calibri"/>
+                <w:noProof/>
+                <w:webHidden/>
+              </w:rPr>
+              <w:t>12</w:t>
+            </w:r>
+            <w:r>
+              <w:rPr>
+                <w:rFonts w:cs="Calibri"/>
                 <w:noProof/>
                 <w:webHidden/>
               </w:rPr>
@@ -5422,8 +5972,14 @@
           </w:hyperlink>
         </w:p>
         <w:p>
+          <w:pPr>
+            <w:rPr>
+              <w:rFonts w:cs="Calibri"/>
+            </w:rPr>
+          </w:pPr>
           <w:r>
             <w:rPr>
+              <w:rFonts w:cs="Calibri"/>
               <w:b/>
               <w:bCs/>
               <w:noProof/>
@@ -5449,9 +6005,15 @@
     <w:p>
       <w:pPr>
         <w:pStyle w:val="Heading1"/>
-      </w:pPr>
-      <w:bookmarkStart w:id="1" w:name="_Toc229575872"/>
-      <w:r>
+        <w:rPr>
+          <w:rFonts w:cs="Calibri"/>
+        </w:rPr>
+      </w:pPr>
+      <w:bookmarkStart w:id="1" w:name="_Toc229578406"/>
+      <w:r>
+        <w:rPr>
+          <w:rFonts w:cs="Calibri"/>
+        </w:rPr>
         <w:lastRenderedPageBreak/>
         <w:t>Project Description</w:t>
       </w:r>
@@ -5459,60 +6021,31 @@
       <w:bookmarkEnd w:id="1"/>
     </w:p>
     <w:p>
-      <w:r>
-        <w:rPr>
-          <w:rFonts w:cs="Calibri"/>
-        </w:rPr>
-        <w:t>GitHub Repo Link</w:t>
-      </w:r>
-      <w:r>
-        <w:rPr>
-          <w:rFonts w:cs="Calibri"/>
-        </w:rPr>
-        <w:t xml:space="preserve"> (Main)</w:t>
-      </w:r>
-      <w:r>
-        <w:rPr>
-          <w:rFonts w:cs="Calibri"/>
-        </w:rPr>
-        <w:t>:</w:t>
-      </w:r>
-      <w:r>
-        <w:rPr>
-          <w:rFonts w:cs="Calibri"/>
-        </w:rPr>
-        <w:t xml:space="preserve"> </w:t>
+      <w:pPr>
+        <w:rPr>
+          <w:rFonts w:cs="Calibri"/>
+        </w:rPr>
+      </w:pPr>
+      <w:r>
+        <w:rPr>
+          <w:rFonts w:cs="Calibri"/>
+        </w:rPr>
+        <w:t xml:space="preserve">GitHub Repo Link (Main): </w:t>
       </w:r>
     </w:p>
     <w:p>
       <w:pPr>
         <w:rPr>
+          <w:rFonts w:cs="Calibri"/>
           <w:color w:val="EE0000"/>
         </w:rPr>
       </w:pPr>
       <w:r>
         <w:rPr>
+          <w:rFonts w:cs="Calibri"/>
           <w:color w:val="EE0000"/>
         </w:rPr>
-        <w:t xml:space="preserve">Commits &amp; Completed project were </w:t>
-      </w:r>
-      <w:r>
-        <w:rPr>
-          <w:color w:val="EE0000"/>
-        </w:rPr>
-        <w:t>submitted</w:t>
-      </w:r>
-      <w:r>
-        <w:rPr>
-          <w:color w:val="EE0000"/>
-        </w:rPr>
-        <w:t xml:space="preserve"> to my own repo before the link below was provided by the </w:t>
-      </w:r>
-      <w:r>
-        <w:rPr>
-          <w:color w:val="EE0000"/>
-        </w:rPr>
-        <w:t>organisation</w:t>
+        <w:t>Commits &amp; Completed project were submitted to my own repo before the link below was provided by the organisation</w:t>
       </w:r>
     </w:p>
     <w:p>
@@ -5525,13 +6058,7 @@
         <w:rPr>
           <w:rFonts w:cs="Calibri"/>
         </w:rPr>
-        <w:t>GitHub Repo Link</w:t>
-      </w:r>
-      <w:r>
-        <w:rPr>
-          <w:rFonts w:cs="Calibri"/>
-        </w:rPr>
-        <w:t xml:space="preserve"> (Organi</w:t>
+        <w:t>GitHub Repo Link (Organi</w:t>
       </w:r>
       <w:r>
         <w:rPr>
@@ -5562,19 +6089,7 @@
         <w:rPr>
           <w:rFonts w:cs="Calibri"/>
         </w:rPr>
-        <w:t>YouTube Video</w:t>
-      </w:r>
-      <w:r>
-        <w:rPr>
-          <w:rFonts w:cs="Calibri"/>
-        </w:rPr>
-        <w:t xml:space="preserve"> Link:</w:t>
-      </w:r>
-      <w:r>
-        <w:rPr>
-          <w:rFonts w:cs="Calibri"/>
-        </w:rPr>
-        <w:t xml:space="preserve"> </w:t>
+        <w:t xml:space="preserve">YouTube Video Link: </w:t>
       </w:r>
     </w:p>
     <w:p>
@@ -5593,13 +6108,22 @@
     <w:p>
       <w:pPr>
         <w:pStyle w:val="Heading1"/>
-      </w:pPr>
-      <w:bookmarkStart w:id="2" w:name="_Toc229575873"/>
-      <w:r>
+        <w:rPr>
+          <w:rFonts w:cs="Calibri"/>
+        </w:rPr>
+      </w:pPr>
+      <w:bookmarkStart w:id="2" w:name="_Toc229578407"/>
+      <w:r>
+        <w:rPr>
+          <w:rFonts w:cs="Calibri"/>
+        </w:rPr>
         <w:lastRenderedPageBreak/>
         <w:t>Question 1</w:t>
       </w:r>
       <w:r>
+        <w:rPr>
+          <w:rFonts w:cs="Calibri"/>
+        </w:rPr>
         <w:t xml:space="preserve"> – GUI Design &amp; Implementation</w:t>
       </w:r>
       <w:bookmarkEnd w:id="2"/>
@@ -5607,17 +6131,23 @@
     <w:p>
       <w:pPr>
         <w:pStyle w:val="Heading2"/>
-      </w:pPr>
-      <w:bookmarkStart w:id="3" w:name="_Toc229575874"/>
-      <w:r>
-        <w:t>Screenshots</w:t>
+        <w:rPr>
+          <w:rFonts w:cs="Calibri"/>
+        </w:rPr>
+      </w:pPr>
+      <w:bookmarkStart w:id="3" w:name="_Toc229578408"/>
+      <w:r>
+        <w:rPr>
+          <w:rFonts w:cs="Calibri"/>
+        </w:rPr>
+        <w:t>Screenshot</w:t>
       </w:r>
       <w:bookmarkEnd w:id="3"/>
     </w:p>
     <w:p>
       <w:pPr>
         <w:rPr>
-          <w:rFonts w:eastAsiaTheme="majorEastAsia" w:cstheme="majorBidi"/>
+          <w:rFonts w:eastAsiaTheme="majorEastAsia" w:cs="Calibri"/>
           <w:color w:val="000000" w:themeColor="text1"/>
           <w:sz w:val="28"/>
           <w:szCs w:val="40"/>
@@ -5626,6 +6156,7 @@
       </w:pPr>
       <w:r>
         <w:rPr>
+          <w:rFonts w:cs="Calibri"/>
           <w:noProof/>
         </w:rPr>
         <w:drawing>
@@ -5671,63 +6202,100 @@
         </w:drawing>
       </w:r>
       <w:r>
+        <w:rPr>
+          <w:rFonts w:cs="Calibri"/>
+        </w:rPr>
         <w:br w:type="page"/>
       </w:r>
     </w:p>
     <w:p>
       <w:pPr>
         <w:pStyle w:val="Heading1"/>
-      </w:pPr>
-      <w:bookmarkStart w:id="4" w:name="_Toc229575875"/>
-      <w:r>
+        <w:rPr>
+          <w:rFonts w:cs="Calibri"/>
+        </w:rPr>
+      </w:pPr>
+      <w:bookmarkStart w:id="4" w:name="_Toc229578409"/>
+      <w:r>
+        <w:rPr>
+          <w:rFonts w:cs="Calibri"/>
+        </w:rPr>
         <w:lastRenderedPageBreak/>
         <w:t xml:space="preserve">Question </w:t>
       </w:r>
       <w:r>
+        <w:rPr>
+          <w:rFonts w:cs="Calibri"/>
+        </w:rPr>
         <w:t>2</w:t>
       </w:r>
       <w:r>
+        <w:rPr>
+          <w:rFonts w:cs="Calibri"/>
+        </w:rPr>
         <w:t xml:space="preserve"> – Keyword Recognition</w:t>
       </w:r>
       <w:bookmarkEnd w:id="4"/>
     </w:p>
     <w:p>
-      <w:r>
-        <w:rPr>
+      <w:pPr>
+        <w:rPr>
+          <w:rFonts w:cs="Calibri"/>
+        </w:rPr>
+      </w:pPr>
+      <w:r>
+        <w:rPr>
+          <w:rFonts w:cs="Calibri"/>
           <w:bCs/>
         </w:rPr>
         <w:t>User:</w:t>
       </w:r>
       <w:r>
+        <w:rPr>
+          <w:rFonts w:cs="Calibri"/>
+        </w:rPr>
         <w:t> "Tell me about password safety"</w:t>
       </w:r>
       <w:r>
+        <w:rPr>
+          <w:rFonts w:cs="Calibri"/>
+        </w:rPr>
         <w:br/>
       </w:r>
       <w:r>
         <w:rPr>
+          <w:rFonts w:cs="Calibri"/>
           <w:bCs/>
         </w:rPr>
         <w:t>Bot:</w:t>
       </w:r>
       <w:r>
+        <w:rPr>
+          <w:rFonts w:cs="Calibri"/>
+        </w:rPr>
         <w:t> Returns detailed password tips with bullet points</w:t>
       </w:r>
     </w:p>
     <w:p>
       <w:pPr>
         <w:pStyle w:val="Heading2"/>
-      </w:pPr>
-      <w:bookmarkStart w:id="5" w:name="_Toc229575876"/>
-      <w:r>
-        <w:t>Screenshots</w:t>
+        <w:rPr>
+          <w:rFonts w:cs="Calibri"/>
+        </w:rPr>
+      </w:pPr>
+      <w:bookmarkStart w:id="5" w:name="_Toc229578410"/>
+      <w:r>
+        <w:rPr>
+          <w:rFonts w:cs="Calibri"/>
+        </w:rPr>
+        <w:t>Screenshot</w:t>
       </w:r>
       <w:bookmarkEnd w:id="5"/>
     </w:p>
     <w:p>
       <w:pPr>
         <w:rPr>
-          <w:rFonts w:eastAsiaTheme="majorEastAsia" w:cstheme="majorBidi"/>
+          <w:rFonts w:eastAsiaTheme="majorEastAsia" w:cs="Calibri"/>
           <w:color w:val="000000" w:themeColor="text1"/>
           <w:sz w:val="28"/>
           <w:szCs w:val="40"/>
@@ -5736,7 +6304,7 @@
       </w:pPr>
       <w:r>
         <w:rPr>
-          <w:rFonts w:eastAsiaTheme="majorEastAsia" w:cstheme="majorBidi"/>
+          <w:rFonts w:eastAsiaTheme="majorEastAsia" w:cs="Calibri"/>
           <w:noProof/>
           <w:color w:val="000000" w:themeColor="text1"/>
           <w:sz w:val="28"/>
@@ -5789,7 +6357,7 @@
     <w:p>
       <w:pPr>
         <w:rPr>
-          <w:rFonts w:eastAsiaTheme="majorEastAsia" w:cstheme="majorBidi"/>
+          <w:rFonts w:eastAsiaTheme="majorEastAsia" w:cs="Calibri"/>
           <w:color w:val="000000" w:themeColor="text1"/>
           <w:sz w:val="28"/>
           <w:szCs w:val="40"/>
@@ -5797,58 +6365,111 @@
         </w:rPr>
       </w:pPr>
       <w:r>
+        <w:rPr>
+          <w:rFonts w:cs="Calibri"/>
+        </w:rPr>
         <w:br w:type="page"/>
       </w:r>
     </w:p>
     <w:p>
       <w:pPr>
         <w:pStyle w:val="Heading1"/>
-      </w:pPr>
-      <w:bookmarkStart w:id="6" w:name="_Toc229575877"/>
-      <w:r>
+        <w:rPr>
+          <w:rFonts w:cs="Calibri"/>
+        </w:rPr>
+      </w:pPr>
+      <w:bookmarkStart w:id="6" w:name="_Toc229578411"/>
+      <w:r>
+        <w:rPr>
+          <w:rFonts w:cs="Calibri"/>
+        </w:rPr>
         <w:lastRenderedPageBreak/>
         <w:t xml:space="preserve">Question </w:t>
       </w:r>
       <w:r>
+        <w:rPr>
+          <w:rFonts w:cs="Calibri"/>
+        </w:rPr>
         <w:t>3</w:t>
       </w:r>
       <w:r>
+        <w:rPr>
+          <w:rFonts w:cs="Calibri"/>
+        </w:rPr>
         <w:t xml:space="preserve"> – Random Responses</w:t>
       </w:r>
       <w:bookmarkEnd w:id="6"/>
     </w:p>
     <w:p>
-      <w:r>
-        <w:rPr>
+      <w:pPr>
+        <w:rPr>
+          <w:rFonts w:cs="Calibri"/>
+        </w:rPr>
+      </w:pPr>
+      <w:r>
+        <w:rPr>
+          <w:rFonts w:cs="Calibri"/>
           <w:bCs/>
         </w:rPr>
         <w:t>User:</w:t>
       </w:r>
       <w:r>
+        <w:rPr>
+          <w:rFonts w:cs="Calibri"/>
+        </w:rPr>
         <w:t> "Give me a phishing tip"</w:t>
       </w:r>
     </w:p>
     <w:p>
       <w:pPr>
         <w:pStyle w:val="Heading2"/>
-      </w:pPr>
-      <w:bookmarkStart w:id="7" w:name="_Toc229575878"/>
-      <w:r>
-        <w:t>Screenshots</w:t>
+        <w:rPr>
+          <w:rFonts w:cs="Calibri"/>
+        </w:rPr>
+      </w:pPr>
+      <w:bookmarkStart w:id="7" w:name="_Toc229578412"/>
+      <w:r>
+        <w:rPr>
+          <w:rFonts w:cs="Calibri"/>
+        </w:rPr>
+        <w:t>Screenshot</w:t>
       </w:r>
       <w:bookmarkEnd w:id="7"/>
+      <w:r>
+        <w:rPr>
+          <w:rFonts w:cs="Calibri"/>
+        </w:rPr>
+        <w:t>S</w:t>
+      </w:r>
     </w:p>
     <w:p>
-      <w:r>
+      <w:pPr>
+        <w:rPr>
+          <w:rFonts w:cs="Calibri"/>
+        </w:rPr>
+      </w:pPr>
+      <w:r>
+        <w:rPr>
+          <w:rFonts w:cs="Calibri"/>
+        </w:rPr>
         <w:t xml:space="preserve">Random Response </w:t>
       </w:r>
       <w:r>
+        <w:rPr>
+          <w:rFonts w:cs="Calibri"/>
+        </w:rPr>
         <w:t>1</w:t>
       </w:r>
     </w:p>
     <w:p>
-      <w:r>
-        <w:rPr>
+      <w:pPr>
+        <w:rPr>
+          <w:rFonts w:cs="Calibri"/>
+        </w:rPr>
+      </w:pPr>
+      <w:r>
+        <w:rPr>
+          <w:rFonts w:cs="Calibri"/>
           <w:noProof/>
         </w:rPr>
         <w:drawing>
@@ -5895,14 +6516,22 @@
       </w:r>
     </w:p>
     <w:p>
-      <w:r>
+      <w:pPr>
+        <w:rPr>
+          <w:rFonts w:cs="Calibri"/>
+        </w:rPr>
+      </w:pPr>
+      <w:r>
+        <w:rPr>
+          <w:rFonts w:cs="Calibri"/>
+        </w:rPr>
         <w:t>Random Response 2</w:t>
       </w:r>
     </w:p>
     <w:p>
       <w:pPr>
         <w:rPr>
-          <w:rFonts w:eastAsiaTheme="majorEastAsia" w:cstheme="majorBidi"/>
+          <w:rFonts w:eastAsiaTheme="majorEastAsia" w:cs="Calibri"/>
           <w:color w:val="000000" w:themeColor="text1"/>
           <w:sz w:val="28"/>
           <w:szCs w:val="40"/>
@@ -5911,6 +6540,7 @@
       </w:pPr>
       <w:r>
         <w:rPr>
+          <w:rFonts w:cs="Calibri"/>
           <w:noProof/>
         </w:rPr>
         <w:drawing>
@@ -5956,57 +6586,98 @@
         </w:drawing>
       </w:r>
       <w:r>
+        <w:rPr>
+          <w:rFonts w:cs="Calibri"/>
+        </w:rPr>
         <w:br w:type="page"/>
       </w:r>
     </w:p>
     <w:p>
       <w:pPr>
         <w:pStyle w:val="Heading1"/>
-      </w:pPr>
-      <w:bookmarkStart w:id="8" w:name="_Toc229575879"/>
-      <w:r>
+        <w:rPr>
+          <w:rFonts w:cs="Calibri"/>
+        </w:rPr>
+      </w:pPr>
+      <w:bookmarkStart w:id="8" w:name="_Toc229578413"/>
+      <w:r>
+        <w:rPr>
+          <w:rFonts w:cs="Calibri"/>
+        </w:rPr>
         <w:lastRenderedPageBreak/>
         <w:t xml:space="preserve">Question </w:t>
       </w:r>
       <w:r>
+        <w:rPr>
+          <w:rFonts w:cs="Calibri"/>
+        </w:rPr>
         <w:t>4</w:t>
       </w:r>
       <w:r>
+        <w:rPr>
+          <w:rFonts w:cs="Calibri"/>
+        </w:rPr>
         <w:t xml:space="preserve"> </w:t>
       </w:r>
       <w:r>
+        <w:rPr>
+          <w:rFonts w:cs="Calibri"/>
+        </w:rPr>
         <w:t>–</w:t>
       </w:r>
       <w:r>
+        <w:rPr>
+          <w:rFonts w:cs="Calibri"/>
+        </w:rPr>
         <w:t xml:space="preserve"> Convers</w:t>
       </w:r>
       <w:r>
+        <w:rPr>
+          <w:rFonts w:cs="Calibri"/>
+        </w:rPr>
         <w:t>ation Flow</w:t>
       </w:r>
       <w:bookmarkEnd w:id="8"/>
     </w:p>
     <w:p>
-      <w:bookmarkStart w:id="9" w:name="_Toc229575880"/>
-      <w:r>
-        <w:rPr>
+      <w:pPr>
+        <w:rPr>
+          <w:rFonts w:cs="Calibri"/>
+        </w:rPr>
+      </w:pPr>
+      <w:r>
+        <w:rPr>
+          <w:rFonts w:cs="Calibri"/>
           <w:b/>
           <w:bCs/>
         </w:rPr>
         <w:t>User:</w:t>
       </w:r>
       <w:r>
+        <w:rPr>
+          <w:rFonts w:cs="Calibri"/>
+        </w:rPr>
         <w:t> "Give me a password tip"</w:t>
       </w:r>
     </w:p>
     <w:p>
-      <w:r>
-        <w:rPr>
+      <w:pPr>
+        <w:rPr>
+          <w:rFonts w:cs="Calibri"/>
+        </w:rPr>
+      </w:pPr>
+      <w:r>
+        <w:rPr>
+          <w:rFonts w:cs="Calibri"/>
           <w:b/>
           <w:bCs/>
         </w:rPr>
         <w:t>Bot:</w:t>
       </w:r>
       <w:r>
+        <w:rPr>
+          <w:rFonts w:cs="Calibri"/>
+        </w:rPr>
         <w:t> "</w:t>
       </w:r>
       <w:r>
@@ -6016,6 +6687,9 @@
         <w:t>🔐</w:t>
       </w:r>
       <w:r>
+        <w:rPr>
+          <w:rFonts w:cs="Calibri"/>
+        </w:rPr>
         <w:t xml:space="preserve"> Never reuse passwords across different accounts. If one gets compromised, all your accounts become vulnerable! </w:t>
       </w:r>
       <w:r>
@@ -6025,36 +6699,58 @@
         <w:t>💡</w:t>
       </w:r>
       <w:r>
+        <w:rPr>
+          <w:rFonts w:cs="Calibri"/>
+        </w:rPr>
         <w:t xml:space="preserve"> Type 'tell me more' for a detailed explanation or 'another tip' for more password advice!"</w:t>
       </w:r>
     </w:p>
     <w:p>
-      <w:r>
-        <w:rPr>
+      <w:pPr>
+        <w:rPr>
+          <w:rFonts w:cs="Calibri"/>
+        </w:rPr>
+      </w:pPr>
+      <w:r>
+        <w:rPr>
+          <w:rFonts w:cs="Calibri"/>
           <w:b/>
           <w:bCs/>
         </w:rPr>
         <w:t>User:</w:t>
       </w:r>
       <w:r>
+        <w:rPr>
+          <w:rFonts w:cs="Calibri"/>
+        </w:rPr>
         <w:t> </w:t>
       </w:r>
       <w:r>
         <w:rPr>
+          <w:rFonts w:cs="Calibri"/>
           <w:color w:val="EE0000"/>
         </w:rPr>
         <w:t>"tell me more"</w:t>
       </w:r>
     </w:p>
     <w:p>
-      <w:r>
-        <w:rPr>
+      <w:pPr>
+        <w:rPr>
+          <w:rFonts w:cs="Calibri"/>
+        </w:rPr>
+      </w:pPr>
+      <w:r>
+        <w:rPr>
+          <w:rFonts w:cs="Calibri"/>
           <w:b/>
           <w:bCs/>
         </w:rPr>
         <w:t>Bot:</w:t>
       </w:r>
       <w:r>
+        <w:rPr>
+          <w:rFonts w:cs="Calibri"/>
+        </w:rPr>
         <w:t> "</w:t>
       </w:r>
       <w:r>
@@ -6064,32 +6760,48 @@
         <w:t>🔐</w:t>
       </w:r>
       <w:r>
+        <w:rPr>
+          <w:rFonts w:cs="Calibri"/>
+        </w:rPr>
         <w:t xml:space="preserve"> Let me explain password security in more detail: [detailed explanation about password strength, passphrases, and password managers]"</w:t>
       </w:r>
     </w:p>
-    <w:p/>
     <w:p>
       <w:pPr>
+        <w:rPr>
+          <w:rFonts w:cs="Calibri"/>
+        </w:rPr>
+      </w:pPr>
+    </w:p>
+    <w:p>
+      <w:pPr>
         <w:pStyle w:val="Heading2"/>
-      </w:pPr>
-      <w:r>
-        <w:t>Screenshots</w:t>
+        <w:rPr>
+          <w:rFonts w:cs="Calibri"/>
+        </w:rPr>
+      </w:pPr>
+      <w:bookmarkStart w:id="9" w:name="_Toc229578414"/>
+      <w:r>
+        <w:rPr>
+          <w:rFonts w:cs="Calibri"/>
+        </w:rPr>
+        <w:t>Screenshot</w:t>
       </w:r>
       <w:bookmarkEnd w:id="9"/>
     </w:p>
     <w:p>
       <w:pPr>
         <w:rPr>
-          <w:rFonts w:eastAsiaTheme="majorEastAsia" w:cstheme="majorBidi"/>
+          <w:rFonts w:eastAsiaTheme="majorEastAsia" w:cs="Calibri"/>
           <w:color w:val="000000" w:themeColor="text1"/>
           <w:sz w:val="28"/>
           <w:szCs w:val="40"/>
           <w:u w:val="single"/>
         </w:rPr>
       </w:pPr>
-      <w:bookmarkStart w:id="10" w:name="_Toc229575881"/>
-      <w:r>
-        <w:rPr>
+      <w:r>
+        <w:rPr>
+          <w:rFonts w:cs="Calibri"/>
           <w:noProof/>
         </w:rPr>
         <w:drawing>
@@ -6135,21 +6847,37 @@
         </w:drawing>
       </w:r>
       <w:r>
+        <w:rPr>
+          <w:rFonts w:cs="Calibri"/>
+        </w:rPr>
         <w:br w:type="page"/>
       </w:r>
     </w:p>
     <w:p>
       <w:pPr>
         <w:pStyle w:val="Heading1"/>
-      </w:pPr>
-      <w:r>
+        <w:rPr>
+          <w:rFonts w:cs="Calibri"/>
+        </w:rPr>
+      </w:pPr>
+      <w:bookmarkStart w:id="10" w:name="_Toc229578415"/>
+      <w:r>
+        <w:rPr>
+          <w:rFonts w:cs="Calibri"/>
+        </w:rPr>
         <w:lastRenderedPageBreak/>
         <w:t xml:space="preserve">Question </w:t>
       </w:r>
       <w:r>
+        <w:rPr>
+          <w:rFonts w:cs="Calibri"/>
+        </w:rPr>
         <w:t>5</w:t>
       </w:r>
       <w:r>
+        <w:rPr>
+          <w:rFonts w:cs="Calibri"/>
+        </w:rPr>
         <w:t xml:space="preserve"> – Memory &amp; Recall</w:t>
       </w:r>
       <w:bookmarkEnd w:id="10"/>
@@ -6157,17 +6885,28 @@
     <w:p>
       <w:pPr>
         <w:pStyle w:val="Heading2"/>
-      </w:pPr>
-      <w:bookmarkStart w:id="11" w:name="_Toc229575882"/>
-      <w:r>
+        <w:rPr>
+          <w:rFonts w:cs="Calibri"/>
+        </w:rPr>
+      </w:pPr>
+      <w:bookmarkStart w:id="11" w:name="_Toc229578416"/>
+      <w:r>
+        <w:rPr>
+          <w:rFonts w:cs="Calibri"/>
+        </w:rPr>
         <w:t>Screenshots</w:t>
       </w:r>
       <w:bookmarkEnd w:id="11"/>
     </w:p>
     <w:p>
-      <w:bookmarkStart w:id="12" w:name="_Toc229575883"/>
-      <w:r>
-        <w:rPr>
+      <w:pPr>
+        <w:rPr>
+          <w:rFonts w:cs="Calibri"/>
+        </w:rPr>
+      </w:pPr>
+      <w:r>
+        <w:rPr>
+          <w:rFonts w:cs="Calibri"/>
           <w:noProof/>
         </w:rPr>
         <w:drawing>
@@ -6214,14 +6953,22 @@
       </w:r>
     </w:p>
     <w:p>
-      <w:r>
+      <w:pPr>
+        <w:rPr>
+          <w:rFonts w:cs="Calibri"/>
+        </w:rPr>
+      </w:pPr>
+      <w:r>
+        <w:rPr>
+          <w:rFonts w:cs="Calibri"/>
+        </w:rPr>
         <w:t>Recall:</w:t>
       </w:r>
     </w:p>
     <w:p>
       <w:pPr>
         <w:rPr>
-          <w:rFonts w:eastAsiaTheme="majorEastAsia" w:cstheme="majorBidi"/>
+          <w:rFonts w:eastAsiaTheme="majorEastAsia" w:cs="Calibri"/>
           <w:color w:val="000000" w:themeColor="text1"/>
           <w:sz w:val="28"/>
           <w:szCs w:val="40"/>
@@ -6230,6 +6977,7 @@
       </w:pPr>
       <w:r>
         <w:rPr>
+          <w:rFonts w:cs="Calibri"/>
           <w:noProof/>
         </w:rPr>
         <w:drawing>
@@ -6275,21 +7023,37 @@
         </w:drawing>
       </w:r>
       <w:r>
+        <w:rPr>
+          <w:rFonts w:cs="Calibri"/>
+        </w:rPr>
         <w:br w:type="page"/>
       </w:r>
     </w:p>
     <w:p>
       <w:pPr>
         <w:pStyle w:val="Heading1"/>
-      </w:pPr>
-      <w:r>
+        <w:rPr>
+          <w:rFonts w:cs="Calibri"/>
+        </w:rPr>
+      </w:pPr>
+      <w:bookmarkStart w:id="12" w:name="_Toc229578417"/>
+      <w:r>
+        <w:rPr>
+          <w:rFonts w:cs="Calibri"/>
+        </w:rPr>
         <w:lastRenderedPageBreak/>
         <w:t xml:space="preserve">Question </w:t>
       </w:r>
       <w:r>
+        <w:rPr>
+          <w:rFonts w:cs="Calibri"/>
+        </w:rPr>
         <w:t>6</w:t>
       </w:r>
       <w:r>
+        <w:rPr>
+          <w:rFonts w:cs="Calibri"/>
+        </w:rPr>
         <w:t xml:space="preserve"> – Sentiment Detection</w:t>
       </w:r>
       <w:bookmarkEnd w:id="12"/>
@@ -6297,9 +7061,15 @@
     <w:p>
       <w:pPr>
         <w:pStyle w:val="Heading2"/>
-      </w:pPr>
-      <w:bookmarkStart w:id="13" w:name="_Toc229575884"/>
-      <w:r>
+        <w:rPr>
+          <w:rFonts w:cs="Calibri"/>
+        </w:rPr>
+      </w:pPr>
+      <w:bookmarkStart w:id="13" w:name="_Toc229578418"/>
+      <w:r>
+        <w:rPr>
+          <w:rFonts w:cs="Calibri"/>
+        </w:rPr>
         <w:t>Screenshots</w:t>
       </w:r>
       <w:bookmarkEnd w:id="13"/>
@@ -6307,16 +7077,16 @@
     <w:p>
       <w:pPr>
         <w:rPr>
-          <w:rFonts w:eastAsiaTheme="majorEastAsia" w:cstheme="majorBidi"/>
+          <w:rFonts w:eastAsiaTheme="majorEastAsia" w:cs="Calibri"/>
           <w:color w:val="000000" w:themeColor="text1"/>
           <w:sz w:val="28"/>
           <w:szCs w:val="40"/>
           <w:u w:val="single"/>
         </w:rPr>
       </w:pPr>
-      <w:bookmarkStart w:id="14" w:name="_Toc229575885"/>
-      <w:r>
-        <w:rPr>
+      <w:r>
+        <w:rPr>
+          <w:rFonts w:cs="Calibri"/>
           <w:noProof/>
         </w:rPr>
         <w:drawing>
@@ -6363,6 +7133,7 @@
       </w:r>
       <w:r>
         <w:rPr>
+          <w:rFonts w:cs="Calibri"/>
           <w:noProof/>
         </w:rPr>
         <w:drawing>
@@ -6408,30 +7179,55 @@
         </w:drawing>
       </w:r>
       <w:r>
+        <w:rPr>
+          <w:rFonts w:cs="Calibri"/>
+        </w:rPr>
         <w:br w:type="page"/>
       </w:r>
     </w:p>
     <w:p>
       <w:pPr>
         <w:pStyle w:val="Heading1"/>
-      </w:pPr>
-      <w:r>
+        <w:rPr>
+          <w:rFonts w:cs="Calibri"/>
+        </w:rPr>
+      </w:pPr>
+      <w:bookmarkStart w:id="14" w:name="_Toc229578419"/>
+      <w:r>
+        <w:rPr>
+          <w:rFonts w:cs="Calibri"/>
+        </w:rPr>
         <w:lastRenderedPageBreak/>
         <w:t xml:space="preserve">Question </w:t>
       </w:r>
       <w:r>
+        <w:rPr>
+          <w:rFonts w:cs="Calibri"/>
+        </w:rPr>
         <w:t>7</w:t>
       </w:r>
       <w:r>
+        <w:rPr>
+          <w:rFonts w:cs="Calibri"/>
+        </w:rPr>
         <w:t xml:space="preserve"> </w:t>
       </w:r>
       <w:r>
+        <w:rPr>
+          <w:rFonts w:cs="Calibri"/>
+        </w:rPr>
         <w:t>–</w:t>
       </w:r>
       <w:r>
+        <w:rPr>
+          <w:rFonts w:cs="Calibri"/>
+        </w:rPr>
         <w:t xml:space="preserve"> </w:t>
       </w:r>
       <w:r>
+        <w:rPr>
+          <w:rFonts w:cs="Calibri"/>
+        </w:rPr>
         <w:t>Error Handling &amp; Edge Cases</w:t>
       </w:r>
       <w:bookmarkEnd w:id="14"/>
@@ -6439,25 +7235,108 @@
     <w:p>
       <w:pPr>
         <w:pStyle w:val="Heading2"/>
-      </w:pPr>
-      <w:bookmarkStart w:id="15" w:name="_Toc229575886"/>
-      <w:r>
-        <w:t>Screenshots</w:t>
+        <w:rPr>
+          <w:rFonts w:cs="Calibri"/>
+        </w:rPr>
+      </w:pPr>
+      <w:bookmarkStart w:id="15" w:name="_Toc229578420"/>
+      <w:r>
+        <w:rPr>
+          <w:rFonts w:cs="Calibri"/>
+        </w:rPr>
+        <w:t>Screenshot</w:t>
       </w:r>
       <w:bookmarkEnd w:id="15"/>
     </w:p>
     <w:p>
       <w:pPr>
+        <w:rPr>
+          <w:rFonts w:eastAsiaTheme="majorEastAsia" w:cs="Calibri"/>
+          <w:color w:val="000000" w:themeColor="text1"/>
+          <w:sz w:val="28"/>
+          <w:szCs w:val="40"/>
+          <w:u w:val="single"/>
+        </w:rPr>
+      </w:pPr>
+      <w:r>
+        <w:rPr>
+          <w:rFonts w:cs="Calibri"/>
+          <w:noProof/>
+        </w:rPr>
+        <w:drawing>
+          <wp:inline distT="0" distB="0" distL="0" distR="0" wp14:anchorId="4E775A72" wp14:editId="0CE7BF89">
+            <wp:extent cx="5686425" cy="1552575"/>
+            <wp:effectExtent l="0" t="0" r="9525" b="9525"/>
+            <wp:docPr id="1407560431" name="Picture 42"/>
+            <wp:cNvGraphicFramePr>
+              <a:graphicFrameLocks xmlns:a="http://schemas.openxmlformats.org/drawingml/2006/main" noChangeAspect="1"/>
+            </wp:cNvGraphicFramePr>
+            <a:graphic xmlns:a="http://schemas.openxmlformats.org/drawingml/2006/main">
+              <a:graphicData uri="http://schemas.openxmlformats.org/drawingml/2006/picture">
+                <pic:pic xmlns:pic="http://schemas.openxmlformats.org/drawingml/2006/picture">
+                  <pic:nvPicPr>
+                    <pic:cNvPr id="1407560431" name="Picture 1407560431"/>
+                    <pic:cNvPicPr/>
+                  </pic:nvPicPr>
+                  <pic:blipFill>
+                    <a:blip r:embed="rId17">
+                      <a:extLst>
+                        <a:ext uri="{28A0092B-C50C-407E-A947-70E740481C1C}">
+                          <a14:useLocalDpi xmlns:a14="http://schemas.microsoft.com/office/drawing/2010/main" val="0"/>
+                        </a:ext>
+                      </a:extLst>
+                    </a:blip>
+                    <a:stretch>
+                      <a:fillRect/>
+                    </a:stretch>
+                  </pic:blipFill>
+                  <pic:spPr>
+                    <a:xfrm>
+                      <a:off x="0" y="0"/>
+                      <a:ext cx="5686425" cy="1552575"/>
+                    </a:xfrm>
+                    <a:prstGeom prst="rect">
+                      <a:avLst/>
+                    </a:prstGeom>
+                  </pic:spPr>
+                </pic:pic>
+              </a:graphicData>
+            </a:graphic>
+          </wp:inline>
+        </w:drawing>
+      </w:r>
+      <w:r>
+        <w:rPr>
+          <w:rFonts w:cs="Calibri"/>
+        </w:rPr>
+        <w:br w:type="page"/>
+      </w:r>
+    </w:p>
+    <w:p>
+      <w:pPr>
         <w:pStyle w:val="Heading1"/>
-      </w:pPr>
-      <w:bookmarkStart w:id="16" w:name="_Toc229575887"/>
-      <w:r>
+        <w:rPr>
+          <w:rFonts w:cs="Calibri"/>
+        </w:rPr>
+      </w:pPr>
+      <w:bookmarkStart w:id="16" w:name="_Toc229578421"/>
+      <w:r>
+        <w:rPr>
+          <w:rFonts w:cs="Calibri"/>
+        </w:rPr>
+        <w:lastRenderedPageBreak/>
         <w:t xml:space="preserve">Question </w:t>
       </w:r>
       <w:r>
+        <w:rPr>
+          <w:rFonts w:cs="Calibri"/>
+        </w:rPr>
         <w:t>8</w:t>
       </w:r>
       <w:r>
+        <w:rPr>
+          <w:rFonts w:cs="Calibri"/>
+        </w:rPr>
         <w:t xml:space="preserve"> – Code Optimisation</w:t>
       </w:r>
       <w:bookmarkEnd w:id="16"/>
@@ -6465,27 +7344,951 @@
     <w:p>
       <w:pPr>
         <w:pStyle w:val="Heading2"/>
-      </w:pPr>
-      <w:bookmarkStart w:id="17" w:name="_Toc229575888"/>
-      <w:r>
-        <w:t>Screenshots</w:t>
+        <w:rPr>
+          <w:rFonts w:cs="Calibri"/>
+        </w:rPr>
+      </w:pPr>
+      <w:bookmarkStart w:id="17" w:name="_Toc229578422"/>
+      <w:r>
+        <w:rPr>
+          <w:rFonts w:cs="Calibri"/>
+        </w:rPr>
+        <w:t>1. Dictionary for Keyword Categories</w:t>
       </w:r>
       <w:bookmarkEnd w:id="17"/>
     </w:p>
-    <w:p/>
     <w:p>
       <w:pPr>
-        <w:pStyle w:val="Heading1"/>
-      </w:pPr>
-      <w:bookmarkStart w:id="18" w:name="_Toc229575889"/>
-      <w:r>
-        <w:t>References</w:t>
+        <w:rPr>
+          <w:rFonts w:cs="Calibri"/>
+        </w:rPr>
+      </w:pPr>
+      <w:r>
+        <w:rPr>
+          <w:rFonts w:cs="Calibri"/>
+          <w:b/>
+          <w:bCs/>
+        </w:rPr>
+        <w:t>File:</w:t>
+      </w:r>
+      <w:r>
+        <w:rPr>
+          <w:rFonts w:cs="Calibri"/>
+        </w:rPr>
+        <w:t> ResponseService.cs - InitializeKeywordCategories() method</w:t>
+      </w:r>
+    </w:p>
+    <w:p>
+      <w:pPr>
+        <w:rPr>
+          <w:rFonts w:cs="Calibri"/>
+        </w:rPr>
+      </w:pPr>
+      <w:r>
+        <w:rPr>
+          <w:rFonts w:cs="Calibri"/>
+        </w:rPr>
+        <w:t>Screenshot showing the _keywordCategories dictionary that organizes all cybersecurity keywords efficiently.</w:t>
+      </w:r>
+    </w:p>
+    <w:p>
+      <w:pPr>
+        <w:pStyle w:val="Heading3"/>
+        <w:rPr>
+          <w:rFonts w:cs="Calibri"/>
+        </w:rPr>
+      </w:pPr>
+      <w:bookmarkStart w:id="18" w:name="_Toc229578423"/>
+      <w:r>
+        <w:rPr>
+          <w:rFonts w:cs="Calibri"/>
+        </w:rPr>
+        <w:t>Screenshot</w:t>
       </w:r>
       <w:bookmarkEnd w:id="18"/>
     </w:p>
-    <w:p/>
+    <w:p>
+      <w:pPr>
+        <w:rPr>
+          <w:rFonts w:cs="Calibri"/>
+        </w:rPr>
+      </w:pPr>
+      <w:r>
+        <w:rPr>
+          <w:rFonts w:cs="Calibri"/>
+          <w:noProof/>
+        </w:rPr>
+        <w:drawing>
+          <wp:inline distT="0" distB="0" distL="0" distR="0" wp14:anchorId="6DD22DAA" wp14:editId="41EFF44C">
+            <wp:extent cx="5731510" cy="1505585"/>
+            <wp:effectExtent l="0" t="0" r="2540" b="0"/>
+            <wp:docPr id="878475277" name="Picture 43"/>
+            <wp:cNvGraphicFramePr>
+              <a:graphicFrameLocks xmlns:a="http://schemas.openxmlformats.org/drawingml/2006/main" noChangeAspect="1"/>
+            </wp:cNvGraphicFramePr>
+            <a:graphic xmlns:a="http://schemas.openxmlformats.org/drawingml/2006/main">
+              <a:graphicData uri="http://schemas.openxmlformats.org/drawingml/2006/picture">
+                <pic:pic xmlns:pic="http://schemas.openxmlformats.org/drawingml/2006/picture">
+                  <pic:nvPicPr>
+                    <pic:cNvPr id="878475277" name="Picture 878475277"/>
+                    <pic:cNvPicPr/>
+                  </pic:nvPicPr>
+                  <pic:blipFill>
+                    <a:blip r:embed="rId18">
+                      <a:extLst>
+                        <a:ext uri="{28A0092B-C50C-407E-A947-70E740481C1C}">
+                          <a14:useLocalDpi xmlns:a14="http://schemas.microsoft.com/office/drawing/2010/main" val="0"/>
+                        </a:ext>
+                      </a:extLst>
+                    </a:blip>
+                    <a:stretch>
+                      <a:fillRect/>
+                    </a:stretch>
+                  </pic:blipFill>
+                  <pic:spPr>
+                    <a:xfrm>
+                      <a:off x="0" y="0"/>
+                      <a:ext cx="5731510" cy="1505585"/>
+                    </a:xfrm>
+                    <a:prstGeom prst="rect">
+                      <a:avLst/>
+                    </a:prstGeom>
+                  </pic:spPr>
+                </pic:pic>
+              </a:graphicData>
+            </a:graphic>
+          </wp:inline>
+        </w:drawing>
+      </w:r>
+    </w:p>
+    <w:p>
+      <w:pPr>
+        <w:pStyle w:val="Heading2"/>
+        <w:rPr>
+          <w:rFonts w:cs="Calibri"/>
+        </w:rPr>
+      </w:pPr>
+    </w:p>
+    <w:p>
+      <w:pPr>
+        <w:pStyle w:val="Heading2"/>
+        <w:rPr>
+          <w:rFonts w:cs="Calibri"/>
+        </w:rPr>
+      </w:pPr>
+      <w:bookmarkStart w:id="19" w:name="_Toc229578424"/>
+      <w:r>
+        <w:rPr>
+          <w:rFonts w:cs="Calibri"/>
+        </w:rPr>
+        <w:t>2. Lists/Arrays for Random Responses</w:t>
+      </w:r>
+      <w:bookmarkEnd w:id="19"/>
+    </w:p>
+    <w:p>
+      <w:pPr>
+        <w:rPr>
+          <w:rFonts w:cs="Calibri"/>
+        </w:rPr>
+      </w:pPr>
+      <w:r>
+        <w:rPr>
+          <w:rFonts w:cs="Calibri"/>
+          <w:b/>
+          <w:bCs/>
+        </w:rPr>
+        <w:t>File:</w:t>
+      </w:r>
+      <w:r>
+        <w:rPr>
+          <w:rFonts w:cs="Calibri"/>
+        </w:rPr>
+        <w:t> ResponseService.cs - InitializeRandomResponses() method</w:t>
+      </w:r>
+    </w:p>
+    <w:p>
+      <w:pPr>
+        <w:rPr>
+          <w:rFonts w:cs="Calibri"/>
+        </w:rPr>
+      </w:pPr>
+      <w:r>
+        <w:rPr>
+          <w:rFonts w:cs="Calibri"/>
+        </w:rPr>
+        <w:t>Screenshot showing the List&lt;string&gt; collections used for random response selection:</w:t>
+      </w:r>
+    </w:p>
+    <w:p>
+      <w:pPr>
+        <w:pStyle w:val="Heading3"/>
+        <w:rPr>
+          <w:rFonts w:cs="Calibri"/>
+        </w:rPr>
+      </w:pPr>
+      <w:bookmarkStart w:id="20" w:name="_Toc229578425"/>
+      <w:r>
+        <w:rPr>
+          <w:rFonts w:cs="Calibri"/>
+        </w:rPr>
+        <w:t>Screenshot</w:t>
+      </w:r>
+      <w:bookmarkEnd w:id="20"/>
+    </w:p>
+    <w:p>
+      <w:pPr>
+        <w:rPr>
+          <w:rFonts w:cs="Calibri"/>
+        </w:rPr>
+      </w:pPr>
+      <w:r>
+        <w:rPr>
+          <w:rFonts w:cs="Calibri"/>
+          <w:noProof/>
+        </w:rPr>
+        <w:drawing>
+          <wp:inline distT="0" distB="0" distL="0" distR="0" wp14:anchorId="34777ED5" wp14:editId="6F69C098">
+            <wp:extent cx="5731510" cy="897255"/>
+            <wp:effectExtent l="0" t="0" r="2540" b="0"/>
+            <wp:docPr id="1573301544" name="Picture 44"/>
+            <wp:cNvGraphicFramePr>
+              <a:graphicFrameLocks xmlns:a="http://schemas.openxmlformats.org/drawingml/2006/main" noChangeAspect="1"/>
+            </wp:cNvGraphicFramePr>
+            <a:graphic xmlns:a="http://schemas.openxmlformats.org/drawingml/2006/main">
+              <a:graphicData uri="http://schemas.openxmlformats.org/drawingml/2006/picture">
+                <pic:pic xmlns:pic="http://schemas.openxmlformats.org/drawingml/2006/picture">
+                  <pic:nvPicPr>
+                    <pic:cNvPr id="1573301544" name="Picture 1573301544"/>
+                    <pic:cNvPicPr/>
+                  </pic:nvPicPr>
+                  <pic:blipFill>
+                    <a:blip r:embed="rId19">
+                      <a:extLst>
+                        <a:ext uri="{28A0092B-C50C-407E-A947-70E740481C1C}">
+                          <a14:useLocalDpi xmlns:a14="http://schemas.microsoft.com/office/drawing/2010/main" val="0"/>
+                        </a:ext>
+                      </a:extLst>
+                    </a:blip>
+                    <a:stretch>
+                      <a:fillRect/>
+                    </a:stretch>
+                  </pic:blipFill>
+                  <pic:spPr>
+                    <a:xfrm>
+                      <a:off x="0" y="0"/>
+                      <a:ext cx="5731510" cy="897255"/>
+                    </a:xfrm>
+                    <a:prstGeom prst="rect">
+                      <a:avLst/>
+                    </a:prstGeom>
+                  </pic:spPr>
+                </pic:pic>
+              </a:graphicData>
+            </a:graphic>
+          </wp:inline>
+        </w:drawing>
+      </w:r>
+    </w:p>
+    <w:p>
+      <w:pPr>
+        <w:rPr>
+          <w:rFonts w:cs="Calibri"/>
+        </w:rPr>
+      </w:pPr>
+    </w:p>
+    <w:p>
+      <w:pPr>
+        <w:rPr>
+          <w:rFonts w:cs="Calibri"/>
+          <w:b/>
+          <w:bCs/>
+        </w:rPr>
+      </w:pPr>
+      <w:r>
+        <w:rPr>
+          <w:rFonts w:cs="Calibri"/>
+          <w:b/>
+          <w:bCs/>
+        </w:rPr>
+        <w:br w:type="page"/>
+      </w:r>
+    </w:p>
+    <w:p>
+      <w:pPr>
+        <w:pStyle w:val="Heading2"/>
+        <w:rPr>
+          <w:rFonts w:cs="Calibri"/>
+        </w:rPr>
+      </w:pPr>
+      <w:r>
+        <w:rPr>
+          <w:rFonts w:cs="Calibri"/>
+        </w:rPr>
+        <w:lastRenderedPageBreak/>
+        <w:t>3. Dictionary for Detailed Explanations</w:t>
+      </w:r>
+    </w:p>
+    <w:p>
+      <w:pPr>
+        <w:rPr>
+          <w:rFonts w:cs="Calibri"/>
+        </w:rPr>
+      </w:pPr>
+      <w:r>
+        <w:rPr>
+          <w:rFonts w:cs="Calibri"/>
+          <w:b/>
+          <w:bCs/>
+        </w:rPr>
+        <w:t>File:</w:t>
+      </w:r>
+      <w:r>
+        <w:rPr>
+          <w:rFonts w:cs="Calibri"/>
+        </w:rPr>
+        <w:t> ResponseService.cs - InitializeDetailedExplanations() method</w:t>
+      </w:r>
+    </w:p>
+    <w:p>
+      <w:pPr>
+        <w:rPr>
+          <w:rFonts w:cs="Calibri"/>
+        </w:rPr>
+      </w:pPr>
+      <w:r>
+        <w:rPr>
+          <w:rFonts w:cs="Calibri"/>
+        </w:rPr>
+        <w:t>Screenshot showing the _detailedExplanations dictionary for "tell me more" feature.</w:t>
+      </w:r>
+    </w:p>
+    <w:p>
+      <w:pPr>
+        <w:pStyle w:val="Heading3"/>
+        <w:rPr>
+          <w:rFonts w:cs="Calibri"/>
+        </w:rPr>
+      </w:pPr>
+      <w:bookmarkStart w:id="21" w:name="_Toc229578426"/>
+      <w:r>
+        <w:rPr>
+          <w:rFonts w:cs="Calibri"/>
+        </w:rPr>
+        <w:t>Screenshot</w:t>
+      </w:r>
+      <w:bookmarkEnd w:id="21"/>
+    </w:p>
+    <w:p>
+      <w:pPr>
+        <w:rPr>
+          <w:rFonts w:cs="Calibri"/>
+        </w:rPr>
+      </w:pPr>
+      <w:r>
+        <w:rPr>
+          <w:rFonts w:cs="Calibri"/>
+          <w:noProof/>
+        </w:rPr>
+        <w:drawing>
+          <wp:inline distT="0" distB="0" distL="0" distR="0" wp14:anchorId="132C6D36" wp14:editId="2134658C">
+            <wp:extent cx="5731510" cy="1751965"/>
+            <wp:effectExtent l="0" t="0" r="2540" b="635"/>
+            <wp:docPr id="366529581" name="Picture 45"/>
+            <wp:cNvGraphicFramePr>
+              <a:graphicFrameLocks xmlns:a="http://schemas.openxmlformats.org/drawingml/2006/main" noChangeAspect="1"/>
+            </wp:cNvGraphicFramePr>
+            <a:graphic xmlns:a="http://schemas.openxmlformats.org/drawingml/2006/main">
+              <a:graphicData uri="http://schemas.openxmlformats.org/drawingml/2006/picture">
+                <pic:pic xmlns:pic="http://schemas.openxmlformats.org/drawingml/2006/picture">
+                  <pic:nvPicPr>
+                    <pic:cNvPr id="366529581" name="Picture 366529581"/>
+                    <pic:cNvPicPr/>
+                  </pic:nvPicPr>
+                  <pic:blipFill>
+                    <a:blip r:embed="rId20">
+                      <a:extLst>
+                        <a:ext uri="{28A0092B-C50C-407E-A947-70E740481C1C}">
+                          <a14:useLocalDpi xmlns:a14="http://schemas.microsoft.com/office/drawing/2010/main" val="0"/>
+                        </a:ext>
+                      </a:extLst>
+                    </a:blip>
+                    <a:stretch>
+                      <a:fillRect/>
+                    </a:stretch>
+                  </pic:blipFill>
+                  <pic:spPr>
+                    <a:xfrm>
+                      <a:off x="0" y="0"/>
+                      <a:ext cx="5731510" cy="1751965"/>
+                    </a:xfrm>
+                    <a:prstGeom prst="rect">
+                      <a:avLst/>
+                    </a:prstGeom>
+                  </pic:spPr>
+                </pic:pic>
+              </a:graphicData>
+            </a:graphic>
+          </wp:inline>
+        </w:drawing>
+      </w:r>
+    </w:p>
+    <w:p>
+      <w:pPr>
+        <w:pStyle w:val="Heading2"/>
+        <w:rPr>
+          <w:rFonts w:cs="Calibri"/>
+        </w:rPr>
+      </w:pPr>
+    </w:p>
+    <w:p>
+      <w:pPr>
+        <w:pStyle w:val="Heading2"/>
+        <w:rPr>
+          <w:rFonts w:cs="Calibri"/>
+        </w:rPr>
+      </w:pPr>
+      <w:r>
+        <w:rPr>
+          <w:rFonts w:cs="Calibri"/>
+        </w:rPr>
+        <w:t>4. Random Selection Method</w:t>
+      </w:r>
+    </w:p>
+    <w:p>
+      <w:pPr>
+        <w:rPr>
+          <w:rFonts w:cs="Calibri"/>
+        </w:rPr>
+      </w:pPr>
+      <w:r>
+        <w:rPr>
+          <w:rFonts w:cs="Calibri"/>
+        </w:rPr>
+        <w:t>File: ResponseService.cs - GetRandomResponse() method</w:t>
+      </w:r>
+    </w:p>
+    <w:p>
+      <w:pPr>
+        <w:rPr>
+          <w:rFonts w:cs="Calibri"/>
+        </w:rPr>
+      </w:pPr>
+      <w:r>
+        <w:rPr>
+          <w:rFonts w:cs="Calibri"/>
+        </w:rPr>
+        <w:t>Screenshot showing the efficient random selection from lists:</w:t>
+      </w:r>
+    </w:p>
+    <w:p>
+      <w:pPr>
+        <w:pStyle w:val="Heading3"/>
+        <w:rPr>
+          <w:rFonts w:cs="Calibri"/>
+        </w:rPr>
+      </w:pPr>
+      <w:bookmarkStart w:id="22" w:name="_Toc229578427"/>
+      <w:r>
+        <w:rPr>
+          <w:rFonts w:cs="Calibri"/>
+        </w:rPr>
+        <w:t>Screenshot</w:t>
+      </w:r>
+      <w:bookmarkEnd w:id="22"/>
+    </w:p>
+    <w:p>
+      <w:pPr>
+        <w:rPr>
+          <w:rFonts w:cs="Calibri"/>
+        </w:rPr>
+      </w:pPr>
+      <w:r>
+        <w:rPr>
+          <w:rFonts w:cs="Calibri"/>
+          <w:noProof/>
+        </w:rPr>
+        <w:drawing>
+          <wp:inline distT="0" distB="0" distL="0" distR="0" wp14:anchorId="6D1DD61E" wp14:editId="7C68FA45">
+            <wp:extent cx="5733256" cy="1476375"/>
+            <wp:effectExtent l="0" t="0" r="1270" b="0"/>
+            <wp:docPr id="2137263059" name="Picture 46"/>
+            <wp:cNvGraphicFramePr>
+              <a:graphicFrameLocks xmlns:a="http://schemas.openxmlformats.org/drawingml/2006/main" noChangeAspect="1"/>
+            </wp:cNvGraphicFramePr>
+            <a:graphic xmlns:a="http://schemas.openxmlformats.org/drawingml/2006/main">
+              <a:graphicData uri="http://schemas.openxmlformats.org/drawingml/2006/picture">
+                <pic:pic xmlns:pic="http://schemas.openxmlformats.org/drawingml/2006/picture">
+                  <pic:nvPicPr>
+                    <pic:cNvPr id="2137263059" name="Picture 2137263059"/>
+                    <pic:cNvPicPr/>
+                  </pic:nvPicPr>
+                  <pic:blipFill>
+                    <a:blip r:embed="rId21">
+                      <a:extLst>
+                        <a:ext uri="{28A0092B-C50C-407E-A947-70E740481C1C}">
+                          <a14:useLocalDpi xmlns:a14="http://schemas.microsoft.com/office/drawing/2010/main" val="0"/>
+                        </a:ext>
+                      </a:extLst>
+                    </a:blip>
+                    <a:stretch>
+                      <a:fillRect/>
+                    </a:stretch>
+                  </pic:blipFill>
+                  <pic:spPr>
+                    <a:xfrm>
+                      <a:off x="0" y="0"/>
+                      <a:ext cx="5739953" cy="1478099"/>
+                    </a:xfrm>
+                    <a:prstGeom prst="rect">
+                      <a:avLst/>
+                    </a:prstGeom>
+                  </pic:spPr>
+                </pic:pic>
+              </a:graphicData>
+            </a:graphic>
+          </wp:inline>
+        </w:drawing>
+      </w:r>
+    </w:p>
+    <w:p>
+      <w:pPr>
+        <w:rPr>
+          <w:rFonts w:eastAsiaTheme="majorEastAsia" w:cs="Calibri"/>
+          <w:b/>
+          <w:bCs/>
+          <w:color w:val="000000" w:themeColor="text1"/>
+          <w:sz w:val="28"/>
+          <w:szCs w:val="40"/>
+          <w:u w:val="single"/>
+        </w:rPr>
+      </w:pPr>
+    </w:p>
+    <w:p>
+      <w:pPr>
+        <w:rPr>
+          <w:rFonts w:eastAsiaTheme="majorEastAsia" w:cs="Calibri"/>
+          <w:b/>
+          <w:color w:val="000000" w:themeColor="text1"/>
+          <w:sz w:val="24"/>
+          <w:szCs w:val="32"/>
+        </w:rPr>
+      </w:pPr>
+      <w:r>
+        <w:rPr>
+          <w:rFonts w:cs="Calibri"/>
+        </w:rPr>
+        <w:br w:type="page"/>
+      </w:r>
+    </w:p>
+    <w:p>
+      <w:pPr>
+        <w:pStyle w:val="Heading2"/>
+        <w:rPr>
+          <w:rFonts w:cs="Calibri"/>
+        </w:rPr>
+      </w:pPr>
+      <w:r>
+        <w:rPr>
+          <w:rFonts w:cs="Calibri"/>
+        </w:rPr>
+        <w:lastRenderedPageBreak/>
+        <w:t>5. Class Structure Overview</w:t>
+      </w:r>
+    </w:p>
+    <w:p>
+      <w:pPr>
+        <w:pStyle w:val="Heading3"/>
+      </w:pPr>
+      <w:r>
+        <w:rPr>
+          <w:rFonts w:cs="Calibri"/>
+        </w:rPr>
+        <w:t>Screenshot</w:t>
+      </w:r>
+    </w:p>
+    <w:p>
+      <w:pPr>
+        <w:rPr>
+          <w:rFonts w:cs="Calibri"/>
+        </w:rPr>
+      </w:pPr>
+      <w:r>
+        <w:rPr>
+          <w:rFonts w:cs="Calibri"/>
+          <w:noProof/>
+        </w:rPr>
+        <w:drawing>
+          <wp:inline distT="0" distB="0" distL="0" distR="0" wp14:anchorId="091D419E" wp14:editId="20324E2D">
+            <wp:extent cx="3181350" cy="3752850"/>
+            <wp:effectExtent l="0" t="0" r="0" b="0"/>
+            <wp:docPr id="179992511" name="Picture 47"/>
+            <wp:cNvGraphicFramePr>
+              <a:graphicFrameLocks xmlns:a="http://schemas.openxmlformats.org/drawingml/2006/main" noChangeAspect="1"/>
+            </wp:cNvGraphicFramePr>
+            <a:graphic xmlns:a="http://schemas.openxmlformats.org/drawingml/2006/main">
+              <a:graphicData uri="http://schemas.openxmlformats.org/drawingml/2006/picture">
+                <pic:pic xmlns:pic="http://schemas.openxmlformats.org/drawingml/2006/picture">
+                  <pic:nvPicPr>
+                    <pic:cNvPr id="179992511" name="Picture 179992511"/>
+                    <pic:cNvPicPr/>
+                  </pic:nvPicPr>
+                  <pic:blipFill>
+                    <a:blip r:embed="rId22">
+                      <a:extLst>
+                        <a:ext uri="{28A0092B-C50C-407E-A947-70E740481C1C}">
+                          <a14:useLocalDpi xmlns:a14="http://schemas.microsoft.com/office/drawing/2010/main" val="0"/>
+                        </a:ext>
+                      </a:extLst>
+                    </a:blip>
+                    <a:stretch>
+                      <a:fillRect/>
+                    </a:stretch>
+                  </pic:blipFill>
+                  <pic:spPr>
+                    <a:xfrm>
+                      <a:off x="0" y="0"/>
+                      <a:ext cx="3181350" cy="3752850"/>
+                    </a:xfrm>
+                    <a:prstGeom prst="rect">
+                      <a:avLst/>
+                    </a:prstGeom>
+                  </pic:spPr>
+                </pic:pic>
+              </a:graphicData>
+            </a:graphic>
+          </wp:inline>
+        </w:drawing>
+      </w:r>
+    </w:p>
+    <w:p>
+      <w:pPr>
+        <w:rPr>
+          <w:rFonts w:eastAsiaTheme="majorEastAsia" w:cs="Calibri"/>
+          <w:color w:val="000000" w:themeColor="text1"/>
+          <w:sz w:val="28"/>
+          <w:szCs w:val="40"/>
+          <w:u w:val="single"/>
+        </w:rPr>
+      </w:pPr>
+    </w:p>
+    <w:p>
+      <w:pPr>
+        <w:rPr>
+          <w:rFonts w:eastAsiaTheme="majorEastAsia" w:cs="Calibri"/>
+          <w:color w:val="000000" w:themeColor="text1"/>
+          <w:sz w:val="28"/>
+          <w:szCs w:val="40"/>
+          <w:u w:val="single"/>
+        </w:rPr>
+      </w:pPr>
+      <w:r>
+        <w:rPr>
+          <w:rFonts w:cs="Calibri"/>
+        </w:rPr>
+        <w:br w:type="page"/>
+      </w:r>
+    </w:p>
+    <w:p>
+      <w:pPr>
+        <w:pStyle w:val="Heading1"/>
+        <w:rPr>
+          <w:rFonts w:cs="Calibri"/>
+        </w:rPr>
+      </w:pPr>
+      <w:bookmarkStart w:id="23" w:name="_Toc229578428"/>
+      <w:r>
+        <w:rPr>
+          <w:rFonts w:cs="Calibri"/>
+        </w:rPr>
+        <w:lastRenderedPageBreak/>
+        <w:t>References</w:t>
+      </w:r>
+      <w:bookmarkEnd w:id="23"/>
+    </w:p>
+    <w:p>
+      <w:pPr>
+        <w:rPr>
+          <w:rFonts w:cs="Calibri"/>
+        </w:rPr>
+      </w:pPr>
+      <w:r>
+        <w:rPr>
+          <w:rFonts w:cs="Calibri"/>
+        </w:rPr>
+        <w:t>Anliker, C., Lain, D. and Capkun, S. 2025. Phishing Attacks against Password Manager Browser Extensions. Proceedings of the 34th USENIX Security Symposium, Seattle, WA, USA, August 2025. Available at: </w:t>
+      </w:r>
+      <w:hyperlink r:id="rId23" w:tgtFrame="_blank" w:history="1">
+        <w:r>
+          <w:rPr>
+            <w:rStyle w:val="Hyperlink"/>
+            <w:rFonts w:cs="Calibri"/>
+          </w:rPr>
+          <w:t>https://www.research-collection.ethz.ch/handle/20.500.11850/783092</w:t>
+        </w:r>
+      </w:hyperlink>
+      <w:r>
+        <w:rPr>
+          <w:rFonts w:cs="Calibri"/>
+        </w:rPr>
+        <w:t> (Accessed 13 May 2026). </w:t>
+      </w:r>
+    </w:p>
+    <w:p>
+      <w:pPr>
+        <w:rPr>
+          <w:rFonts w:cs="Calibri"/>
+        </w:rPr>
+      </w:pPr>
+      <w:r>
+        <w:rPr>
+          <w:rFonts w:cs="Calibri"/>
+        </w:rPr>
+        <w:t>ENISA (European Union Agency for Cybersecurity). 2024. Reframing Cybersecurity Awareness Raising: Exploring the Human Factor in Cybersecurity Communication. Luxembourg: Publications Office of the European Union. Available at: </w:t>
+      </w:r>
+      <w:hyperlink r:id="rId24" w:tgtFrame="_blank" w:history="1">
+        <w:r>
+          <w:rPr>
+            <w:rStyle w:val="Hyperlink"/>
+            <w:rFonts w:cs="Calibri"/>
+          </w:rPr>
+          <w:t>https://www.enisa.europa.eu/news/reframing-cybersecurity-awareness-raising-exploring-the-human-factor-in-cybersecurity-communication</w:t>
+        </w:r>
+      </w:hyperlink>
+      <w:r>
+        <w:rPr>
+          <w:rFonts w:cs="Calibri"/>
+        </w:rPr>
+        <w:t> (Accessed 13 May 2026). </w:t>
+      </w:r>
+    </w:p>
+    <w:p>
+      <w:pPr>
+        <w:rPr>
+          <w:rFonts w:cs="Calibri"/>
+        </w:rPr>
+      </w:pPr>
+      <w:r>
+        <w:rPr>
+          <w:rFonts w:cs="Calibri"/>
+        </w:rPr>
+        <w:t>GCIS (Government Communication and Information System). 2025. Government Urges Vigilance Against Rising Cyber Threats. GCIS Media Release, 3 October 2025. Available at: </w:t>
+      </w:r>
+      <w:hyperlink r:id="rId25" w:tgtFrame="_blank" w:history="1">
+        <w:r>
+          <w:rPr>
+            <w:rStyle w:val="Hyperlink"/>
+            <w:rFonts w:cs="Calibri"/>
+          </w:rPr>
+          <w:t>https://www.gcis.gov.za/newsroom/media-releases/government-urges-vigilance-against-rising-cyber-threats</w:t>
+        </w:r>
+      </w:hyperlink>
+      <w:r>
+        <w:rPr>
+          <w:rFonts w:cs="Calibri"/>
+        </w:rPr>
+        <w:t> (Accessed 13 May 2026). </w:t>
+      </w:r>
+    </w:p>
+    <w:p>
+      <w:pPr>
+        <w:rPr>
+          <w:rFonts w:cs="Calibri"/>
+        </w:rPr>
+      </w:pPr>
+      <w:r>
+        <w:rPr>
+          <w:rFonts w:cs="Calibri"/>
+        </w:rPr>
+        <w:t>INTERPOL. 2026. Major Operation in Africa Targeting Online Scams Nets 651 Arrests, Recovers USD 4.3 Million. INTERPOL News, 18 February 2026. Available at: </w:t>
+      </w:r>
+      <w:hyperlink r:id="rId26" w:tgtFrame="_blank" w:history="1">
+        <w:r>
+          <w:rPr>
+            <w:rStyle w:val="Hyperlink"/>
+            <w:rFonts w:cs="Calibri"/>
+          </w:rPr>
+          <w:t>https://www.interpol.int/News-and-Events/News/2026/Major-operation-in-Africa-targeting-online-scams-nets-651-arrests-recovers-USD-4.3-million</w:t>
+        </w:r>
+      </w:hyperlink>
+      <w:r>
+        <w:rPr>
+          <w:rFonts w:cs="Calibri"/>
+        </w:rPr>
+        <w:t> (Accessed 13 May 2026). </w:t>
+      </w:r>
+    </w:p>
+    <w:p>
+      <w:pPr>
+        <w:rPr>
+          <w:rFonts w:cs="Calibri"/>
+        </w:rPr>
+      </w:pPr>
+      <w:r>
+        <w:rPr>
+          <w:rFonts w:cs="Calibri"/>
+        </w:rPr>
+        <w:t>Jannett, L. et al. 2025. Does Johnny Get the Message? Evaluating Cybersecurity Notifications for Everyday Users. arXiv e-prints, arXiv:2505.22435. Available at: </w:t>
+      </w:r>
+      <w:hyperlink r:id="rId27" w:tgtFrame="_blank" w:history="1">
+        <w:r>
+          <w:rPr>
+            <w:rStyle w:val="Hyperlink"/>
+            <w:rFonts w:cs="Calibri"/>
+          </w:rPr>
+          <w:t>https://ui.adsabs.harvard.edu/abs/2025arXiv250522435J/abstract</w:t>
+        </w:r>
+      </w:hyperlink>
+      <w:r>
+        <w:rPr>
+          <w:rFonts w:cs="Calibri"/>
+        </w:rPr>
+        <w:t> (Accessed 13 May 2026). </w:t>
+      </w:r>
+    </w:p>
+    <w:p>
+      <w:pPr>
+        <w:rPr>
+          <w:rFonts w:cs="Calibri"/>
+        </w:rPr>
+      </w:pPr>
+      <w:r>
+        <w:rPr>
+          <w:rFonts w:cs="Calibri"/>
+        </w:rPr>
+        <w:t>Kaspersky. 2026. Kaspersky Warns of Malware Aiming to Steal Data from Individuals and Organisations in South Africa. Kaspersky Press Release, 16 March 2026. Available at: </w:t>
+      </w:r>
+      <w:hyperlink r:id="rId28" w:tgtFrame="_blank" w:history="1">
+        <w:r>
+          <w:rPr>
+            <w:rStyle w:val="Hyperlink"/>
+            <w:rFonts w:cs="Calibri"/>
+          </w:rPr>
+          <w:t>https://www.kaspersky.co.za/about/press-releases/kaspersky-warns-of-malware-aiming-to-steal-data-from-individuals-and-organisations-in-south-africa</w:t>
+        </w:r>
+      </w:hyperlink>
+      <w:r>
+        <w:rPr>
+          <w:rFonts w:cs="Calibri"/>
+        </w:rPr>
+        <w:t> (Accessed 13 May 2026). </w:t>
+      </w:r>
+    </w:p>
+    <w:p>
+      <w:pPr>
+        <w:rPr>
+          <w:rFonts w:cs="Calibri"/>
+        </w:rPr>
+      </w:pPr>
+      <w:r>
+        <w:rPr>
+          <w:rFonts w:cs="Calibri"/>
+        </w:rPr>
+        <w:t>SAnews (South African Government News Agency). 2025. Stay Safe Online. </w:t>
+      </w:r>
+      <w:hyperlink r:id="rId29" w:tgtFrame="_blank" w:history="1">
+        <w:r>
+          <w:rPr>
+            <w:rStyle w:val="Hyperlink"/>
+            <w:rFonts w:cs="Calibri"/>
+          </w:rPr>
+          <w:t>SAnews.gov.za</w:t>
+        </w:r>
+      </w:hyperlink>
+      <w:r>
+        <w:rPr>
+          <w:rFonts w:cs="Calibri"/>
+        </w:rPr>
+        <w:t>, 5 October 2025. Available at: </w:t>
+      </w:r>
+      <w:hyperlink r:id="rId30" w:tgtFrame="_blank" w:history="1">
+        <w:r>
+          <w:rPr>
+            <w:rStyle w:val="Hyperlink"/>
+            <w:rFonts w:cs="Calibri"/>
+          </w:rPr>
+          <w:t>https://www.sanews.gov.za/south-africa/stay-safe-online</w:t>
+        </w:r>
+      </w:hyperlink>
+      <w:r>
+        <w:rPr>
+          <w:rFonts w:cs="Calibri"/>
+        </w:rPr>
+        <w:t> (Accessed 13 May 2026). </w:t>
+      </w:r>
+    </w:p>
+    <w:p>
+      <w:pPr>
+        <w:rPr>
+          <w:rFonts w:cs="Calibri"/>
+        </w:rPr>
+      </w:pPr>
+      <w:r>
+        <w:rPr>
+          <w:rFonts w:cs="Calibri"/>
+        </w:rPr>
+        <w:t>Tredger, C. 2026. The Ransomware Evolution: Rise of EDR Killers, AI-Powered Malware. ITWeb, 6 February 2026. Available at: </w:t>
+      </w:r>
+      <w:hyperlink r:id="rId31" w:tgtFrame="_blank" w:history="1">
+        <w:r>
+          <w:rPr>
+            <w:rStyle w:val="Hyperlink"/>
+            <w:rFonts w:cs="Calibri"/>
+          </w:rPr>
+          <w:t>https://www.itweb.co.za/article/the-ransomware-evolution-rise-of-edr-killers-ai-powered-malware/O2rQGqAEeRrqd1ea</w:t>
+        </w:r>
+      </w:hyperlink>
+      <w:r>
+        <w:rPr>
+          <w:rFonts w:cs="Calibri"/>
+        </w:rPr>
+        <w:t> (Accessed 13 May 2026). </w:t>
+      </w:r>
+    </w:p>
+    <w:p>
+      <w:pPr>
+        <w:rPr>
+          <w:rFonts w:cs="Calibri"/>
+        </w:rPr>
+      </w:pPr>
+      <w:r>
+        <w:rPr>
+          <w:rFonts w:cs="Calibri"/>
+        </w:rPr>
+        <w:t>Troelsen, A. and Japikse, P. (2021) </w:t>
+      </w:r>
+      <w:r>
+        <w:rPr>
+          <w:rFonts w:cs="Calibri"/>
+          <w:i/>
+          <w:iCs/>
+        </w:rPr>
+        <w:t>Pro C# 9 with .NET 5: foundational principles and practices in programming</w:t>
+      </w:r>
+      <w:r>
+        <w:rPr>
+          <w:rFonts w:cs="Calibri"/>
+        </w:rPr>
+        <w:t>. 10th edn. Berkeley, CA: Apress. doi: </w:t>
+      </w:r>
+      <w:hyperlink r:id="rId32" w:tgtFrame="_blank" w:history="1">
+        <w:r>
+          <w:rPr>
+            <w:rStyle w:val="Hyperlink"/>
+            <w:rFonts w:cs="Calibri"/>
+          </w:rPr>
+          <w:t>10.1007/978-1-4842-6939-8</w:t>
+        </w:r>
+      </w:hyperlink>
+    </w:p>
+    <w:p>
+      <w:pPr>
+        <w:rPr>
+          <w:rFonts w:cs="Calibri"/>
+        </w:rPr>
+      </w:pPr>
+    </w:p>
     <w:sectPr>
-      <w:footerReference w:type="default" r:id="rId17"/>
+      <w:footerReference w:type="default" r:id="rId33"/>
       <w:pgSz w:w="11906" w:h="16838"/>
       <w:pgMar w:top="1440" w:right="1440" w:bottom="1440" w:left="1440" w:header="708" w:footer="708" w:gutter="0"/>
       <w:pgNumType w:start="0"/>
@@ -6526,123 +8329,251 @@
 <w:ftr xmlns:wpc="http://schemas.microsoft.com/office/word/2010/wordprocessingCanvas" xmlns:cx="http://schemas.microsoft.com/office/drawing/2014/chartex" xmlns:cx1="http://schemas.microsoft.com/office/drawing/2015/9/8/chartex" xmlns:cx2="http://schemas.microsoft.com/office/drawing/2015/10/21/chartex" xmlns:cx3="http://schemas.microsoft.com/office/drawing/2016/5/9/chartex" xmlns:cx4="http://schemas.microsoft.com/office/drawing/2016/5/10/chartex" xmlns:cx5="http://schemas.microsoft.com/office/drawing/2016/5/11/chartex" xmlns:cx6="http://schemas.microsoft.com/office/drawing/2016/5/12/chartex" xmlns:cx7="http://schemas.microsoft.com/office/drawing/2016/5/13/chartex" xmlns:cx8="http://schemas.microsoft.com/office/drawing/2016/5/14/chartex" xmlns:mc="http://schemas.openxmlformats.org/markup-compatibility/2006" xmlns:aink="http://schemas.microsoft.com/office/drawing/2016/ink" xmlns:am3d="http://schemas.microsoft.com/office/drawing/2017/model3d" xmlns:o="urn:schemas-microsoft-com:office:office" xmlns:oel="http://schemas.microsoft.com/office/2019/extlst" xmlns:r="http://schemas.openxmlformats.org/officeDocument/2006/relationships" xmlns:m="http://schemas.openxmlformats.org/officeDocument/2006/math" xmlns:v="urn:schemas-microsoft-com:vml" xmlns:wp14="http://schemas.microsoft.com/office/word/2010/wordprocessingDrawing" xmlns:wp="http://schemas.openxmlformats.org/drawingml/2006/wordprocessingDrawing" xmlns:w10="urn:schemas-microsoft-com:office:word" xmlns:w="http://schemas.openxmlformats.org/wordprocessingml/2006/main" xmlns:w14="http://schemas.microsoft.com/office/word/2010/wordml" xmlns:w15="http://schemas.microsoft.com/office/word/2012/wordml" xmlns:w16cex="http://schemas.microsoft.com/office/word/2018/wordml/cex" xmlns:w16cid="http://schemas.microsoft.com/office/word/2016/wordml/cid" xmlns:w16="http://schemas.microsoft.com/office/word/2018/wordml" xmlns:w16du="http://schemas.microsoft.com/office/word/2023/wordml/word16du" xmlns:w16sdtdh="http://schemas.microsoft.com/office/word/2020/wordml/sdtdatahash" xmlns:w16sdtfl="http://schemas.microsoft.com/office/word/2024/wordml/sdtformatlock" xmlns:w16se="http://schemas.microsoft.com/office/word/2015/wordml/symex" xmlns:wpg="http://schemas.microsoft.com/office/word/2010/wordprocessingGroup" xmlns:wpi="http://schemas.microsoft.com/office/word/2010/wordprocessingInk" xmlns:wne="http://schemas.microsoft.com/office/word/2006/wordml" xmlns:wps="http://schemas.microsoft.com/office/word/2010/wordprocessingShape" mc:Ignorable="w14 w15 w16se w16cid w16 w16cex w16sdtdh w16sdtfl w16du wp14">
   <w:sdt>
     <w:sdtPr>
-      <w:id w:val="2021652461"/>
+      <w:id w:val="1956522448"/>
       <w:docPartObj>
         <w:docPartGallery w:val="Page Numbers (Bottom of Page)"/>
         <w:docPartUnique/>
       </w:docPartObj>
     </w:sdtPr>
-    <w:sdtEndPr/>
     <w:sdtContent>
-      <w:sdt>
-        <w:sdtPr>
-          <w:id w:val="1728636285"/>
-          <w:docPartObj>
-            <w:docPartGallery w:val="Page Numbers (Top of Page)"/>
-            <w:docPartUnique/>
-          </w:docPartObj>
-        </w:sdtPr>
-        <w:sdtEndPr/>
-        <w:sdtContent>
-          <w:p>
-            <w:pPr>
-              <w:pStyle w:val="Footer"/>
-              <w:jc w:val="center"/>
-            </w:pPr>
-            <w:r>
-              <w:t xml:space="preserve">Page </w:t>
-            </w:r>
-            <w:r>
-              <w:rPr>
-                <w:b/>
-                <w:bCs/>
-                <w:sz w:val="24"/>
-              </w:rPr>
-              <w:fldChar w:fldCharType="begin"/>
-            </w:r>
-            <w:r>
-              <w:rPr>
-                <w:b/>
-                <w:bCs/>
-              </w:rPr>
-              <w:instrText xml:space="preserve"> PAGE </w:instrText>
-            </w:r>
-            <w:r>
-              <w:rPr>
-                <w:b/>
-                <w:bCs/>
-                <w:sz w:val="24"/>
-              </w:rPr>
-              <w:fldChar w:fldCharType="separate"/>
-            </w:r>
-            <w:r>
-              <w:rPr>
-                <w:b/>
-                <w:bCs/>
-                <w:noProof/>
-              </w:rPr>
-              <w:t>2</w:t>
-            </w:r>
-            <w:r>
-              <w:rPr>
-                <w:b/>
-                <w:bCs/>
-                <w:sz w:val="24"/>
-              </w:rPr>
-              <w:fldChar w:fldCharType="end"/>
-            </w:r>
-            <w:r>
-              <w:t xml:space="preserve"> of </w:t>
-            </w:r>
-            <w:r>
-              <w:rPr>
-                <w:b/>
-                <w:bCs/>
-                <w:sz w:val="24"/>
-              </w:rPr>
-              <w:fldChar w:fldCharType="begin"/>
-            </w:r>
-            <w:r>
-              <w:rPr>
-                <w:b/>
-                <w:bCs/>
-              </w:rPr>
-              <w:instrText xml:space="preserve"> NUMPAGES  </w:instrText>
-            </w:r>
-            <w:r>
-              <w:rPr>
-                <w:b/>
-                <w:bCs/>
-                <w:sz w:val="24"/>
-              </w:rPr>
-              <w:fldChar w:fldCharType="separate"/>
-            </w:r>
-            <w:r>
-              <w:rPr>
-                <w:b/>
-                <w:bCs/>
-                <w:noProof/>
-              </w:rPr>
-              <w:t>2</w:t>
-            </w:r>
-            <w:r>
-              <w:rPr>
-                <w:b/>
-                <w:bCs/>
-                <w:sz w:val="24"/>
-              </w:rPr>
-              <w:fldChar w:fldCharType="end"/>
-            </w:r>
-          </w:p>
-        </w:sdtContent>
-      </w:sdt>
+      <w:p>
+        <w:pPr>
+          <w:pStyle w:val="Footer"/>
+        </w:pPr>
+        <w:r>
+          <w:rPr>
+            <w:noProof/>
+          </w:rPr>
+          <mc:AlternateContent>
+            <mc:Choice Requires="wps">
+              <w:drawing>
+                <wp:anchor distT="0" distB="0" distL="114300" distR="114300" simplePos="0" relativeHeight="251660288" behindDoc="0" locked="0" layoutInCell="1" allowOverlap="1" wp14:anchorId="27150770" wp14:editId="7310957C">
+                  <wp:simplePos x="0" y="0"/>
+                  <wp:positionH relativeFrom="margin">
+                    <wp:align>center</wp:align>
+                  </wp:positionH>
+                  <wp:positionV relativeFrom="bottomMargin">
+                    <wp:align>center</wp:align>
+                  </wp:positionV>
+                  <wp:extent cx="534670" cy="238760"/>
+                  <wp:effectExtent l="19050" t="19050" r="19685" b="18415"/>
+                  <wp:wrapNone/>
+                  <wp:docPr id="25116437" name="Double Bracket 49"/>
+                  <wp:cNvGraphicFramePr>
+                    <a:graphicFrameLocks xmlns:a="http://schemas.openxmlformats.org/drawingml/2006/main"/>
+                  </wp:cNvGraphicFramePr>
+                  <a:graphic xmlns:a="http://schemas.openxmlformats.org/drawingml/2006/main">
+                    <a:graphicData uri="http://schemas.microsoft.com/office/word/2010/wordprocessingShape">
+                      <wps:wsp>
+                        <wps:cNvSpPr>
+                          <a:spLocks noChangeArrowheads="1"/>
+                        </wps:cNvSpPr>
+                        <wps:spPr bwMode="auto">
+                          <a:xfrm>
+                            <a:off x="0" y="0"/>
+                            <a:ext cx="534670" cy="238760"/>
+                          </a:xfrm>
+                          <a:prstGeom prst="bracketPair">
+                            <a:avLst>
+                              <a:gd name="adj" fmla="val 16667"/>
+                            </a:avLst>
+                          </a:prstGeom>
+                          <a:solidFill>
+                            <a:srgbClr val="FFFFFF"/>
+                          </a:solidFill>
+                          <a:ln w="28575">
+                            <a:solidFill>
+                              <a:srgbClr val="808080"/>
+                            </a:solidFill>
+                            <a:round/>
+                            <a:headEnd/>
+                            <a:tailEnd/>
+                          </a:ln>
+                        </wps:spPr>
+                        <wps:txbx>
+                          <w:txbxContent>
+                            <w:p>
+                              <w:pPr>
+                                <w:jc w:val="center"/>
+                              </w:pPr>
+                              <w:r>
+                                <w:fldChar w:fldCharType="begin"/>
+                              </w:r>
+                              <w:r>
+                                <w:instrText xml:space="preserve"> PAGE    \* MERGEFORMAT </w:instrText>
+                              </w:r>
+                              <w:r>
+                                <w:fldChar w:fldCharType="separate"/>
+                              </w:r>
+                              <w:r>
+                                <w:rPr>
+                                  <w:noProof/>
+                                </w:rPr>
+                                <w:t>2</w:t>
+                              </w:r>
+                              <w:r>
+                                <w:rPr>
+                                  <w:noProof/>
+                                </w:rPr>
+                                <w:fldChar w:fldCharType="end"/>
+                              </w:r>
+                            </w:p>
+                          </w:txbxContent>
+                        </wps:txbx>
+                        <wps:bodyPr rot="0" vert="horz" wrap="square" lIns="91440" tIns="0" rIns="91440" bIns="0" anchor="t" anchorCtr="0" upright="1">
+                          <a:noAutofit/>
+                        </wps:bodyPr>
+                      </wps:wsp>
+                    </a:graphicData>
+                  </a:graphic>
+                  <wp14:sizeRelH relativeFrom="margin">
+                    <wp14:pctWidth>10000</wp14:pctWidth>
+                  </wp14:sizeRelH>
+                  <wp14:sizeRelV relativeFrom="bottomMargin">
+                    <wp14:pctHeight>0</wp14:pctHeight>
+                  </wp14:sizeRelV>
+                </wp:anchor>
+              </w:drawing>
+            </mc:Choice>
+            <mc:Fallback>
+              <w:pict>
+                <v:shapetype w14:anchorId="27150770" id="_x0000_t185" coordsize="21600,21600" o:spt="185" adj="3600" path="m@0,nfqx0@0l0@2qy@0,21600em@1,nfqx21600@0l21600@2qy@1,21600em@0,nsqx0@0l0@2qy@0,21600l@1,21600qx21600@2l21600@0qy@1,xe" filled="f">
+                  <v:formulas>
+                    <v:f eqn="val #0"/>
+                    <v:f eqn="sum width 0 #0"/>
+                    <v:f eqn="sum height 0 #0"/>
+                    <v:f eqn="prod @0 2929 10000"/>
+                    <v:f eqn="sum width 0 @3"/>
+                    <v:f eqn="sum height 0 @3"/>
+                    <v:f eqn="val width"/>
+                    <v:f eqn="val height"/>
+                    <v:f eqn="prod width 1 2"/>
+                    <v:f eqn="prod height 1 2"/>
+                  </v:formulas>
+                  <v:path o:extrusionok="f" gradientshapeok="t" limo="10800,10800" o:connecttype="custom" o:connectlocs="@8,0;0,@9;@8,@7;@6,@9" textboxrect="@3,@3,@4,@5"/>
+                  <v:handles>
+                    <v:h position="#0,topLeft" switch="" xrange="0,10800"/>
+                  </v:handles>
+                </v:shapetype>
+                <v:shape id="Double Bracket 49" o:spid="_x0000_s1057" type="#_x0000_t185" style="position:absolute;margin-left:0;margin-top:0;width:42.1pt;height:18.8pt;z-index:251660288;visibility:visible;mso-wrap-style:square;mso-width-percent:100;mso-height-percent:0;mso-wrap-distance-left:9pt;mso-wrap-distance-top:0;mso-wrap-distance-right:9pt;mso-wrap-distance-bottom:0;mso-position-horizontal:center;mso-position-horizontal-relative:margin;mso-position-vertical:center;mso-position-vertical-relative:bottom-margin-area;mso-width-percent:100;mso-height-percent:0;mso-width-relative:margin;mso-height-relative:bottom-margin-area;v-text-anchor:top" o:gfxdata="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" filled="t" strokecolor="gray" strokeweight="2.25pt">
+                  <v:textbox inset=",0,,0">
+                    <w:txbxContent>
+                      <w:p>
+                        <w:pPr>
+                          <w:jc w:val="center"/>
+                        </w:pPr>
+                        <w:r>
+                          <w:fldChar w:fldCharType="begin"/>
+                        </w:r>
+                        <w:r>
+                          <w:instrText xml:space="preserve"> PAGE    \* MERGEFORMAT </w:instrText>
+                        </w:r>
+                        <w:r>
+                          <w:fldChar w:fldCharType="separate"/>
+                        </w:r>
+                        <w:r>
+                          <w:rPr>
+                            <w:noProof/>
+                          </w:rPr>
+                          <w:t>2</w:t>
+                        </w:r>
+                        <w:r>
+                          <w:rPr>
+                            <w:noProof/>
+                          </w:rPr>
+                          <w:fldChar w:fldCharType="end"/>
+                        </w:r>
+                      </w:p>
+                    </w:txbxContent>
+                  </v:textbox>
+                  <w10:wrap anchorx="margin" anchory="margin"/>
+                </v:shape>
+              </w:pict>
+            </mc:Fallback>
+          </mc:AlternateContent>
+        </w:r>
+        <w:r>
+          <w:rPr>
+            <w:noProof/>
+          </w:rPr>
+          <mc:AlternateContent>
+            <mc:Choice Requires="wps">
+              <w:drawing>
+                <wp:anchor distT="0" distB="0" distL="114300" distR="114300" simplePos="0" relativeHeight="251659264" behindDoc="0" locked="0" layoutInCell="1" allowOverlap="1" wp14:anchorId="6CCB2A14" wp14:editId="4D9CE9E9">
+                  <wp:simplePos x="0" y="0"/>
+                  <wp:positionH relativeFrom="margin">
+                    <wp:align>center</wp:align>
+                  </wp:positionH>
+                  <wp:positionV relativeFrom="bottomMargin">
+                    <wp:align>center</wp:align>
+                  </wp:positionV>
+                  <wp:extent cx="5518150" cy="0"/>
+                  <wp:effectExtent l="9525" t="9525" r="6350" b="9525"/>
+                  <wp:wrapNone/>
+                  <wp:docPr id="922542558" name="Straight Arrow Connector 48"/>
+                  <wp:cNvGraphicFramePr>
+                    <a:graphicFrameLocks xmlns:a="http://schemas.openxmlformats.org/drawingml/2006/main"/>
+                  </wp:cNvGraphicFramePr>
+                  <a:graphic xmlns:a="http://schemas.openxmlformats.org/drawingml/2006/main">
+                    <a:graphicData uri="http://schemas.microsoft.com/office/word/2010/wordprocessingShape">
+                      <wps:wsp>
+                        <wps:cNvCnPr>
+                          <a:cxnSpLocks noChangeShapeType="1"/>
+                        </wps:cNvCnPr>
+                        <wps:spPr bwMode="auto">
+                          <a:xfrm>
+                            <a:off x="0" y="0"/>
+                            <a:ext cx="5518150" cy="0"/>
+                          </a:xfrm>
+                          <a:prstGeom prst="straightConnector1">
+                            <a:avLst/>
+                          </a:prstGeom>
+                          <a:noFill/>
+                          <a:ln w="12700">
+                            <a:solidFill>
+                              <a:srgbClr val="808080"/>
+                            </a:solidFill>
+                            <a:round/>
+                            <a:headEnd/>
+                            <a:tailEnd/>
+                          </a:ln>
+                          <a:extLst>
+                            <a:ext uri="{909E8E84-426E-40DD-AFC4-6F175D3DCCD1}">
+                              <a14:hiddenFill xmlns:a14="http://schemas.microsoft.com/office/drawing/2010/main">
+                                <a:noFill/>
+                              </a14:hiddenFill>
+                            </a:ext>
+                          </a:extLst>
+                        </wps:spPr>
+                        <wps:bodyPr/>
+                      </wps:wsp>
+                    </a:graphicData>
+                  </a:graphic>
+                  <wp14:sizeRelH relativeFrom="page">
+                    <wp14:pctWidth>0</wp14:pctWidth>
+                  </wp14:sizeRelH>
+                  <wp14:sizeRelV relativeFrom="bottomMargin">
+                    <wp14:pctHeight>0</wp14:pctHeight>
+                  </wp14:sizeRelV>
+                </wp:anchor>
+              </w:drawing>
+            </mc:Choice>
+            <mc:Fallback>
+              <w:pict>
+                <v:shapetype w14:anchorId="082177AF" id="_x0000_t32" coordsize="21600,21600" o:spt="32" o:oned="t" path="m,l21600,21600e" filled="f">
+                  <v:path arrowok="t" fillok="f" o:connecttype="none"/>
+                  <o:lock v:ext="edit" shapetype="t"/>
+                </v:shapetype>
+                <v:shape id="Straight Arrow Connector 48" o:spid="_x0000_s1026" type="#_x0000_t32" style="position:absolute;margin-left:0;margin-top:0;width:434.5pt;height:0;z-index:251659264;visibility:visible;mso-wrap-style:square;mso-width-percent:0;mso-height-percent:0;mso-wrap-distance-left:9pt;mso-wrap-distance-top:0;mso-wrap-distance-right:9pt;mso-wrap-distance-bottom:0;mso-position-horizontal:center;mso-position-horizontal-relative:margin;mso-position-vertical:center;mso-position-vertical-relative:bottom-margin-area;mso-width-percent:0;mso-height-percent:0;mso-width-relative:page;mso-height-relative:bottom-margin-area" o:gfxdata="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" strokecolor="gray" strokeweight="1pt">
+                  <w10:wrap anchorx="margin" anchory="margin"/>
+                </v:shape>
+              </w:pict>
+            </mc:Fallback>
+          </mc:AlternateContent>
+        </w:r>
+      </w:p>
     </w:sdtContent>
   </w:sdt>
-  <w:p>
-    <w:pPr>
-      <w:pStyle w:val="Footer"/>
-    </w:pPr>
-  </w:p>
 </w:ftr>
 </file>
 
@@ -6900,6 +8831,232 @@
     </w:lvl>
   </w:abstractNum>
   <w:abstractNum w:abstractNumId="2" w15:restartNumberingAfterBreak="0">
+    <w:nsid w:val="3F6C4EFA"/>
+    <w:multiLevelType w:val="multilevel"/>
+    <w:tmpl w:val="47783CBE"/>
+    <w:lvl w:ilvl="0">
+      <w:start w:val="1"/>
+      <w:numFmt w:val="decimal"/>
+      <w:lvlText w:val="%1."/>
+      <w:lvlJc w:val="left"/>
+      <w:pPr>
+        <w:tabs>
+          <w:tab w:val="num" w:pos="720"/>
+        </w:tabs>
+        <w:ind w:left="720" w:hanging="360"/>
+      </w:pPr>
+    </w:lvl>
+    <w:lvl w:ilvl="1" w:tentative="1">
+      <w:start w:val="1"/>
+      <w:numFmt w:val="decimal"/>
+      <w:lvlText w:val="%2."/>
+      <w:lvlJc w:val="left"/>
+      <w:pPr>
+        <w:tabs>
+          <w:tab w:val="num" w:pos="1440"/>
+        </w:tabs>
+        <w:ind w:left="1440" w:hanging="360"/>
+      </w:pPr>
+    </w:lvl>
+    <w:lvl w:ilvl="2" w:tentative="1">
+      <w:start w:val="1"/>
+      <w:numFmt w:val="decimal"/>
+      <w:lvlText w:val="%3."/>
+      <w:lvlJc w:val="left"/>
+      <w:pPr>
+        <w:tabs>
+          <w:tab w:val="num" w:pos="2160"/>
+        </w:tabs>
+        <w:ind w:left="2160" w:hanging="360"/>
+      </w:pPr>
+    </w:lvl>
+    <w:lvl w:ilvl="3" w:tentative="1">
+      <w:start w:val="1"/>
+      <w:numFmt w:val="decimal"/>
+      <w:lvlText w:val="%4."/>
+      <w:lvlJc w:val="left"/>
+      <w:pPr>
+        <w:tabs>
+          <w:tab w:val="num" w:pos="2880"/>
+        </w:tabs>
+        <w:ind w:left="2880" w:hanging="360"/>
+      </w:pPr>
+    </w:lvl>
+    <w:lvl w:ilvl="4" w:tentative="1">
+      <w:start w:val="1"/>
+      <w:numFmt w:val="decimal"/>
+      <w:lvlText w:val="%5."/>
+      <w:lvlJc w:val="left"/>
+      <w:pPr>
+        <w:tabs>
+          <w:tab w:val="num" w:pos="3600"/>
+        </w:tabs>
+        <w:ind w:left="3600" w:hanging="360"/>
+      </w:pPr>
+    </w:lvl>
+    <w:lvl w:ilvl="5" w:tentative="1">
+      <w:start w:val="1"/>
+      <w:numFmt w:val="decimal"/>
+      <w:lvlText w:val="%6."/>
+      <w:lvlJc w:val="left"/>
+      <w:pPr>
+        <w:tabs>
+          <w:tab w:val="num" w:pos="4320"/>
+        </w:tabs>
+        <w:ind w:left="4320" w:hanging="360"/>
+      </w:pPr>
+    </w:lvl>
+    <w:lvl w:ilvl="6" w:tentative="1">
+      <w:start w:val="1"/>
+      <w:numFmt w:val="decimal"/>
+      <w:lvlText w:val="%7."/>
+      <w:lvlJc w:val="left"/>
+      <w:pPr>
+        <w:tabs>
+          <w:tab w:val="num" w:pos="5040"/>
+        </w:tabs>
+        <w:ind w:left="5040" w:hanging="360"/>
+      </w:pPr>
+    </w:lvl>
+    <w:lvl w:ilvl="7" w:tentative="1">
+      <w:start w:val="1"/>
+      <w:numFmt w:val="decimal"/>
+      <w:lvlText w:val="%8."/>
+      <w:lvlJc w:val="left"/>
+      <w:pPr>
+        <w:tabs>
+          <w:tab w:val="num" w:pos="5760"/>
+        </w:tabs>
+        <w:ind w:left="5760" w:hanging="360"/>
+      </w:pPr>
+    </w:lvl>
+    <w:lvl w:ilvl="8" w:tentative="1">
+      <w:start w:val="1"/>
+      <w:numFmt w:val="decimal"/>
+      <w:lvlText w:val="%9."/>
+      <w:lvlJc w:val="left"/>
+      <w:pPr>
+        <w:tabs>
+          <w:tab w:val="num" w:pos="6480"/>
+        </w:tabs>
+        <w:ind w:left="6480" w:hanging="360"/>
+      </w:pPr>
+    </w:lvl>
+  </w:abstractNum>
+  <w:abstractNum w:abstractNumId="3" w15:restartNumberingAfterBreak="0">
+    <w:nsid w:val="428A632B"/>
+    <w:multiLevelType w:val="multilevel"/>
+    <w:tmpl w:val="79BC9522"/>
+    <w:lvl w:ilvl="0">
+      <w:start w:val="5"/>
+      <w:numFmt w:val="decimal"/>
+      <w:lvlText w:val="%1."/>
+      <w:lvlJc w:val="left"/>
+      <w:pPr>
+        <w:tabs>
+          <w:tab w:val="num" w:pos="720"/>
+        </w:tabs>
+        <w:ind w:left="720" w:hanging="360"/>
+      </w:pPr>
+    </w:lvl>
+    <w:lvl w:ilvl="1" w:tentative="1">
+      <w:start w:val="1"/>
+      <w:numFmt w:val="decimal"/>
+      <w:lvlText w:val="%2."/>
+      <w:lvlJc w:val="left"/>
+      <w:pPr>
+        <w:tabs>
+          <w:tab w:val="num" w:pos="1440"/>
+        </w:tabs>
+        <w:ind w:left="1440" w:hanging="360"/>
+      </w:pPr>
+    </w:lvl>
+    <w:lvl w:ilvl="2" w:tentative="1">
+      <w:start w:val="1"/>
+      <w:numFmt w:val="decimal"/>
+      <w:lvlText w:val="%3."/>
+      <w:lvlJc w:val="left"/>
+      <w:pPr>
+        <w:tabs>
+          <w:tab w:val="num" w:pos="2160"/>
+        </w:tabs>
+        <w:ind w:left="2160" w:hanging="360"/>
+      </w:pPr>
+    </w:lvl>
+    <w:lvl w:ilvl="3" w:tentative="1">
+      <w:start w:val="1"/>
+      <w:numFmt w:val="decimal"/>
+      <w:lvlText w:val="%4."/>
+      <w:lvlJc w:val="left"/>
+      <w:pPr>
+        <w:tabs>
+          <w:tab w:val="num" w:pos="2880"/>
+        </w:tabs>
+        <w:ind w:left="2880" w:hanging="360"/>
+      </w:pPr>
+    </w:lvl>
+    <w:lvl w:ilvl="4" w:tentative="1">
+      <w:start w:val="1"/>
+      <w:numFmt w:val="decimal"/>
+      <w:lvlText w:val="%5."/>
+      <w:lvlJc w:val="left"/>
+      <w:pPr>
+        <w:tabs>
+          <w:tab w:val="num" w:pos="3600"/>
+        </w:tabs>
+        <w:ind w:left="3600" w:hanging="360"/>
+      </w:pPr>
+    </w:lvl>
+    <w:lvl w:ilvl="5" w:tentative="1">
+      <w:start w:val="1"/>
+      <w:numFmt w:val="decimal"/>
+      <w:lvlText w:val="%6."/>
+      <w:lvlJc w:val="left"/>
+      <w:pPr>
+        <w:tabs>
+          <w:tab w:val="num" w:pos="4320"/>
+        </w:tabs>
+        <w:ind w:left="4320" w:hanging="360"/>
+      </w:pPr>
+    </w:lvl>
+    <w:lvl w:ilvl="6" w:tentative="1">
+      <w:start w:val="1"/>
+      <w:numFmt w:val="decimal"/>
+      <w:lvlText w:val="%7."/>
+      <w:lvlJc w:val="left"/>
+      <w:pPr>
+        <w:tabs>
+          <w:tab w:val="num" w:pos="5040"/>
+        </w:tabs>
+        <w:ind w:left="5040" w:hanging="360"/>
+      </w:pPr>
+    </w:lvl>
+    <w:lvl w:ilvl="7" w:tentative="1">
+      <w:start w:val="1"/>
+      <w:numFmt w:val="decimal"/>
+      <w:lvlText w:val="%8."/>
+      <w:lvlJc w:val="left"/>
+      <w:pPr>
+        <w:tabs>
+          <w:tab w:val="num" w:pos="5760"/>
+        </w:tabs>
+        <w:ind w:left="5760" w:hanging="360"/>
+      </w:pPr>
+    </w:lvl>
+    <w:lvl w:ilvl="8" w:tentative="1">
+      <w:start w:val="1"/>
+      <w:numFmt w:val="decimal"/>
+      <w:lvlText w:val="%9."/>
+      <w:lvlJc w:val="left"/>
+      <w:pPr>
+        <w:tabs>
+          <w:tab w:val="num" w:pos="6480"/>
+        </w:tabs>
+        <w:ind w:left="6480" w:hanging="360"/>
+      </w:pPr>
+    </w:lvl>
+  </w:abstractNum>
+  <w:abstractNum w:abstractNumId="4" w15:restartNumberingAfterBreak="0">
     <w:nsid w:val="4D464576"/>
     <w:multiLevelType w:val="multilevel"/>
     <w:tmpl w:val="10DE83EE"/>
@@ -7012,7 +9169,7 @@
       </w:pPr>
     </w:lvl>
   </w:abstractNum>
-  <w:abstractNum w:abstractNumId="3" w15:restartNumberingAfterBreak="0">
+  <w:abstractNum w:abstractNumId="5" w15:restartNumberingAfterBreak="0">
     <w:nsid w:val="69913091"/>
     <w:multiLevelType w:val="multilevel"/>
     <w:tmpl w:val="C060C4AC"/>
@@ -7162,7 +9319,7 @@
     </w:lvl>
   </w:abstractNum>
   <w:num w:numId="1" w16cid:durableId="1423909869">
-    <w:abstractNumId w:val="2"/>
+    <w:abstractNumId w:val="4"/>
   </w:num>
   <w:num w:numId="2" w16cid:durableId="814495657">
     <w:abstractNumId w:val="1"/>
@@ -7171,6 +9328,12 @@
     <w:abstractNumId w:val="0"/>
   </w:num>
   <w:num w:numId="4" w16cid:durableId="921060448">
+    <w:abstractNumId w:val="5"/>
+  </w:num>
+  <w:num w:numId="5" w16cid:durableId="1704555080">
+    <w:abstractNumId w:val="2"/>
+  </w:num>
+  <w:num w:numId="6" w16cid:durableId="1627153078">
     <w:abstractNumId w:val="3"/>
   </w:num>
 </w:numbering>

</xml_diff>

<commit_message>
Completed POE Part 2
</commit_message>
<xml_diff>
--- a/Part 2/ST10493664_PROG6221_POE_Part2.docx
+++ b/Part 2/ST10493664_PROG6221_POE_Part2.docx
@@ -13,7 +13,6 @@
           <w:docPartUnique/>
         </w:docPartObj>
       </w:sdtPr>
-      <w:sdtEndPr/>
       <w:sdtContent>
         <w:p>
           <w:pPr>
@@ -30,7 +29,7 @@
             <mc:AlternateContent>
               <mc:Choice Requires="wpg">
                 <w:drawing>
-                  <wp:anchor distT="0" distB="0" distL="114300" distR="114300" simplePos="0" relativeHeight="251659264" behindDoc="1" locked="0" layoutInCell="1" allowOverlap="1" wp14:anchorId="08B6B0CD" wp14:editId="63A96C35">
+                  <wp:anchor distT="0" distB="0" distL="114300" distR="114300" simplePos="0" relativeHeight="251658240" behindDoc="1" locked="0" layoutInCell="1" allowOverlap="1" wp14:anchorId="08B6B0CD" wp14:editId="63A96C35">
                     <wp:simplePos x="0" y="0"/>
                     <mc:AlternateContent>
                       <mc:Choice Requires="wp14">
@@ -157,7 +156,6 @@
                                       <w:calendar w:val="gregorian"/>
                                     </w:date>
                                   </w:sdtPr>
-                                  <w:sdtEndPr/>
                                   <w:sdtContent>
                                     <w:p>
                                       <w:pPr>
@@ -3436,7 +3434,7 @@
               </mc:Choice>
               <mc:Fallback>
                 <w:pict>
-                  <v:group w14:anchorId="08B6B0CD" id="Group 26" o:spid="_x0000_s1026" style="position:absolute;margin-left:0;margin-top:0;width:172.8pt;height:718.55pt;z-index:-251657216;mso-width-percent:330;mso-height-percent:950;mso-left-percent:40;mso-position-horizontal-relative:page;mso-position-vertical:center;mso-position-vertical-relative:page;mso-width-percent:330;mso-height-percent:950;mso-left-percent:40" coordsize="21945,91257" o:gfxdata="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">
+                  <v:group w14:anchorId="08B6B0CD" id="Group 26" o:spid="_x0000_s1026" style="position:absolute;margin-left:0;margin-top:0;width:172.8pt;height:718.55pt;z-index:-251658240;mso-width-percent:330;mso-height-percent:950;mso-left-percent:40;mso-position-horizontal-relative:page;mso-position-vertical:center;mso-position-vertical-relative:page;mso-width-percent:330;mso-height-percent:950;mso-left-percent:40" coordsize="21945,91257" o:gfxdata="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">
                     <v:rect id="Rectangle 3" o:spid="_x0000_s1027" style="position:absolute;width:1945;height:91257;visibility:visible;mso-wrap-style:square;v-text-anchor:middle" o:gfxdata="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" fillcolor="#0e2841 [3215]" stroked="f" strokeweight="1pt"/>
                     <v:shapetype id="_x0000_t15" coordsize="21600,21600" o:spt="15" adj="16200" path="m@0,l,,,21600@0,21600,21600,10800xe">
                       <v:stroke joinstyle="miter"/>
@@ -3471,7 +3469,6 @@
                                 <w:calendar w:val="gregorian"/>
                               </w:date>
                             </w:sdtPr>
-                            <w:sdtEndPr/>
                             <w:sdtContent>
                               <w:p>
                                 <w:pPr>
@@ -3610,7 +3607,7 @@
             <mc:AlternateContent>
               <mc:Choice Requires="wps">
                 <w:drawing>
-                  <wp:anchor distT="0" distB="0" distL="114300" distR="114300" simplePos="0" relativeHeight="251660288" behindDoc="0" locked="0" layoutInCell="1" allowOverlap="1" wp14:anchorId="114ADB80" wp14:editId="0D8BD4EB">
+                  <wp:anchor distT="0" distB="0" distL="114300" distR="114300" simplePos="0" relativeHeight="251658241" behindDoc="0" locked="0" layoutInCell="1" allowOverlap="1" wp14:anchorId="114ADB80" wp14:editId="0D8BD4EB">
                     <wp:simplePos x="0" y="0"/>
                     <mc:AlternateContent>
                       <mc:Choice Requires="wp14">
@@ -3698,7 +3695,6 @@
                                     <w:dataBinding w:prefixMappings="xmlns:ns0='http://purl.org/dc/elements/1.1/' xmlns:ns1='http://schemas.openxmlformats.org/package/2006/metadata/core-properties' " w:xpath="/ns1:coreProperties[1]/ns0:title[1]" w:storeItemID="{6C3C8BC8-F283-45AE-878A-BAB7291924A1}"/>
                                     <w:text/>
                                   </w:sdtPr>
-                                  <w:sdtEndPr/>
                                   <w:sdtContent>
                                     <w:r>
                                       <w:rPr>
@@ -3734,7 +3730,6 @@
                                     <w:dataBinding w:prefixMappings="xmlns:ns0='http://purl.org/dc/elements/1.1/' xmlns:ns1='http://schemas.openxmlformats.org/package/2006/metadata/core-properties' " w:xpath="/ns1:coreProperties[1]/ns0:subject[1]" w:storeItemID="{6C3C8BC8-F283-45AE-878A-BAB7291924A1}"/>
                                     <w:text/>
                                   </w:sdtPr>
-                                  <w:sdtEndPr/>
                                   <w:sdtContent>
                                     <w:r>
                                       <w:rPr>
@@ -3797,7 +3792,7 @@
                     <v:stroke joinstyle="miter"/>
                     <v:path gradientshapeok="t" o:connecttype="rect"/>
                   </v:shapetype>
-                  <v:shape id="Text Box 30" o:spid="_x0000_s1055" type="#_x0000_t202" style="position:absolute;margin-left:0;margin-top:0;width:4in;height:84.25pt;z-index:251660288;visibility:visible;mso-wrap-style:square;mso-width-percent:450;mso-height-percent:0;mso-left-percent:420;mso-top-percent:175;mso-wrap-distance-left:9pt;mso-wrap-distance-top:0;mso-wrap-distance-right:9pt;mso-wrap-distance-bottom:0;mso-position-horizontal-relative:page;mso-position-vertical-relative:page;mso-width-percent:450;mso-height-percent:0;mso-left-percent:420;mso-top-percent:175;mso-width-relative:page;mso-height-relative:margin;v-text-anchor:top" o:gfxdata="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" filled="f" stroked="f" strokeweight=".5pt">
+                  <v:shape id="Text Box 30" o:spid="_x0000_s1055" type="#_x0000_t202" style="position:absolute;margin-left:0;margin-top:0;width:4in;height:84.25pt;z-index:251658241;visibility:visible;mso-wrap-style:square;mso-width-percent:450;mso-height-percent:0;mso-left-percent:420;mso-top-percent:175;mso-wrap-distance-left:9pt;mso-wrap-distance-top:0;mso-wrap-distance-right:9pt;mso-wrap-distance-bottom:0;mso-position-horizontal-relative:page;mso-position-vertical-relative:page;mso-width-percent:450;mso-height-percent:0;mso-left-percent:420;mso-top-percent:175;mso-width-relative:page;mso-height-relative:margin;v-text-anchor:top" o:gfxdata="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" filled="f" stroked="f" strokeweight=".5pt">
                     <v:textbox style="mso-fit-shape-to-text:t" inset="0,0,0,0">
                       <w:txbxContent>
                         <w:p>
@@ -3823,7 +3818,6 @@
                               <w:dataBinding w:prefixMappings="xmlns:ns0='http://purl.org/dc/elements/1.1/' xmlns:ns1='http://schemas.openxmlformats.org/package/2006/metadata/core-properties' " w:xpath="/ns1:coreProperties[1]/ns0:title[1]" w:storeItemID="{6C3C8BC8-F283-45AE-878A-BAB7291924A1}"/>
                               <w:text/>
                             </w:sdtPr>
-                            <w:sdtEndPr/>
                             <w:sdtContent>
                               <w:r>
                                 <w:rPr>
@@ -3859,7 +3853,6 @@
                               <w:dataBinding w:prefixMappings="xmlns:ns0='http://purl.org/dc/elements/1.1/' xmlns:ns1='http://schemas.openxmlformats.org/package/2006/metadata/core-properties' " w:xpath="/ns1:coreProperties[1]/ns0:subject[1]" w:storeItemID="{6C3C8BC8-F283-45AE-878A-BAB7291924A1}"/>
                               <w:text/>
                             </w:sdtPr>
-                            <w:sdtEndPr/>
                             <w:sdtContent>
                               <w:r>
                                 <w:rPr>
@@ -3912,7 +3905,7 @@
             <mc:AlternateContent>
               <mc:Choice Requires="wps">
                 <w:drawing>
-                  <wp:anchor distT="45720" distB="45720" distL="114300" distR="114300" simplePos="0" relativeHeight="251662336" behindDoc="0" locked="0" layoutInCell="1" allowOverlap="1" wp14:anchorId="44D81A3C" wp14:editId="1AA5DC9A">
+                  <wp:anchor distT="45720" distB="45720" distL="114300" distR="114300" simplePos="0" relativeHeight="251658242" behindDoc="0" locked="0" layoutInCell="1" allowOverlap="1" wp14:anchorId="44D81A3C" wp14:editId="1AA5DC9A">
                     <wp:simplePos x="0" y="0"/>
                     <wp:positionH relativeFrom="column">
                       <wp:posOffset>3812684</wp:posOffset>
@@ -4014,7 +4007,7 @@
               </mc:Choice>
               <mc:Fallback>
                 <w:pict>
-                  <v:shape w14:anchorId="44D81A3C" id="Text Box 2" o:spid="_x0000_s1056" type="#_x0000_t202" style="position:absolute;margin-left:300.2pt;margin-top:582.15pt;width:185.9pt;height:110.6pt;z-index:251662336;visibility:visible;mso-wrap-style:square;mso-width-percent:400;mso-height-percent:200;mso-wrap-distance-left:9pt;mso-wrap-distance-top:3.6pt;mso-wrap-distance-right:9pt;mso-wrap-distance-bottom:3.6pt;mso-position-horizontal:absolute;mso-position-horizontal-relative:text;mso-position-vertical:absolute;mso-position-vertical-relative:text;mso-width-percent:400;mso-height-percent:200;mso-width-relative:margin;mso-height-relative:margin;v-text-anchor:top" o:gfxdata="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" filled="f" stroked="f">
+                  <v:shape w14:anchorId="44D81A3C" id="Text Box 2" o:spid="_x0000_s1056" type="#_x0000_t202" style="position:absolute;margin-left:300.2pt;margin-top:582.15pt;width:185.9pt;height:110.6pt;z-index:251658242;visibility:visible;mso-wrap-style:square;mso-width-percent:400;mso-height-percent:200;mso-wrap-distance-left:9pt;mso-wrap-distance-top:3.6pt;mso-wrap-distance-right:9pt;mso-wrap-distance-bottom:3.6pt;mso-position-horizontal:absolute;mso-position-horizontal-relative:text;mso-position-vertical:absolute;mso-position-vertical-relative:text;mso-width-percent:400;mso-height-percent:200;mso-width-relative:margin;mso-height-relative:margin;v-text-anchor:top" o:gfxdata="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" filled="f" stroked="f">
                     <v:textbox style="mso-fit-shape-to-text:t">
                       <w:txbxContent>
                         <w:p>
@@ -4167,7 +4160,7 @@
             </w:rPr>
             <w:fldChar w:fldCharType="separate"/>
           </w:r>
-          <w:hyperlink w:anchor="_Toc229580144" w:history="1">
+          <w:hyperlink w:anchor="_Toc229593470" w:history="1">
             <w:r>
               <w:rPr>
                 <w:rStyle w:val="Hyperlink"/>
@@ -4195,7 +4188,7 @@
                 <w:noProof/>
                 <w:webHidden/>
               </w:rPr>
-              <w:instrText xml:space="preserve"> PAGEREF _Toc229580144 \h </w:instrText>
+              <w:instrText xml:space="preserve"> PAGEREF _Toc229593470 \h </w:instrText>
             </w:r>
             <w:r>
               <w:rPr>
@@ -4239,7 +4232,7 @@
               <w:lang w:eastAsia="en-ZA"/>
             </w:rPr>
           </w:pPr>
-          <w:hyperlink w:anchor="_Toc229580145" w:history="1">
+          <w:hyperlink w:anchor="_Toc229593471" w:history="1">
             <w:r>
               <w:rPr>
                 <w:rStyle w:val="Hyperlink"/>
@@ -4267,7 +4260,7 @@
                 <w:noProof/>
                 <w:webHidden/>
               </w:rPr>
-              <w:instrText xml:space="preserve"> PAGEREF _Toc229580145 \h </w:instrText>
+              <w:instrText xml:space="preserve"> PAGEREF _Toc229593471 \h </w:instrText>
             </w:r>
             <w:r>
               <w:rPr>
@@ -4311,7 +4304,7 @@
               <w:lang w:eastAsia="en-ZA"/>
             </w:rPr>
           </w:pPr>
-          <w:hyperlink w:anchor="_Toc229580146" w:history="1">
+          <w:hyperlink w:anchor="_Toc229593472" w:history="1">
             <w:r>
               <w:rPr>
                 <w:rStyle w:val="Hyperlink"/>
@@ -4339,7 +4332,7 @@
                 <w:noProof/>
                 <w:webHidden/>
               </w:rPr>
-              <w:instrText xml:space="preserve"> PAGEREF _Toc229580146 \h </w:instrText>
+              <w:instrText xml:space="preserve"> PAGEREF _Toc229593472 \h </w:instrText>
             </w:r>
             <w:r>
               <w:rPr>
@@ -4383,7 +4376,7 @@
               <w:lang w:eastAsia="en-ZA"/>
             </w:rPr>
           </w:pPr>
-          <w:hyperlink w:anchor="_Toc229580147" w:history="1">
+          <w:hyperlink w:anchor="_Toc229593473" w:history="1">
             <w:r>
               <w:rPr>
                 <w:rStyle w:val="Hyperlink"/>
@@ -4411,7 +4404,7 @@
                 <w:noProof/>
                 <w:webHidden/>
               </w:rPr>
-              <w:instrText xml:space="preserve"> PAGEREF _Toc229580147 \h </w:instrText>
+              <w:instrText xml:space="preserve"> PAGEREF _Toc229593473 \h </w:instrText>
             </w:r>
             <w:r>
               <w:rPr>
@@ -4455,7 +4448,7 @@
               <w:lang w:eastAsia="en-ZA"/>
             </w:rPr>
           </w:pPr>
-          <w:hyperlink w:anchor="_Toc229580148" w:history="1">
+          <w:hyperlink w:anchor="_Toc229593474" w:history="1">
             <w:r>
               <w:rPr>
                 <w:rStyle w:val="Hyperlink"/>
@@ -4483,7 +4476,7 @@
                 <w:noProof/>
                 <w:webHidden/>
               </w:rPr>
-              <w:instrText xml:space="preserve"> PAGEREF _Toc229580148 \h </w:instrText>
+              <w:instrText xml:space="preserve"> PAGEREF _Toc229593474 \h </w:instrText>
             </w:r>
             <w:r>
               <w:rPr>
@@ -4527,7 +4520,7 @@
               <w:lang w:eastAsia="en-ZA"/>
             </w:rPr>
           </w:pPr>
-          <w:hyperlink w:anchor="_Toc229580149" w:history="1">
+          <w:hyperlink w:anchor="_Toc229593475" w:history="1">
             <w:r>
               <w:rPr>
                 <w:rStyle w:val="Hyperlink"/>
@@ -4555,7 +4548,7 @@
                 <w:noProof/>
                 <w:webHidden/>
               </w:rPr>
-              <w:instrText xml:space="preserve"> PAGEREF _Toc229580149 \h </w:instrText>
+              <w:instrText xml:space="preserve"> PAGEREF _Toc229593475 \h </w:instrText>
             </w:r>
             <w:r>
               <w:rPr>
@@ -4599,14 +4592,14 @@
               <w:lang w:eastAsia="en-ZA"/>
             </w:rPr>
           </w:pPr>
-          <w:hyperlink w:anchor="_Toc229580150" w:history="1">
+          <w:hyperlink w:anchor="_Toc229593476" w:history="1">
             <w:r>
               <w:rPr>
                 <w:rStyle w:val="Hyperlink"/>
                 <w:rFonts w:cs="Calibri"/>
                 <w:noProof/>
               </w:rPr>
-              <w:t>ScreenshotS</w:t>
+              <w:t>Screenshots</w:t>
             </w:r>
             <w:r>
               <w:rPr>
@@ -4627,7 +4620,7 @@
                 <w:noProof/>
                 <w:webHidden/>
               </w:rPr>
-              <w:instrText xml:space="preserve"> PAGEREF _Toc229580150 \h </w:instrText>
+              <w:instrText xml:space="preserve"> PAGEREF _Toc229593476 \h </w:instrText>
             </w:r>
             <w:r>
               <w:rPr>
@@ -4671,7 +4664,7 @@
               <w:lang w:eastAsia="en-ZA"/>
             </w:rPr>
           </w:pPr>
-          <w:hyperlink w:anchor="_Toc229580151" w:history="1">
+          <w:hyperlink w:anchor="_Toc229593477" w:history="1">
             <w:r>
               <w:rPr>
                 <w:rStyle w:val="Hyperlink"/>
@@ -4699,7 +4692,7 @@
                 <w:noProof/>
                 <w:webHidden/>
               </w:rPr>
-              <w:instrText xml:space="preserve"> PAGEREF _Toc229580151 \h </w:instrText>
+              <w:instrText xml:space="preserve"> PAGEREF _Toc229593477 \h </w:instrText>
             </w:r>
             <w:r>
               <w:rPr>
@@ -4743,7 +4736,7 @@
               <w:lang w:eastAsia="en-ZA"/>
             </w:rPr>
           </w:pPr>
-          <w:hyperlink w:anchor="_Toc229580152" w:history="1">
+          <w:hyperlink w:anchor="_Toc229593478" w:history="1">
             <w:r>
               <w:rPr>
                 <w:rStyle w:val="Hyperlink"/>
@@ -4771,7 +4764,7 @@
                 <w:noProof/>
                 <w:webHidden/>
               </w:rPr>
-              <w:instrText xml:space="preserve"> PAGEREF _Toc229580152 \h </w:instrText>
+              <w:instrText xml:space="preserve"> PAGEREF _Toc229593478 \h </w:instrText>
             </w:r>
             <w:r>
               <w:rPr>
@@ -4815,7 +4808,7 @@
               <w:lang w:eastAsia="en-ZA"/>
             </w:rPr>
           </w:pPr>
-          <w:hyperlink w:anchor="_Toc229580153" w:history="1">
+          <w:hyperlink w:anchor="_Toc229593479" w:history="1">
             <w:r>
               <w:rPr>
                 <w:rStyle w:val="Hyperlink"/>
@@ -4843,7 +4836,7 @@
                 <w:noProof/>
                 <w:webHidden/>
               </w:rPr>
-              <w:instrText xml:space="preserve"> PAGEREF _Toc229580153 \h </w:instrText>
+              <w:instrText xml:space="preserve"> PAGEREF _Toc229593479 \h </w:instrText>
             </w:r>
             <w:r>
               <w:rPr>
@@ -4887,7 +4880,7 @@
               <w:lang w:eastAsia="en-ZA"/>
             </w:rPr>
           </w:pPr>
-          <w:hyperlink w:anchor="_Toc229580154" w:history="1">
+          <w:hyperlink w:anchor="_Toc229593480" w:history="1">
             <w:r>
               <w:rPr>
                 <w:rStyle w:val="Hyperlink"/>
@@ -4915,7 +4908,7 @@
                 <w:noProof/>
                 <w:webHidden/>
               </w:rPr>
-              <w:instrText xml:space="preserve"> PAGEREF _Toc229580154 \h </w:instrText>
+              <w:instrText xml:space="preserve"> PAGEREF _Toc229593480 \h </w:instrText>
             </w:r>
             <w:r>
               <w:rPr>
@@ -4959,7 +4952,7 @@
               <w:lang w:eastAsia="en-ZA"/>
             </w:rPr>
           </w:pPr>
-          <w:hyperlink w:anchor="_Toc229580155" w:history="1">
+          <w:hyperlink w:anchor="_Toc229593481" w:history="1">
             <w:r>
               <w:rPr>
                 <w:rStyle w:val="Hyperlink"/>
@@ -4987,7 +4980,7 @@
                 <w:noProof/>
                 <w:webHidden/>
               </w:rPr>
-              <w:instrText xml:space="preserve"> PAGEREF _Toc229580155 \h </w:instrText>
+              <w:instrText xml:space="preserve"> PAGEREF _Toc229593481 \h </w:instrText>
             </w:r>
             <w:r>
               <w:rPr>
@@ -5031,7 +5024,7 @@
               <w:lang w:eastAsia="en-ZA"/>
             </w:rPr>
           </w:pPr>
-          <w:hyperlink w:anchor="_Toc229580156" w:history="1">
+          <w:hyperlink w:anchor="_Toc229593482" w:history="1">
             <w:r>
               <w:rPr>
                 <w:rStyle w:val="Hyperlink"/>
@@ -5059,7 +5052,7 @@
                 <w:noProof/>
                 <w:webHidden/>
               </w:rPr>
-              <w:instrText xml:space="preserve"> PAGEREF _Toc229580156 \h </w:instrText>
+              <w:instrText xml:space="preserve"> PAGEREF _Toc229593482 \h </w:instrText>
             </w:r>
             <w:r>
               <w:rPr>
@@ -5103,7 +5096,7 @@
               <w:lang w:eastAsia="en-ZA"/>
             </w:rPr>
           </w:pPr>
-          <w:hyperlink w:anchor="_Toc229580157" w:history="1">
+          <w:hyperlink w:anchor="_Toc229593483" w:history="1">
             <w:r>
               <w:rPr>
                 <w:rStyle w:val="Hyperlink"/>
@@ -5131,7 +5124,7 @@
                 <w:noProof/>
                 <w:webHidden/>
               </w:rPr>
-              <w:instrText xml:space="preserve"> PAGEREF _Toc229580157 \h </w:instrText>
+              <w:instrText xml:space="preserve"> PAGEREF _Toc229593483 \h </w:instrText>
             </w:r>
             <w:r>
               <w:rPr>
@@ -5175,7 +5168,7 @@
               <w:lang w:eastAsia="en-ZA"/>
             </w:rPr>
           </w:pPr>
-          <w:hyperlink w:anchor="_Toc229580158" w:history="1">
+          <w:hyperlink w:anchor="_Toc229593484" w:history="1">
             <w:r>
               <w:rPr>
                 <w:rStyle w:val="Hyperlink"/>
@@ -5203,7 +5196,7 @@
                 <w:noProof/>
                 <w:webHidden/>
               </w:rPr>
-              <w:instrText xml:space="preserve"> PAGEREF _Toc229580158 \h </w:instrText>
+              <w:instrText xml:space="preserve"> PAGEREF _Toc229593484 \h </w:instrText>
             </w:r>
             <w:r>
               <w:rPr>
@@ -5247,7 +5240,7 @@
               <w:lang w:eastAsia="en-ZA"/>
             </w:rPr>
           </w:pPr>
-          <w:hyperlink w:anchor="_Toc229580159" w:history="1">
+          <w:hyperlink w:anchor="_Toc229593485" w:history="1">
             <w:r>
               <w:rPr>
                 <w:rStyle w:val="Hyperlink"/>
@@ -5275,7 +5268,7 @@
                 <w:noProof/>
                 <w:webHidden/>
               </w:rPr>
-              <w:instrText xml:space="preserve"> PAGEREF _Toc229580159 \h </w:instrText>
+              <w:instrText xml:space="preserve"> PAGEREF _Toc229593485 \h </w:instrText>
             </w:r>
             <w:r>
               <w:rPr>
@@ -5319,7 +5312,7 @@
               <w:lang w:eastAsia="en-ZA"/>
             </w:rPr>
           </w:pPr>
-          <w:hyperlink w:anchor="_Toc229580160" w:history="1">
+          <w:hyperlink w:anchor="_Toc229593486" w:history="1">
             <w:r>
               <w:rPr>
                 <w:rStyle w:val="Hyperlink"/>
@@ -5347,7 +5340,7 @@
                 <w:noProof/>
                 <w:webHidden/>
               </w:rPr>
-              <w:instrText xml:space="preserve"> PAGEREF _Toc229580160 \h </w:instrText>
+              <w:instrText xml:space="preserve"> PAGEREF _Toc229593486 \h </w:instrText>
             </w:r>
             <w:r>
               <w:rPr>
@@ -5391,7 +5384,7 @@
               <w:lang w:eastAsia="en-ZA"/>
             </w:rPr>
           </w:pPr>
-          <w:hyperlink w:anchor="_Toc229580161" w:history="1">
+          <w:hyperlink w:anchor="_Toc229593487" w:history="1">
             <w:r>
               <w:rPr>
                 <w:rStyle w:val="Hyperlink"/>
@@ -5419,7 +5412,7 @@
                 <w:noProof/>
                 <w:webHidden/>
               </w:rPr>
-              <w:instrText xml:space="preserve"> PAGEREF _Toc229580161 \h </w:instrText>
+              <w:instrText xml:space="preserve"> PAGEREF _Toc229593487 \h </w:instrText>
             </w:r>
             <w:r>
               <w:rPr>
@@ -5463,7 +5456,7 @@
               <w:lang w:eastAsia="en-ZA"/>
             </w:rPr>
           </w:pPr>
-          <w:hyperlink w:anchor="_Toc229580162" w:history="1">
+          <w:hyperlink w:anchor="_Toc229593488" w:history="1">
             <w:r>
               <w:rPr>
                 <w:rStyle w:val="Hyperlink"/>
@@ -5491,7 +5484,7 @@
                 <w:noProof/>
                 <w:webHidden/>
               </w:rPr>
-              <w:instrText xml:space="preserve"> PAGEREF _Toc229580162 \h </w:instrText>
+              <w:instrText xml:space="preserve"> PAGEREF _Toc229593488 \h </w:instrText>
             </w:r>
             <w:r>
               <w:rPr>
@@ -5535,7 +5528,7 @@
               <w:lang w:eastAsia="en-ZA"/>
             </w:rPr>
           </w:pPr>
-          <w:hyperlink w:anchor="_Toc229580163" w:history="1">
+          <w:hyperlink w:anchor="_Toc229593489" w:history="1">
             <w:r>
               <w:rPr>
                 <w:rStyle w:val="Hyperlink"/>
@@ -5563,7 +5556,7 @@
                 <w:noProof/>
                 <w:webHidden/>
               </w:rPr>
-              <w:instrText xml:space="preserve"> PAGEREF _Toc229580163 \h </w:instrText>
+              <w:instrText xml:space="preserve"> PAGEREF _Toc229593489 \h </w:instrText>
             </w:r>
             <w:r>
               <w:rPr>
@@ -5607,7 +5600,7 @@
               <w:lang w:eastAsia="en-ZA"/>
             </w:rPr>
           </w:pPr>
-          <w:hyperlink w:anchor="_Toc229580164" w:history="1">
+          <w:hyperlink w:anchor="_Toc229593490" w:history="1">
             <w:r>
               <w:rPr>
                 <w:rStyle w:val="Hyperlink"/>
@@ -5635,7 +5628,7 @@
                 <w:noProof/>
                 <w:webHidden/>
               </w:rPr>
-              <w:instrText xml:space="preserve"> PAGEREF _Toc229580164 \h </w:instrText>
+              <w:instrText xml:space="preserve"> PAGEREF _Toc229593490 \h </w:instrText>
             </w:r>
             <w:r>
               <w:rPr>
@@ -5679,7 +5672,7 @@
               <w:lang w:eastAsia="en-ZA"/>
             </w:rPr>
           </w:pPr>
-          <w:hyperlink w:anchor="_Toc229580165" w:history="1">
+          <w:hyperlink w:anchor="_Toc229593491" w:history="1">
             <w:r>
               <w:rPr>
                 <w:rStyle w:val="Hyperlink"/>
@@ -5707,7 +5700,7 @@
                 <w:noProof/>
                 <w:webHidden/>
               </w:rPr>
-              <w:instrText xml:space="preserve"> PAGEREF _Toc229580165 \h </w:instrText>
+              <w:instrText xml:space="preserve"> PAGEREF _Toc229593491 \h </w:instrText>
             </w:r>
             <w:r>
               <w:rPr>
@@ -5751,7 +5744,7 @@
               <w:lang w:eastAsia="en-ZA"/>
             </w:rPr>
           </w:pPr>
-          <w:hyperlink w:anchor="_Toc229580166" w:history="1">
+          <w:hyperlink w:anchor="_Toc229593492" w:history="1">
             <w:r>
               <w:rPr>
                 <w:rStyle w:val="Hyperlink"/>
@@ -5779,7 +5772,7 @@
                 <w:noProof/>
                 <w:webHidden/>
               </w:rPr>
-              <w:instrText xml:space="preserve"> PAGEREF _Toc229580166 \h </w:instrText>
+              <w:instrText xml:space="preserve"> PAGEREF _Toc229593492 \h </w:instrText>
             </w:r>
             <w:r>
               <w:rPr>
@@ -5823,7 +5816,7 @@
               <w:lang w:eastAsia="en-ZA"/>
             </w:rPr>
           </w:pPr>
-          <w:hyperlink w:anchor="_Toc229580167" w:history="1">
+          <w:hyperlink w:anchor="_Toc229593493" w:history="1">
             <w:r>
               <w:rPr>
                 <w:rStyle w:val="Hyperlink"/>
@@ -5851,7 +5844,7 @@
                 <w:noProof/>
                 <w:webHidden/>
               </w:rPr>
-              <w:instrText xml:space="preserve"> PAGEREF _Toc229580167 \h </w:instrText>
+              <w:instrText xml:space="preserve"> PAGEREF _Toc229593493 \h </w:instrText>
             </w:r>
             <w:r>
               <w:rPr>
@@ -5895,7 +5888,7 @@
               <w:lang w:eastAsia="en-ZA"/>
             </w:rPr>
           </w:pPr>
-          <w:hyperlink w:anchor="_Toc229580168" w:history="1">
+          <w:hyperlink w:anchor="_Toc229593494" w:history="1">
             <w:r>
               <w:rPr>
                 <w:rStyle w:val="Hyperlink"/>
@@ -5923,7 +5916,7 @@
                 <w:noProof/>
                 <w:webHidden/>
               </w:rPr>
-              <w:instrText xml:space="preserve"> PAGEREF _Toc229580168 \h </w:instrText>
+              <w:instrText xml:space="preserve"> PAGEREF _Toc229593494 \h </w:instrText>
             </w:r>
             <w:r>
               <w:rPr>
@@ -5967,7 +5960,7 @@
               <w:lang w:eastAsia="en-ZA"/>
             </w:rPr>
           </w:pPr>
-          <w:hyperlink w:anchor="_Toc229580169" w:history="1">
+          <w:hyperlink w:anchor="_Toc229593495" w:history="1">
             <w:r>
               <w:rPr>
                 <w:rStyle w:val="Hyperlink"/>
@@ -5995,7 +5988,7 @@
                 <w:noProof/>
                 <w:webHidden/>
               </w:rPr>
-              <w:instrText xml:space="preserve"> PAGEREF _Toc229580169 \h </w:instrText>
+              <w:instrText xml:space="preserve"> PAGEREF _Toc229593495 \h </w:instrText>
             </w:r>
             <w:r>
               <w:rPr>
@@ -6039,7 +6032,7 @@
               <w:lang w:eastAsia="en-ZA"/>
             </w:rPr>
           </w:pPr>
-          <w:hyperlink w:anchor="_Toc229580170" w:history="1">
+          <w:hyperlink w:anchor="_Toc229593496" w:history="1">
             <w:r>
               <w:rPr>
                 <w:rStyle w:val="Hyperlink"/>
@@ -6067,7 +6060,7 @@
                 <w:noProof/>
                 <w:webHidden/>
               </w:rPr>
-              <w:instrText xml:space="preserve"> PAGEREF _Toc229580170 \h </w:instrText>
+              <w:instrText xml:space="preserve"> PAGEREF _Toc229593496 \h </w:instrText>
             </w:r>
             <w:r>
               <w:rPr>
@@ -6111,7 +6104,7 @@
               <w:lang w:eastAsia="en-ZA"/>
             </w:rPr>
           </w:pPr>
-          <w:hyperlink w:anchor="_Toc229580171" w:history="1">
+          <w:hyperlink w:anchor="_Toc229593497" w:history="1">
             <w:r>
               <w:rPr>
                 <w:rStyle w:val="Hyperlink"/>
@@ -6138,7 +6131,7 @@
                 <w:noProof/>
                 <w:webHidden/>
               </w:rPr>
-              <w:instrText xml:space="preserve"> PAGEREF _Toc229580171 \h </w:instrText>
+              <w:instrText xml:space="preserve"> PAGEREF _Toc229593497 \h </w:instrText>
             </w:r>
             <w:r>
               <w:rPr>
@@ -6182,7 +6175,7 @@
               <w:lang w:eastAsia="en-ZA"/>
             </w:rPr>
           </w:pPr>
-          <w:hyperlink w:anchor="_Toc229580172" w:history="1">
+          <w:hyperlink w:anchor="_Toc229593498" w:history="1">
             <w:r>
               <w:rPr>
                 <w:rStyle w:val="Hyperlink"/>
@@ -6210,7 +6203,7 @@
                 <w:noProof/>
                 <w:webHidden/>
               </w:rPr>
-              <w:instrText xml:space="preserve"> PAGEREF _Toc229580172 \h </w:instrText>
+              <w:instrText xml:space="preserve"> PAGEREF _Toc229593498 \h </w:instrText>
             </w:r>
             <w:r>
               <w:rPr>
@@ -6279,12 +6272,11 @@
           <w:rFonts w:cs="Calibri"/>
         </w:rPr>
       </w:pPr>
-      <w:bookmarkStart w:id="1" w:name="_Toc229580144"/>
-      <w:r>
-        <w:rPr>
-          <w:rFonts w:cs="Calibri"/>
-        </w:rPr>
-        <w:lastRenderedPageBreak/>
+      <w:bookmarkStart w:id="1" w:name="_Toc229593470"/>
+      <w:r>
+        <w:rPr>
+          <w:rFonts w:cs="Calibri"/>
+        </w:rPr>
         <w:t>Project Description</w:t>
       </w:r>
       <w:bookmarkEnd w:id="0"/>
@@ -6378,6 +6370,15 @@
         </w:rPr>
         <w:t xml:space="preserve">YouTube Video Link: </w:t>
       </w:r>
+      <w:hyperlink r:id="rId10" w:history="1">
+        <w:r>
+          <w:rPr>
+            <w:rStyle w:val="Hyperlink"/>
+            <w:rFonts w:cs="Calibri"/>
+          </w:rPr>
+          <w:t>https://youtu.be/0NNSonT0UpM</w:t>
+        </w:r>
+      </w:hyperlink>
     </w:p>
     <w:p>
       <w:pPr>
@@ -6399,12 +6400,11 @@
           <w:rFonts w:cs="Calibri"/>
         </w:rPr>
       </w:pPr>
-      <w:bookmarkStart w:id="2" w:name="_Toc229580145"/>
-      <w:r>
-        <w:rPr>
-          <w:rFonts w:cs="Calibri"/>
-        </w:rPr>
-        <w:lastRenderedPageBreak/>
+      <w:bookmarkStart w:id="2" w:name="_Toc229593471"/>
+      <w:r>
+        <w:rPr>
+          <w:rFonts w:cs="Calibri"/>
+        </w:rPr>
         <w:t>Question 1</w:t>
       </w:r>
       <w:r>
@@ -6422,7 +6422,7 @@
           <w:rFonts w:cs="Calibri"/>
         </w:rPr>
       </w:pPr>
-      <w:bookmarkStart w:id="3" w:name="_Toc229580146"/>
+      <w:bookmarkStart w:id="3" w:name="_Toc229593472"/>
       <w:r>
         <w:rPr>
           <w:rFonts w:cs="Calibri"/>
@@ -6462,7 +6462,7 @@
                     <pic:cNvPicPr/>
                   </pic:nvPicPr>
                   <pic:blipFill>
-                    <a:blip r:embed="rId10">
+                    <a:blip r:embed="rId11">
                       <a:extLst>
                         <a:ext uri="{28A0092B-C50C-407E-A947-70E740481C1C}">
                           <a14:useLocalDpi xmlns:a14="http://schemas.microsoft.com/office/drawing/2010/main" val="0"/>
@@ -6502,12 +6502,11 @@
           <w:rFonts w:cs="Calibri"/>
         </w:rPr>
       </w:pPr>
-      <w:bookmarkStart w:id="4" w:name="_Toc229580147"/>
-      <w:r>
-        <w:rPr>
-          <w:rFonts w:cs="Calibri"/>
-        </w:rPr>
-        <w:lastRenderedPageBreak/>
+      <w:bookmarkStart w:id="4" w:name="_Toc229593473"/>
+      <w:r>
+        <w:rPr>
+          <w:rFonts w:cs="Calibri"/>
+        </w:rPr>
         <w:t>Question 2</w:t>
       </w:r>
       <w:r>
@@ -6564,7 +6563,7 @@
           <w:rFonts w:cs="Calibri"/>
         </w:rPr>
       </w:pPr>
-      <w:bookmarkStart w:id="5" w:name="_Toc229580148"/>
+      <w:bookmarkStart w:id="5" w:name="_Toc229593474"/>
       <w:r>
         <w:rPr>
           <w:rFonts w:cs="Calibri"/>
@@ -6608,7 +6607,7 @@
                     <pic:cNvPicPr/>
                   </pic:nvPicPr>
                   <pic:blipFill>
-                    <a:blip r:embed="rId11">
+                    <a:blip r:embed="rId12">
                       <a:extLst>
                         <a:ext uri="{28A0092B-C50C-407E-A947-70E740481C1C}">
                           <a14:useLocalDpi xmlns:a14="http://schemas.microsoft.com/office/drawing/2010/main" val="0"/>
@@ -6659,12 +6658,11 @@
           <w:rFonts w:cs="Calibri"/>
         </w:rPr>
       </w:pPr>
-      <w:bookmarkStart w:id="6" w:name="_Toc229580149"/>
-      <w:r>
-        <w:rPr>
-          <w:rFonts w:cs="Calibri"/>
-        </w:rPr>
-        <w:lastRenderedPageBreak/>
+      <w:bookmarkStart w:id="6" w:name="_Toc229593475"/>
+      <w:r>
+        <w:rPr>
+          <w:rFonts w:cs="Calibri"/>
+        </w:rPr>
         <w:t>Question 3</w:t>
       </w:r>
       <w:r>
@@ -6702,20 +6700,20 @@
           <w:rFonts w:cs="Calibri"/>
         </w:rPr>
       </w:pPr>
-      <w:bookmarkStart w:id="7" w:name="_Toc229580150"/>
+      <w:bookmarkStart w:id="7" w:name="_Toc229593476"/>
       <w:r>
         <w:rPr>
           <w:rFonts w:cs="Calibri"/>
         </w:rPr>
         <w:t>Screenshot</w:t>
       </w:r>
+      <w:r>
+        <w:rPr>
+          <w:rFonts w:cs="Calibri"/>
+        </w:rPr>
+        <w:t>s</w:t>
+      </w:r>
       <w:bookmarkEnd w:id="7"/>
-      <w:r>
-        <w:rPr>
-          <w:rFonts w:cs="Calibri"/>
-        </w:rPr>
-        <w:t>s</w:t>
-      </w:r>
     </w:p>
     <w:p>
       <w:pPr>
@@ -6757,7 +6755,7 @@
                     <pic:cNvPicPr/>
                   </pic:nvPicPr>
                   <pic:blipFill>
-                    <a:blip r:embed="rId12">
+                    <a:blip r:embed="rId13">
                       <a:extLst>
                         <a:ext uri="{28A0092B-C50C-407E-A947-70E740481C1C}">
                           <a14:useLocalDpi xmlns:a14="http://schemas.microsoft.com/office/drawing/2010/main" val="0"/>
@@ -6828,7 +6826,7 @@
                     <pic:cNvPicPr/>
                   </pic:nvPicPr>
                   <pic:blipFill>
-                    <a:blip r:embed="rId13">
+                    <a:blip r:embed="rId14">
                       <a:extLst>
                         <a:ext uri="{28A0092B-C50C-407E-A947-70E740481C1C}">
                           <a14:useLocalDpi xmlns:a14="http://schemas.microsoft.com/office/drawing/2010/main" val="0"/>
@@ -6868,12 +6866,11 @@
           <w:rFonts w:cs="Calibri"/>
         </w:rPr>
       </w:pPr>
-      <w:bookmarkStart w:id="8" w:name="_Toc229580151"/>
-      <w:r>
-        <w:rPr>
-          <w:rFonts w:cs="Calibri"/>
-        </w:rPr>
-        <w:lastRenderedPageBreak/>
+      <w:bookmarkStart w:id="8" w:name="_Toc229593477"/>
+      <w:r>
+        <w:rPr>
+          <w:rFonts w:cs="Calibri"/>
+        </w:rPr>
         <w:t>Question 4</w:t>
       </w:r>
       <w:r>
@@ -7043,7 +7040,7 @@
           <w:rFonts w:cs="Calibri"/>
         </w:rPr>
       </w:pPr>
-      <w:bookmarkStart w:id="9" w:name="_Toc229580152"/>
+      <w:bookmarkStart w:id="9" w:name="_Toc229593478"/>
       <w:r>
         <w:rPr>
           <w:rFonts w:cs="Calibri"/>
@@ -7083,7 +7080,7 @@
                     <pic:cNvPicPr/>
                   </pic:nvPicPr>
                   <pic:blipFill>
-                    <a:blip r:embed="rId14">
+                    <a:blip r:embed="rId15">
                       <a:extLst>
                         <a:ext uri="{28A0092B-C50C-407E-A947-70E740481C1C}">
                           <a14:useLocalDpi xmlns:a14="http://schemas.microsoft.com/office/drawing/2010/main" val="0"/>
@@ -7123,12 +7120,11 @@
           <w:rFonts w:cs="Calibri"/>
         </w:rPr>
       </w:pPr>
-      <w:bookmarkStart w:id="10" w:name="_Toc229580153"/>
-      <w:r>
-        <w:rPr>
-          <w:rFonts w:cs="Calibri"/>
-        </w:rPr>
-        <w:lastRenderedPageBreak/>
+      <w:bookmarkStart w:id="10" w:name="_Toc229593479"/>
+      <w:r>
+        <w:rPr>
+          <w:rFonts w:cs="Calibri"/>
+        </w:rPr>
         <w:t>Question 5</w:t>
       </w:r>
       <w:r>
@@ -7146,7 +7142,7 @@
           <w:rFonts w:cs="Calibri"/>
         </w:rPr>
       </w:pPr>
-      <w:bookmarkStart w:id="11" w:name="_Toc229580154"/>
+      <w:bookmarkStart w:id="11" w:name="_Toc229593480"/>
       <w:r>
         <w:rPr>
           <w:rFonts w:cs="Calibri"/>
@@ -7182,7 +7178,7 @@
                     <pic:cNvPicPr/>
                   </pic:nvPicPr>
                   <pic:blipFill>
-                    <a:blip r:embed="rId15">
+                    <a:blip r:embed="rId16">
                       <a:extLst>
                         <a:ext uri="{28A0092B-C50C-407E-A947-70E740481C1C}">
                           <a14:useLocalDpi xmlns:a14="http://schemas.microsoft.com/office/drawing/2010/main" val="0"/>
@@ -7253,7 +7249,7 @@
                     <pic:cNvPicPr/>
                   </pic:nvPicPr>
                   <pic:blipFill>
-                    <a:blip r:embed="rId16">
+                    <a:blip r:embed="rId17">
                       <a:extLst>
                         <a:ext uri="{28A0092B-C50C-407E-A947-70E740481C1C}">
                           <a14:useLocalDpi xmlns:a14="http://schemas.microsoft.com/office/drawing/2010/main" val="0"/>
@@ -7293,12 +7289,11 @@
           <w:rFonts w:cs="Calibri"/>
         </w:rPr>
       </w:pPr>
-      <w:bookmarkStart w:id="12" w:name="_Toc229580155"/>
-      <w:r>
-        <w:rPr>
-          <w:rFonts w:cs="Calibri"/>
-        </w:rPr>
-        <w:lastRenderedPageBreak/>
+      <w:bookmarkStart w:id="12" w:name="_Toc229593481"/>
+      <w:r>
+        <w:rPr>
+          <w:rFonts w:cs="Calibri"/>
+        </w:rPr>
         <w:t>Question 6</w:t>
       </w:r>
       <w:r>
@@ -7316,7 +7311,7 @@
           <w:rFonts w:cs="Calibri"/>
         </w:rPr>
       </w:pPr>
-      <w:bookmarkStart w:id="13" w:name="_Toc229580156"/>
+      <w:bookmarkStart w:id="13" w:name="_Toc229593482"/>
       <w:r>
         <w:rPr>
           <w:rFonts w:cs="Calibri"/>
@@ -7356,7 +7351,7 @@
                     <pic:cNvPicPr/>
                   </pic:nvPicPr>
                   <pic:blipFill>
-                    <a:blip r:embed="rId17">
+                    <a:blip r:embed="rId18">
                       <a:extLst>
                         <a:ext uri="{28A0092B-C50C-407E-A947-70E740481C1C}">
                           <a14:useLocalDpi xmlns:a14="http://schemas.microsoft.com/office/drawing/2010/main" val="0"/>
@@ -7403,7 +7398,7 @@
                     <pic:cNvPicPr/>
                   </pic:nvPicPr>
                   <pic:blipFill>
-                    <a:blip r:embed="rId18">
+                    <a:blip r:embed="rId19">
                       <a:extLst>
                         <a:ext uri="{28A0092B-C50C-407E-A947-70E740481C1C}">
                           <a14:useLocalDpi xmlns:a14="http://schemas.microsoft.com/office/drawing/2010/main" val="0"/>
@@ -7443,12 +7438,11 @@
           <w:rFonts w:cs="Calibri"/>
         </w:rPr>
       </w:pPr>
-      <w:bookmarkStart w:id="14" w:name="_Toc229580157"/>
-      <w:r>
-        <w:rPr>
-          <w:rFonts w:cs="Calibri"/>
-        </w:rPr>
-        <w:lastRenderedPageBreak/>
+      <w:bookmarkStart w:id="14" w:name="_Toc229593483"/>
+      <w:r>
+        <w:rPr>
+          <w:rFonts w:cs="Calibri"/>
+        </w:rPr>
         <w:t>Question 7</w:t>
       </w:r>
       <w:r>
@@ -7484,7 +7478,7 @@
           <w:rFonts w:cs="Calibri"/>
         </w:rPr>
       </w:pPr>
-      <w:bookmarkStart w:id="15" w:name="_Toc229580158"/>
+      <w:bookmarkStart w:id="15" w:name="_Toc229593484"/>
       <w:r>
         <w:rPr>
           <w:rFonts w:cs="Calibri"/>
@@ -7524,7 +7518,7 @@
                     <pic:cNvPicPr/>
                   </pic:nvPicPr>
                   <pic:blipFill>
-                    <a:blip r:embed="rId19">
+                    <a:blip r:embed="rId20">
                       <a:extLst>
                         <a:ext uri="{28A0092B-C50C-407E-A947-70E740481C1C}">
                           <a14:useLocalDpi xmlns:a14="http://schemas.microsoft.com/office/drawing/2010/main" val="0"/>
@@ -7564,12 +7558,11 @@
           <w:rFonts w:cs="Calibri"/>
         </w:rPr>
       </w:pPr>
-      <w:bookmarkStart w:id="16" w:name="_Toc229580159"/>
-      <w:r>
-        <w:rPr>
-          <w:rFonts w:cs="Calibri"/>
-        </w:rPr>
-        <w:lastRenderedPageBreak/>
+      <w:bookmarkStart w:id="16" w:name="_Toc229593485"/>
+      <w:r>
+        <w:rPr>
+          <w:rFonts w:cs="Calibri"/>
+        </w:rPr>
         <w:t>Question 8</w:t>
       </w:r>
       <w:r>
@@ -7587,7 +7580,7 @@
           <w:rFonts w:cs="Calibri"/>
         </w:rPr>
       </w:pPr>
-      <w:bookmarkStart w:id="17" w:name="_Toc229580160"/>
+      <w:bookmarkStart w:id="17" w:name="_Toc229593486"/>
       <w:r>
         <w:rPr>
           <w:rFonts w:cs="Calibri"/>
@@ -7614,7 +7607,43 @@
         <w:rPr>
           <w:rFonts w:cs="Calibri"/>
         </w:rPr>
-        <w:t> ResponseService.cs - InitializeKeywordCategories() method</w:t>
+        <w:t> </w:t>
+      </w:r>
+      <w:proofErr w:type="spellStart"/>
+      <w:r>
+        <w:rPr>
+          <w:rFonts w:cs="Calibri"/>
+        </w:rPr>
+        <w:t>ResponseService.cs</w:t>
+      </w:r>
+      <w:proofErr w:type="spellEnd"/>
+      <w:r>
+        <w:rPr>
+          <w:rFonts w:cs="Calibri"/>
+        </w:rPr>
+        <w:t> - </w:t>
+      </w:r>
+      <w:proofErr w:type="spellStart"/>
+      <w:proofErr w:type="gramStart"/>
+      <w:r>
+        <w:rPr>
+          <w:rFonts w:cs="Calibri"/>
+        </w:rPr>
+        <w:t>InitializeKeywordCategories</w:t>
+      </w:r>
+      <w:proofErr w:type="spellEnd"/>
+      <w:r>
+        <w:rPr>
+          <w:rFonts w:cs="Calibri"/>
+        </w:rPr>
+        <w:t>(</w:t>
+      </w:r>
+      <w:proofErr w:type="gramEnd"/>
+      <w:r>
+        <w:rPr>
+          <w:rFonts w:cs="Calibri"/>
+        </w:rPr>
+        <w:t>) method</w:t>
       </w:r>
     </w:p>
     <w:p>
@@ -7627,7 +7656,21 @@
         <w:rPr>
           <w:rFonts w:cs="Calibri"/>
         </w:rPr>
-        <w:t>Screenshot showing the _keywordCategories dictionary that organizes all cybersecurity keywords efficiently.</w:t>
+        <w:t>Screenshot showing the _</w:t>
+      </w:r>
+      <w:proofErr w:type="spellStart"/>
+      <w:r>
+        <w:rPr>
+          <w:rFonts w:cs="Calibri"/>
+        </w:rPr>
+        <w:t>keywordCategories</w:t>
+      </w:r>
+      <w:proofErr w:type="spellEnd"/>
+      <w:r>
+        <w:rPr>
+          <w:rFonts w:cs="Calibri"/>
+        </w:rPr>
+        <w:t> dictionary that organizes all cybersecurity keywords efficiently.</w:t>
       </w:r>
     </w:p>
     <w:p>
@@ -7637,7 +7680,7 @@
           <w:rFonts w:cs="Calibri"/>
         </w:rPr>
       </w:pPr>
-      <w:bookmarkStart w:id="18" w:name="_Toc229580161"/>
+      <w:bookmarkStart w:id="18" w:name="_Toc229593487"/>
       <w:r>
         <w:rPr>
           <w:rFonts w:cs="Calibri"/>
@@ -7673,7 +7716,7 @@
                     <pic:cNvPicPr/>
                   </pic:nvPicPr>
                   <pic:blipFill>
-                    <a:blip r:embed="rId20">
+                    <a:blip r:embed="rId21">
                       <a:extLst>
                         <a:ext uri="{28A0092B-C50C-407E-A947-70E740481C1C}">
                           <a14:useLocalDpi xmlns:a14="http://schemas.microsoft.com/office/drawing/2010/main" val="0"/>
@@ -7715,7 +7758,7 @@
           <w:rFonts w:cs="Calibri"/>
         </w:rPr>
       </w:pPr>
-      <w:bookmarkStart w:id="19" w:name="_Toc229580162"/>
+      <w:bookmarkStart w:id="19" w:name="_Toc229593488"/>
       <w:r>
         <w:rPr>
           <w:rFonts w:cs="Calibri"/>
@@ -7742,7 +7785,43 @@
         <w:rPr>
           <w:rFonts w:cs="Calibri"/>
         </w:rPr>
-        <w:t> ResponseService.cs - InitializeRandomResponses() method</w:t>
+        <w:t> </w:t>
+      </w:r>
+      <w:proofErr w:type="spellStart"/>
+      <w:r>
+        <w:rPr>
+          <w:rFonts w:cs="Calibri"/>
+        </w:rPr>
+        <w:t>ResponseService.cs</w:t>
+      </w:r>
+      <w:proofErr w:type="spellEnd"/>
+      <w:r>
+        <w:rPr>
+          <w:rFonts w:cs="Calibri"/>
+        </w:rPr>
+        <w:t> - </w:t>
+      </w:r>
+      <w:proofErr w:type="spellStart"/>
+      <w:proofErr w:type="gramStart"/>
+      <w:r>
+        <w:rPr>
+          <w:rFonts w:cs="Calibri"/>
+        </w:rPr>
+        <w:t>InitializeRandomResponses</w:t>
+      </w:r>
+      <w:proofErr w:type="spellEnd"/>
+      <w:r>
+        <w:rPr>
+          <w:rFonts w:cs="Calibri"/>
+        </w:rPr>
+        <w:t>(</w:t>
+      </w:r>
+      <w:proofErr w:type="gramEnd"/>
+      <w:r>
+        <w:rPr>
+          <w:rFonts w:cs="Calibri"/>
+        </w:rPr>
+        <w:t>) method</w:t>
       </w:r>
     </w:p>
     <w:p>
@@ -7765,7 +7844,7 @@
           <w:rFonts w:cs="Calibri"/>
         </w:rPr>
       </w:pPr>
-      <w:bookmarkStart w:id="20" w:name="_Toc229580163"/>
+      <w:bookmarkStart w:id="20" w:name="_Toc229593489"/>
       <w:r>
         <w:rPr>
           <w:rFonts w:cs="Calibri"/>
@@ -7801,7 +7880,7 @@
                     <pic:cNvPicPr/>
                   </pic:nvPicPr>
                   <pic:blipFill>
-                    <a:blip r:embed="rId21">
+                    <a:blip r:embed="rId22">
                       <a:extLst>
                         <a:ext uri="{28A0092B-C50C-407E-A947-70E740481C1C}">
                           <a14:useLocalDpi xmlns:a14="http://schemas.microsoft.com/office/drawing/2010/main" val="0"/>
@@ -7859,12 +7938,11 @@
           <w:rFonts w:cs="Calibri"/>
         </w:rPr>
       </w:pPr>
-      <w:bookmarkStart w:id="21" w:name="_Toc229580164"/>
-      <w:r>
-        <w:rPr>
-          <w:rFonts w:cs="Calibri"/>
-        </w:rPr>
-        <w:lastRenderedPageBreak/>
+      <w:bookmarkStart w:id="21" w:name="_Toc229593490"/>
+      <w:r>
+        <w:rPr>
+          <w:rFonts w:cs="Calibri"/>
+        </w:rPr>
         <w:t>3. Dictionary for Detailed Explanations</w:t>
       </w:r>
       <w:bookmarkEnd w:id="21"/>
@@ -7887,7 +7965,21 @@
         <w:rPr>
           <w:rFonts w:cs="Calibri"/>
         </w:rPr>
-        <w:t> ResponseService.cs - InitializeDetailedExplanations() method</w:t>
+        <w:t> ResponseService.cs - </w:t>
+      </w:r>
+      <w:proofErr w:type="gramStart"/>
+      <w:r>
+        <w:rPr>
+          <w:rFonts w:cs="Calibri"/>
+        </w:rPr>
+        <w:t>InitializeDetailedExplanations(</w:t>
+      </w:r>
+      <w:proofErr w:type="gramEnd"/>
+      <w:r>
+        <w:rPr>
+          <w:rFonts w:cs="Calibri"/>
+        </w:rPr>
+        <w:t>) method</w:t>
       </w:r>
     </w:p>
     <w:p>
@@ -7900,7 +7992,21 @@
         <w:rPr>
           <w:rFonts w:cs="Calibri"/>
         </w:rPr>
-        <w:t>Screenshot showing the _detailedExplanations dictionary for "tell me more" feature.</w:t>
+        <w:t>Screenshot showing the _</w:t>
+      </w:r>
+      <w:proofErr w:type="spellStart"/>
+      <w:r>
+        <w:rPr>
+          <w:rFonts w:cs="Calibri"/>
+        </w:rPr>
+        <w:t>detailedExplanations</w:t>
+      </w:r>
+      <w:proofErr w:type="spellEnd"/>
+      <w:r>
+        <w:rPr>
+          <w:rFonts w:cs="Calibri"/>
+        </w:rPr>
+        <w:t> dictionary for "tell me more" feature.</w:t>
       </w:r>
     </w:p>
     <w:p>
@@ -7910,7 +8016,7 @@
           <w:rFonts w:cs="Calibri"/>
         </w:rPr>
       </w:pPr>
-      <w:bookmarkStart w:id="22" w:name="_Toc229580165"/>
+      <w:bookmarkStart w:id="22" w:name="_Toc229593491"/>
       <w:r>
         <w:rPr>
           <w:rFonts w:cs="Calibri"/>
@@ -7946,7 +8052,7 @@
                     <pic:cNvPicPr/>
                   </pic:nvPicPr>
                   <pic:blipFill>
-                    <a:blip r:embed="rId22">
+                    <a:blip r:embed="rId23">
                       <a:extLst>
                         <a:ext uri="{28A0092B-C50C-407E-A947-70E740481C1C}">
                           <a14:useLocalDpi xmlns:a14="http://schemas.microsoft.com/office/drawing/2010/main" val="0"/>
@@ -7988,7 +8094,7 @@
           <w:rFonts w:cs="Calibri"/>
         </w:rPr>
       </w:pPr>
-      <w:bookmarkStart w:id="23" w:name="_Toc229580166"/>
+      <w:bookmarkStart w:id="23" w:name="_Toc229593492"/>
       <w:r>
         <w:rPr>
           <w:rFonts w:cs="Calibri"/>
@@ -8007,7 +8113,43 @@
         <w:rPr>
           <w:rFonts w:cs="Calibri"/>
         </w:rPr>
-        <w:t>File: ResponseService.cs - GetRandomResponse() method</w:t>
+        <w:t>File: </w:t>
+      </w:r>
+      <w:proofErr w:type="spellStart"/>
+      <w:r>
+        <w:rPr>
+          <w:rFonts w:cs="Calibri"/>
+        </w:rPr>
+        <w:t>ResponseService.cs</w:t>
+      </w:r>
+      <w:proofErr w:type="spellEnd"/>
+      <w:r>
+        <w:rPr>
+          <w:rFonts w:cs="Calibri"/>
+        </w:rPr>
+        <w:t> - </w:t>
+      </w:r>
+      <w:proofErr w:type="spellStart"/>
+      <w:proofErr w:type="gramStart"/>
+      <w:r>
+        <w:rPr>
+          <w:rFonts w:cs="Calibri"/>
+        </w:rPr>
+        <w:t>GetRandomResponse</w:t>
+      </w:r>
+      <w:proofErr w:type="spellEnd"/>
+      <w:r>
+        <w:rPr>
+          <w:rFonts w:cs="Calibri"/>
+        </w:rPr>
+        <w:t>(</w:t>
+      </w:r>
+      <w:proofErr w:type="gramEnd"/>
+      <w:r>
+        <w:rPr>
+          <w:rFonts w:cs="Calibri"/>
+        </w:rPr>
+        <w:t>) method</w:t>
       </w:r>
     </w:p>
     <w:p>
@@ -8030,7 +8172,7 @@
           <w:rFonts w:cs="Calibri"/>
         </w:rPr>
       </w:pPr>
-      <w:bookmarkStart w:id="24" w:name="_Toc229580167"/>
+      <w:bookmarkStart w:id="24" w:name="_Toc229593493"/>
       <w:r>
         <w:rPr>
           <w:rFonts w:cs="Calibri"/>
@@ -8066,7 +8208,7 @@
                     <pic:cNvPicPr/>
                   </pic:nvPicPr>
                   <pic:blipFill>
-                    <a:blip r:embed="rId23">
+                    <a:blip r:embed="rId24">
                       <a:extLst>
                         <a:ext uri="{28A0092B-C50C-407E-A947-70E740481C1C}">
                           <a14:useLocalDpi xmlns:a14="http://schemas.microsoft.com/office/drawing/2010/main" val="0"/>
@@ -8130,12 +8272,11 @@
           <w:rFonts w:cs="Calibri"/>
         </w:rPr>
       </w:pPr>
-      <w:bookmarkStart w:id="25" w:name="_Toc229580168"/>
-      <w:r>
-        <w:rPr>
-          <w:rFonts w:cs="Calibri"/>
-        </w:rPr>
-        <w:lastRenderedPageBreak/>
+      <w:bookmarkStart w:id="25" w:name="_Toc229593494"/>
+      <w:r>
+        <w:rPr>
+          <w:rFonts w:cs="Calibri"/>
+        </w:rPr>
         <w:t>5. Class Structure Overview</w:t>
       </w:r>
       <w:bookmarkEnd w:id="25"/>
@@ -8144,7 +8285,7 @@
       <w:pPr>
         <w:pStyle w:val="Heading3"/>
       </w:pPr>
-      <w:bookmarkStart w:id="26" w:name="_Toc229580169"/>
+      <w:bookmarkStart w:id="26" w:name="_Toc229593495"/>
       <w:r>
         <w:rPr>
           <w:rFonts w:cs="Calibri"/>
@@ -8180,7 +8321,7 @@
                     <pic:cNvPicPr/>
                   </pic:nvPicPr>
                   <pic:blipFill>
-                    <a:blip r:embed="rId24">
+                    <a:blip r:embed="rId25">
                       <a:extLst>
                         <a:ext uri="{28A0092B-C50C-407E-A947-70E740481C1C}">
                           <a14:useLocalDpi xmlns:a14="http://schemas.microsoft.com/office/drawing/2010/main" val="0"/>
@@ -8242,12 +8383,11 @@
           <w:rFonts w:cs="Calibri"/>
         </w:rPr>
       </w:pPr>
-      <w:bookmarkStart w:id="27" w:name="_Toc229580170"/>
-      <w:r>
-        <w:rPr>
-          <w:rFonts w:cs="Calibri"/>
-        </w:rPr>
-        <w:lastRenderedPageBreak/>
+      <w:bookmarkStart w:id="27" w:name="_Toc229593496"/>
+      <w:r>
+        <w:rPr>
+          <w:rFonts w:cs="Calibri"/>
+        </w:rPr>
         <w:t>GitHub Actions CI workflow</w:t>
       </w:r>
       <w:bookmarkEnd w:id="27"/>
@@ -8256,7 +8396,7 @@
       <w:pPr>
         <w:pStyle w:val="Heading2"/>
       </w:pPr>
-      <w:bookmarkStart w:id="28" w:name="_Toc229580171"/>
+      <w:bookmarkStart w:id="28" w:name="_Toc229593497"/>
       <w:r>
         <w:t>Screenshots</w:t>
       </w:r>
@@ -8290,7 +8430,7 @@
                     <pic:cNvPicPr/>
                   </pic:nvPicPr>
                   <pic:blipFill>
-                    <a:blip r:embed="rId25" cstate="print">
+                    <a:blip r:embed="rId26" cstate="print">
                       <a:extLst>
                         <a:ext uri="{28A0092B-C50C-407E-A947-70E740481C1C}">
                           <a14:useLocalDpi xmlns:a14="http://schemas.microsoft.com/office/drawing/2010/main" val="0"/>
@@ -8327,12 +8467,11 @@
           <w:rFonts w:cs="Calibri"/>
         </w:rPr>
       </w:pPr>
-      <w:bookmarkStart w:id="29" w:name="_Toc229580172"/>
-      <w:r>
-        <w:rPr>
-          <w:rFonts w:cs="Calibri"/>
-        </w:rPr>
-        <w:lastRenderedPageBreak/>
+      <w:bookmarkStart w:id="29" w:name="_Toc229593498"/>
+      <w:r>
+        <w:rPr>
+          <w:rFonts w:cs="Calibri"/>
+        </w:rPr>
         <w:t>References</w:t>
       </w:r>
       <w:bookmarkEnd w:id="29"/>
@@ -8347,9 +8486,23 @@
         <w:rPr>
           <w:rFonts w:cs="Calibri"/>
         </w:rPr>
-        <w:t>Anliker, C., Lain, D. and Capkun, S. 2025. Phishing Attacks against Password Manager Browser Extensions. Proceedings of the 34th USENIX Security Symposium, Seattle, WA, USA, August 2025. Available at: </w:t>
-      </w:r>
-      <w:hyperlink r:id="rId26" w:tgtFrame="_blank" w:history="1">
+        <w:t xml:space="preserve">Anliker, C., Lain, D. and </w:t>
+      </w:r>
+      <w:proofErr w:type="spellStart"/>
+      <w:r>
+        <w:rPr>
+          <w:rFonts w:cs="Calibri"/>
+        </w:rPr>
+        <w:t>Capkun</w:t>
+      </w:r>
+      <w:proofErr w:type="spellEnd"/>
+      <w:r>
+        <w:rPr>
+          <w:rFonts w:cs="Calibri"/>
+        </w:rPr>
+        <w:t>, S. 2025. Phishing Attacks against Password Manager Browser Extensions. Proceedings of the 34th USENIX Security Symposium, Seattle, WA, USA, August 2025. Available at: </w:t>
+      </w:r>
+      <w:hyperlink r:id="rId27" w:tgtFrame="_blank" w:history="1">
         <w:r>
           <w:rPr>
             <w:rStyle w:val="Hyperlink"/>
@@ -8377,7 +8530,7 @@
         </w:rPr>
         <w:t>ENISA (European Union Agency for Cybersecurity). 2024. Reframing Cybersecurity Awareness Raising: Exploring the Human Factor in Cybersecurity Communication. Luxembourg: Publications Office of the European Union. Available at: </w:t>
       </w:r>
-      <w:hyperlink r:id="rId27" w:tgtFrame="_blank" w:history="1">
+      <w:hyperlink r:id="rId28" w:tgtFrame="_blank" w:history="1">
         <w:r>
           <w:rPr>
             <w:rStyle w:val="Hyperlink"/>
@@ -8405,7 +8558,7 @@
         </w:rPr>
         <w:t>GCIS (Government Communication and Information System). 2025. Government Urges Vigilance Against Rising Cyber Threats. GCIS Media Release, 3 October 2025. Available at: </w:t>
       </w:r>
-      <w:hyperlink r:id="rId28" w:tgtFrame="_blank" w:history="1">
+      <w:hyperlink r:id="rId29" w:tgtFrame="_blank" w:history="1">
         <w:r>
           <w:rPr>
             <w:rStyle w:val="Hyperlink"/>
@@ -8433,7 +8586,7 @@
         </w:rPr>
         <w:t>INTERPOL. 2026. Major Operation in Africa Targeting Online Scams Nets 651 Arrests, Recovers USD 4.3 Million. INTERPOL News, 18 February 2026. Available at: </w:t>
       </w:r>
-      <w:hyperlink r:id="rId29" w:tgtFrame="_blank" w:history="1">
+      <w:hyperlink r:id="rId30" w:tgtFrame="_blank" w:history="1">
         <w:r>
           <w:rPr>
             <w:rStyle w:val="Hyperlink"/>
@@ -8459,9 +8612,23 @@
         <w:rPr>
           <w:rFonts w:cs="Calibri"/>
         </w:rPr>
-        <w:t>Jannett, L. et al. 2025. Does Johnny Get the Message? Evaluating Cybersecurity Notifications for Everyday Users. arXiv e-prints, arXiv:2505.22435. Available at: </w:t>
-      </w:r>
-      <w:hyperlink r:id="rId30" w:tgtFrame="_blank" w:history="1">
+        <w:t>Jannett, L. et al. 2025. Does Johnny Get the Message? Evaluating Cybersecurity Notifications for Everyday Users. </w:t>
+      </w:r>
+      <w:proofErr w:type="spellStart"/>
+      <w:r>
+        <w:rPr>
+          <w:rFonts w:cs="Calibri"/>
+        </w:rPr>
+        <w:t>arXiv</w:t>
+      </w:r>
+      <w:proofErr w:type="spellEnd"/>
+      <w:r>
+        <w:rPr>
+          <w:rFonts w:cs="Calibri"/>
+        </w:rPr>
+        <w:t xml:space="preserve"> e-prints, arXiv:2505.22435. Available at: </w:t>
+      </w:r>
+      <w:hyperlink r:id="rId31" w:tgtFrame="_blank" w:history="1">
         <w:r>
           <w:rPr>
             <w:rStyle w:val="Hyperlink"/>
@@ -8489,7 +8656,7 @@
         </w:rPr>
         <w:t>Kaspersky. 2026. Kaspersky Warns of Malware Aiming to Steal Data from Individuals and Organisations in South Africa. Kaspersky Press Release, 16 March 2026. Available at: </w:t>
       </w:r>
-      <w:hyperlink r:id="rId31" w:tgtFrame="_blank" w:history="1">
+      <w:hyperlink r:id="rId32" w:tgtFrame="_blank" w:history="1">
         <w:r>
           <w:rPr>
             <w:rStyle w:val="Hyperlink"/>
@@ -8511,13 +8678,21 @@
           <w:rFonts w:cs="Calibri"/>
         </w:rPr>
       </w:pPr>
-      <w:r>
-        <w:rPr>
-          <w:rFonts w:cs="Calibri"/>
-        </w:rPr>
-        <w:t>SAnews (South African Government News Agency). 2025. Stay Safe Online. </w:t>
-      </w:r>
-      <w:hyperlink r:id="rId32" w:tgtFrame="_blank" w:history="1">
+      <w:proofErr w:type="spellStart"/>
+      <w:r>
+        <w:rPr>
+          <w:rFonts w:cs="Calibri"/>
+        </w:rPr>
+        <w:t>SAnews</w:t>
+      </w:r>
+      <w:proofErr w:type="spellEnd"/>
+      <w:r>
+        <w:rPr>
+          <w:rFonts w:cs="Calibri"/>
+        </w:rPr>
+        <w:t xml:space="preserve"> (South African Government News Agency). 2025. Stay Safe Online. </w:t>
+      </w:r>
+      <w:hyperlink r:id="rId33" w:tgtFrame="_blank" w:history="1">
         <w:r>
           <w:rPr>
             <w:rStyle w:val="Hyperlink"/>
@@ -8532,7 +8707,7 @@
         </w:rPr>
         <w:t>, 5 October 2025. Available at: </w:t>
       </w:r>
-      <w:hyperlink r:id="rId33" w:tgtFrame="_blank" w:history="1">
+      <w:hyperlink r:id="rId34" w:tgtFrame="_blank" w:history="1">
         <w:r>
           <w:rPr>
             <w:rStyle w:val="Hyperlink"/>
@@ -8554,13 +8729,21 @@
           <w:rFonts w:cs="Calibri"/>
         </w:rPr>
       </w:pPr>
-      <w:r>
-        <w:rPr>
-          <w:rFonts w:cs="Calibri"/>
-        </w:rPr>
-        <w:t>Tredger, C. 2026. The Ransomware Evolution: Rise of EDR Killers, AI-Powered Malware. ITWeb, 6 February 2026. Available at: </w:t>
-      </w:r>
-      <w:hyperlink r:id="rId34" w:tgtFrame="_blank" w:history="1">
+      <w:proofErr w:type="spellStart"/>
+      <w:r>
+        <w:rPr>
+          <w:rFonts w:cs="Calibri"/>
+        </w:rPr>
+        <w:t>Tredger</w:t>
+      </w:r>
+      <w:proofErr w:type="spellEnd"/>
+      <w:r>
+        <w:rPr>
+          <w:rFonts w:cs="Calibri"/>
+        </w:rPr>
+        <w:t>, C. 2026. The Ransomware Evolution: Rise of EDR Killers, AI-Powered Malware. ITWeb, 6 February 2026. Available at: </w:t>
+      </w:r>
+      <w:hyperlink r:id="rId35" w:tgtFrame="_blank" w:history="1">
         <w:r>
           <w:rPr>
             <w:rStyle w:val="Hyperlink"/>
@@ -8586,7 +8769,21 @@
         <w:rPr>
           <w:rFonts w:cs="Calibri"/>
         </w:rPr>
-        <w:t>Troelsen, A. and Japikse, P. (2021) </w:t>
+        <w:t xml:space="preserve">Troelsen, A. and </w:t>
+      </w:r>
+      <w:proofErr w:type="spellStart"/>
+      <w:r>
+        <w:rPr>
+          <w:rFonts w:cs="Calibri"/>
+        </w:rPr>
+        <w:t>Japikse</w:t>
+      </w:r>
+      <w:proofErr w:type="spellEnd"/>
+      <w:r>
+        <w:rPr>
+          <w:rFonts w:cs="Calibri"/>
+        </w:rPr>
+        <w:t>, P. (2021) </w:t>
       </w:r>
       <w:r>
         <w:rPr>
@@ -8600,9 +8797,51 @@
         <w:rPr>
           <w:rFonts w:cs="Calibri"/>
         </w:rPr>
-        <w:t>. 10th edn. Berkeley, CA: Apress. doi: </w:t>
-      </w:r>
-      <w:hyperlink r:id="rId35" w:tgtFrame="_blank" w:history="1">
+        <w:t xml:space="preserve">. 10th </w:t>
+      </w:r>
+      <w:proofErr w:type="spellStart"/>
+      <w:r>
+        <w:rPr>
+          <w:rFonts w:cs="Calibri"/>
+        </w:rPr>
+        <w:t>edn</w:t>
+      </w:r>
+      <w:proofErr w:type="spellEnd"/>
+      <w:r>
+        <w:rPr>
+          <w:rFonts w:cs="Calibri"/>
+        </w:rPr>
+        <w:t xml:space="preserve">. Berkeley, CA: </w:t>
+      </w:r>
+      <w:proofErr w:type="spellStart"/>
+      <w:r>
+        <w:rPr>
+          <w:rFonts w:cs="Calibri"/>
+        </w:rPr>
+        <w:t>Apress</w:t>
+      </w:r>
+      <w:proofErr w:type="spellEnd"/>
+      <w:r>
+        <w:rPr>
+          <w:rFonts w:cs="Calibri"/>
+        </w:rPr>
+        <w:t xml:space="preserve">. </w:t>
+      </w:r>
+      <w:proofErr w:type="spellStart"/>
+      <w:r>
+        <w:rPr>
+          <w:rFonts w:cs="Calibri"/>
+        </w:rPr>
+        <w:t>doi</w:t>
+      </w:r>
+      <w:proofErr w:type="spellEnd"/>
+      <w:r>
+        <w:rPr>
+          <w:rFonts w:cs="Calibri"/>
+        </w:rPr>
+        <w:t>: </w:t>
+      </w:r>
+      <w:hyperlink r:id="rId36" w:tgtFrame="_blank" w:history="1">
         <w:r>
           <w:rPr>
             <w:rStyle w:val="Hyperlink"/>
@@ -8620,7 +8859,7 @@
       </w:pPr>
     </w:p>
     <w:sectPr>
-      <w:footerReference w:type="default" r:id="rId36"/>
+      <w:footerReference w:type="default" r:id="rId37"/>
       <w:pgSz w:w="11906" w:h="16838"/>
       <w:pgMar w:top="1440" w:right="1440" w:bottom="1440" w:left="1440" w:header="708" w:footer="708" w:gutter="0"/>
       <w:pgNumType w:start="0"/>
@@ -8667,7 +8906,6 @@
         <w:docPartUnique/>
       </w:docPartObj>
     </w:sdtPr>
-    <w:sdtEndPr/>
     <w:sdtContent>
       <w:p>
         <w:pPr>
@@ -8680,7 +8918,7 @@
           <mc:AlternateContent>
             <mc:Choice Requires="wps">
               <w:drawing>
-                <wp:anchor distT="0" distB="0" distL="114300" distR="114300" simplePos="0" relativeHeight="251660288" behindDoc="0" locked="0" layoutInCell="1" allowOverlap="1" wp14:anchorId="27150770" wp14:editId="7310957C">
+                <wp:anchor distT="0" distB="0" distL="114300" distR="114300" simplePos="0" relativeHeight="251658241" behindDoc="0" locked="0" layoutInCell="1" allowOverlap="1" wp14:anchorId="27150770" wp14:editId="7310957C">
                   <wp:simplePos x="0" y="0"/>
                   <wp:positionH relativeFrom="margin">
                     <wp:align>center</wp:align>
@@ -8788,7 +9026,7 @@
                     <v:h position="#0,topLeft" switch="" xrange="0,10800"/>
                   </v:handles>
                 </v:shapetype>
-                <v:shape id="Double Bracket 49" o:spid="_x0000_s1057" type="#_x0000_t185" style="position:absolute;margin-left:0;margin-top:0;width:42.1pt;height:18.8pt;z-index:251660288;visibility:visible;mso-wrap-style:square;mso-width-percent:100;mso-height-percent:0;mso-wrap-distance-left:9pt;mso-wrap-distance-top:0;mso-wrap-distance-right:9pt;mso-wrap-distance-bottom:0;mso-position-horizontal:center;mso-position-horizontal-relative:margin;mso-position-vertical:center;mso-position-vertical-relative:bottom-margin-area;mso-width-percent:100;mso-height-percent:0;mso-width-relative:margin;mso-height-relative:bottom-margin-area;v-text-anchor:top" o:gfxdata="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" filled="t" strokecolor="gray" strokeweight="2.25pt">
+                <v:shape id="Double Bracket 49" o:spid="_x0000_s1057" type="#_x0000_t185" style="position:absolute;margin-left:0;margin-top:0;width:42.1pt;height:18.8pt;z-index:251658241;visibility:visible;mso-wrap-style:square;mso-width-percent:100;mso-height-percent:0;mso-wrap-distance-left:9pt;mso-wrap-distance-top:0;mso-wrap-distance-right:9pt;mso-wrap-distance-bottom:0;mso-position-horizontal:center;mso-position-horizontal-relative:margin;mso-position-vertical:center;mso-position-vertical-relative:bottom-margin-area;mso-width-percent:100;mso-height-percent:0;mso-width-relative:margin;mso-height-relative:bottom-margin-area;v-text-anchor:top" o:gfxdata="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" filled="t" strokecolor="gray" strokeweight="2.25pt">
                   <v:textbox inset=",0,,0">
                     <w:txbxContent>
                       <w:p>
@@ -8832,7 +9070,7 @@
           <mc:AlternateContent>
             <mc:Choice Requires="wps">
               <w:drawing>
-                <wp:anchor distT="0" distB="0" distL="114300" distR="114300" simplePos="0" relativeHeight="251659264" behindDoc="0" locked="0" layoutInCell="1" allowOverlap="1" wp14:anchorId="6CCB2A14" wp14:editId="4D9CE9E9">
+                <wp:anchor distT="0" distB="0" distL="114300" distR="114300" simplePos="0" relativeHeight="251658240" behindDoc="0" locked="0" layoutInCell="1" allowOverlap="1" wp14:anchorId="6CCB2A14" wp14:editId="4D9CE9E9">
                   <wp:simplePos x="0" y="0"/>
                   <wp:positionH relativeFrom="margin">
                     <wp:align>center</wp:align>
@@ -8891,7 +9129,7 @@
                 </wp:anchor>
               </w:drawing>
             </mc:Choice>
-            <mc:Fallback>
+            <mc:Fallback xmlns:arto="http://schemas.microsoft.com/office/word/2006/arto">
               <w:pict>
                 <v:shapetype w14:anchorId="08A5401C" id="_x0000_t32" coordsize="21600,21600" o:spt="32" o:oned="t" path="m,l21600,21600e" filled="f">
                   <v:path arrowok="t" fillok="f" o:connecttype="none"/>

</xml_diff>